<commit_message>
SEQUOIASQLMAINSTREAM-241: 更新 Story-mysql支持ALTER TABLE.docx
git-svn-id: http://192.168.20.11/sequoiadb/trunk@39682 6121f079-4a18-41d3-8c30-8870a322f2c2
</commit_message>
<xml_diff>
--- a/internal_doc/03.开发设计/mysql/Story-mysql支持ALTER TABLE.docx
+++ b/internal_doc/03.开发设计/mysql/Story-mysql支持ALTER TABLE.docx
@@ -2801,7 +2801,6 @@
             <w:pPr>
               <w:ind w:left="0"/>
               <w:rPr>
-                <w:rFonts w:hint="eastAsia"/>
                 <w:color w:val="4F6228" w:themeColor="accent3" w:themeShade="80"/>
               </w:rPr>
             </w:pPr>
@@ -3391,12 +3390,19 @@
         <w:tc>
           <w:tcPr>
             <w:tcW w:w="3040" w:type="dxa"/>
+            <w:shd w:val="clear" w:color="auto" w:fill="EAF1DD" w:themeFill="accent3" w:themeFillTint="33"/>
           </w:tcPr>
           <w:p>
             <w:pPr>
               <w:ind w:left="0"/>
-            </w:pPr>
-            <w:r>
+              <w:rPr>
+                <w:color w:val="4F6228" w:themeColor="accent3" w:themeShade="80"/>
+              </w:rPr>
+            </w:pPr>
+            <w:r>
+              <w:rPr>
+                <w:color w:val="4F6228" w:themeColor="accent3" w:themeShade="80"/>
+              </w:rPr>
               <w:t>TABLESPACE tablespace_name [STORAGE {DISK|MEMORY|DEFAULT}]</w:t>
             </w:r>
           </w:p>
@@ -3404,30 +3410,174 @@
         <w:tc>
           <w:tcPr>
             <w:tcW w:w="3969" w:type="dxa"/>
+            <w:shd w:val="clear" w:color="auto" w:fill="EAF1DD" w:themeFill="accent3" w:themeFillTint="33"/>
           </w:tcPr>
           <w:p>
             <w:pPr>
               <w:ind w:left="0"/>
-            </w:pPr>
-            <w:r>
-              <w:rPr>
-                <w:rFonts w:hint="eastAsia"/>
+              <w:rPr>
+                <w:rFonts w:hint="eastAsia"/>
+                <w:color w:val="4F6228" w:themeColor="accent3" w:themeShade="80"/>
+              </w:rPr>
+            </w:pPr>
+            <w:r>
+              <w:rPr>
+                <w:rFonts w:hint="eastAsia"/>
+                <w:color w:val="4F6228" w:themeColor="accent3" w:themeShade="80"/>
               </w:rPr>
               <w:t>指定表所属的表空间。</w:t>
             </w:r>
+            <w:r>
+              <w:rPr>
+                <w:rFonts w:hint="eastAsia"/>
+                <w:color w:val="4F6228" w:themeColor="accent3" w:themeShade="80"/>
+              </w:rPr>
+              <w:t>目前</w:t>
+            </w:r>
+            <w:r>
+              <w:rPr>
+                <w:color w:val="4F6228" w:themeColor="accent3" w:themeShade="80"/>
+              </w:rPr>
+              <w:t>只有</w:t>
+            </w:r>
+            <w:r>
+              <w:rPr>
+                <w:rFonts w:hint="eastAsia"/>
+                <w:color w:val="4F6228" w:themeColor="accent3" w:themeShade="80"/>
+              </w:rPr>
+              <w:t>innodb</w:t>
+            </w:r>
+            <w:r>
+              <w:rPr>
+                <w:rFonts w:hint="eastAsia"/>
+                <w:color w:val="4F6228" w:themeColor="accent3" w:themeShade="80"/>
+              </w:rPr>
+              <w:t>和</w:t>
+            </w:r>
+            <w:r>
+              <w:rPr>
+                <w:rFonts w:hint="eastAsia"/>
+                <w:color w:val="4F6228" w:themeColor="accent3" w:themeShade="80"/>
+              </w:rPr>
+              <w:t>ndb</w:t>
+            </w:r>
+            <w:r>
+              <w:rPr>
+                <w:rFonts w:hint="eastAsia"/>
+                <w:color w:val="4F6228" w:themeColor="accent3" w:themeShade="80"/>
+              </w:rPr>
+              <w:t>可以创建</w:t>
+            </w:r>
+            <w:r>
+              <w:rPr>
+                <w:rFonts w:hint="eastAsia"/>
+                <w:color w:val="4F6228" w:themeColor="accent3" w:themeShade="80"/>
+              </w:rPr>
+              <w:t>tablespace</w:t>
+            </w:r>
+            <w:r>
+              <w:rPr>
+                <w:color w:val="4F6228" w:themeColor="accent3" w:themeShade="80"/>
+              </w:rPr>
+              <w:t>。</w:t>
+            </w:r>
+            <w:r>
+              <w:rPr>
+                <w:rFonts w:hint="eastAsia"/>
+                <w:color w:val="4F6228" w:themeColor="accent3" w:themeShade="80"/>
+              </w:rPr>
+              <w:t>只有</w:t>
+            </w:r>
+            <w:r>
+              <w:rPr>
+                <w:rFonts w:hint="eastAsia"/>
+                <w:color w:val="4F6228" w:themeColor="accent3" w:themeShade="80"/>
+              </w:rPr>
+              <w:t>ndb</w:t>
+            </w:r>
+            <w:r>
+              <w:rPr>
+                <w:rFonts w:hint="eastAsia"/>
+                <w:color w:val="4F6228" w:themeColor="accent3" w:themeShade="80"/>
+              </w:rPr>
+              <w:t>可以</w:t>
+            </w:r>
+            <w:r>
+              <w:rPr>
+                <w:color w:val="4F6228" w:themeColor="accent3" w:themeShade="80"/>
+              </w:rPr>
+              <w:t>指定</w:t>
+            </w:r>
+            <w:r>
+              <w:rPr>
+                <w:rFonts w:hint="eastAsia"/>
+                <w:color w:val="4F6228" w:themeColor="accent3" w:themeShade="80"/>
+              </w:rPr>
+              <w:t>STORAGE</w:t>
+            </w:r>
+            <w:r>
+              <w:rPr>
+                <w:rFonts w:hint="eastAsia"/>
+                <w:color w:val="4F6228" w:themeColor="accent3" w:themeShade="80"/>
+              </w:rPr>
+              <w:t>子句</w:t>
+            </w:r>
+            <w:r>
+              <w:rPr>
+                <w:color w:val="4F6228" w:themeColor="accent3" w:themeShade="80"/>
+              </w:rPr>
+              <w:t>。</w:t>
+            </w:r>
+            <w:r>
+              <w:rPr>
+                <w:rFonts w:hint="eastAsia"/>
+                <w:color w:val="4F6228" w:themeColor="accent3" w:themeShade="80"/>
+              </w:rPr>
+              <w:t>同一</w:t>
+            </w:r>
+            <w:r>
+              <w:rPr>
+                <w:color w:val="4F6228" w:themeColor="accent3" w:themeShade="80"/>
+              </w:rPr>
+              <w:t>tablesapce</w:t>
+            </w:r>
+            <w:r>
+              <w:rPr>
+                <w:color w:val="4F6228" w:themeColor="accent3" w:themeShade="80"/>
+              </w:rPr>
+              <w:t>下</w:t>
+            </w:r>
+            <w:r>
+              <w:rPr>
+                <w:rFonts w:hint="eastAsia"/>
+                <w:color w:val="4F6228" w:themeColor="accent3" w:themeShade="80"/>
+              </w:rPr>
+              <w:t>表能</w:t>
+            </w:r>
+            <w:r>
+              <w:rPr>
+                <w:color w:val="4F6228" w:themeColor="accent3" w:themeShade="80"/>
+              </w:rPr>
+              <w:t>共享相同的存储有关属性。</w:t>
+            </w:r>
           </w:p>
         </w:tc>
         <w:tc>
           <w:tcPr>
             <w:tcW w:w="930" w:type="dxa"/>
+            <w:shd w:val="clear" w:color="auto" w:fill="EAF1DD" w:themeFill="accent3" w:themeFillTint="33"/>
           </w:tcPr>
           <w:p>
             <w:pPr>
               <w:ind w:left="0"/>
-            </w:pPr>
-            <w:r>
-              <w:rPr>
-                <w:rFonts w:hint="eastAsia"/>
+              <w:rPr>
+                <w:color w:val="4F6228" w:themeColor="accent3" w:themeShade="80"/>
+              </w:rPr>
+            </w:pPr>
+            <w:r>
+              <w:rPr>
+                <w:rFonts w:hint="eastAsia"/>
+                <w:color w:val="4F6228" w:themeColor="accent3" w:themeShade="80"/>
               </w:rPr>
               <w:t>不支持</w:t>
             </w:r>
@@ -3451,35 +3601,28 @@
               <w:rPr>
                 <w:color w:val="4F6228" w:themeColor="accent3" w:themeShade="80"/>
               </w:rPr>
-              <w:t xml:space="preserve">UNION [=] </w:t>
-            </w:r>
-            <w:r>
+              <w:lastRenderedPageBreak/>
+              <w:t>UNION [=] (tbl_name[,tb1_name]...)</w:t>
+            </w:r>
+          </w:p>
+        </w:tc>
+        <w:tc>
+          <w:tcPr>
+            <w:tcW w:w="3969" w:type="dxa"/>
+            <w:shd w:val="clear" w:color="auto" w:fill="EAF1DD" w:themeFill="accent3" w:themeFillTint="33"/>
+          </w:tcPr>
+          <w:p>
+            <w:pPr>
+              <w:ind w:left="0"/>
               <w:rPr>
                 <w:color w:val="4F6228" w:themeColor="accent3" w:themeShade="80"/>
               </w:rPr>
-              <w:lastRenderedPageBreak/>
-              <w:t>(tbl_name[,tb1_name]...)</w:t>
-            </w:r>
-          </w:p>
-        </w:tc>
-        <w:tc>
-          <w:tcPr>
-            <w:tcW w:w="3969" w:type="dxa"/>
-            <w:shd w:val="clear" w:color="auto" w:fill="EAF1DD" w:themeFill="accent3" w:themeFillTint="33"/>
-          </w:tcPr>
-          <w:p>
-            <w:pPr>
-              <w:ind w:left="0"/>
-              <w:rPr>
+            </w:pPr>
+            <w:r>
+              <w:rPr>
+                <w:rFonts w:hint="eastAsia"/>
                 <w:color w:val="4F6228" w:themeColor="accent3" w:themeShade="80"/>
               </w:rPr>
-            </w:pPr>
-            <w:r>
-              <w:rPr>
-                <w:rFonts w:hint="eastAsia"/>
-                <w:color w:val="4F6228" w:themeColor="accent3" w:themeShade="80"/>
-              </w:rPr>
-              <w:lastRenderedPageBreak/>
               <w:t>用于</w:t>
             </w:r>
             <w:r>
@@ -3642,76 +3785,6 @@
       </w:r>
       <w:r>
         <w:t>。</w:t>
-      </w:r>
-    </w:p>
-    <w:p>
-      <w:pPr>
-        <w:pStyle w:val="aa"/>
-        <w:numPr>
-          <w:ilvl w:val="0"/>
-          <w:numId w:val="10"/>
-        </w:numPr>
-        <w:ind w:firstLineChars="0"/>
-      </w:pPr>
-      <w:r>
-        <w:rPr>
-          <w:rFonts w:hint="eastAsia"/>
-        </w:rPr>
-        <w:t>创表</w:t>
-      </w:r>
-      <w:r>
-        <w:t>时指定表空间是</w:t>
-      </w:r>
-      <w:r>
-        <w:rPr>
-          <w:rFonts w:hint="eastAsia"/>
-        </w:rPr>
-        <w:t>天然</w:t>
-      </w:r>
-      <w:r>
-        <w:t>支持的，但</w:t>
-      </w:r>
-      <w:r>
-        <w:rPr>
-          <w:rFonts w:hint="eastAsia"/>
-        </w:rPr>
-        <w:t>创建后</w:t>
-      </w:r>
-      <w:r>
-        <w:t>修改表空间是不支持的。</w:t>
-      </w:r>
-      <w:r>
-        <w:rPr>
-          <w:rFonts w:hint="eastAsia"/>
-        </w:rPr>
-        <w:t>目前</w:t>
-      </w:r>
-      <w:r>
-        <w:t>只有</w:t>
-      </w:r>
-      <w:r>
-        <w:rPr>
-          <w:rFonts w:hint="eastAsia"/>
-        </w:rPr>
-        <w:t>InnoDB file-per-table tablespace</w:t>
-      </w:r>
-      <w:r>
-        <w:rPr>
-          <w:rFonts w:hint="eastAsia"/>
-        </w:rPr>
-        <w:t>下的表是可以更改所属</w:t>
-      </w:r>
-      <w:r>
-        <w:rPr>
-          <w:rFonts w:hint="eastAsia"/>
-        </w:rPr>
-        <w:t xml:space="preserve"> tablespace </w:t>
-      </w:r>
-      <w:r>
-        <w:rPr>
-          <w:rFonts w:hint="eastAsia"/>
-        </w:rPr>
-        <w:t>的。</w:t>
       </w:r>
     </w:p>
     <w:p>
@@ -3809,9 +3882,6 @@
     <w:p>
       <w:pPr>
         <w:ind w:left="0" w:firstLine="357"/>
-        <w:rPr>
-          <w:rFonts w:hint="eastAsia"/>
-        </w:rPr>
       </w:pPr>
       <w:r>
         <w:rPr>
@@ -4173,9 +4243,6 @@
           <w:numId w:val="14"/>
         </w:numPr>
         <w:ind w:firstLineChars="0"/>
-        <w:rPr>
-          <w:rFonts w:hint="eastAsia"/>
-        </w:rPr>
       </w:pPr>
       <w:r>
         <w:rPr>
@@ -4388,11 +4455,6 @@
     </w:p>
     <w:p/>
     <w:p>
-      <w:pPr>
-        <w:rPr>
-          <w:rFonts w:hint="eastAsia"/>
-        </w:rPr>
-      </w:pPr>
       <w:r>
         <w:rPr>
           <w:rFonts w:hint="eastAsia"/>
@@ -4562,6 +4624,7 @@
         <w:rPr>
           <w:rFonts w:hint="eastAsia"/>
         </w:rPr>
+        <w:lastRenderedPageBreak/>
         <w:t>分析</w:t>
       </w:r>
       <w:r>
@@ -4605,11 +4668,6 @@
       </w:pPr>
     </w:p>
     <w:p>
-      <w:pPr>
-        <w:rPr>
-          <w:rFonts w:hint="eastAsia"/>
-        </w:rPr>
-      </w:pPr>
       <w:r>
         <w:rPr>
           <w:rFonts w:hint="eastAsia"/>
@@ -4646,11 +4704,6 @@
     </w:p>
     <w:p/>
     <w:p>
-      <w:pPr>
-        <w:rPr>
-          <w:rFonts w:hint="eastAsia"/>
-        </w:rPr>
-      </w:pPr>
       <w:r>
         <w:rPr>
           <w:rFonts w:hint="eastAsia"/>
@@ -4749,11 +4802,6 @@
     </w:p>
     <w:p/>
     <w:p>
-      <w:pPr>
-        <w:rPr>
-          <w:rFonts w:hint="eastAsia"/>
-        </w:rPr>
-      </w:pPr>
       <w:r>
         <w:rPr>
           <w:rFonts w:hint="eastAsia"/>
@@ -4984,9 +5032,6 @@
       <w:pPr>
         <w:pStyle w:val="aa"/>
         <w:ind w:left="360" w:firstLineChars="0" w:firstLine="0"/>
-        <w:rPr>
-          <w:rFonts w:hint="eastAsia"/>
-        </w:rPr>
       </w:pPr>
       <w:r>
         <w:rPr>
@@ -5231,9 +5276,6 @@
             <w:pPr>
               <w:pStyle w:val="aa"/>
               <w:ind w:left="0" w:firstLineChars="0" w:firstLine="0"/>
-              <w:rPr>
-                <w:rFonts w:hint="eastAsia"/>
-              </w:rPr>
             </w:pPr>
             <w:r>
               <w:rPr>
@@ -5437,9 +5479,6 @@
             <w:pPr>
               <w:pStyle w:val="aa"/>
               <w:ind w:left="0" w:firstLineChars="0" w:firstLine="0"/>
-              <w:rPr>
-                <w:rFonts w:hint="eastAsia"/>
-              </w:rPr>
             </w:pPr>
             <w:r>
               <w:rPr>
@@ -5536,9 +5575,6 @@
             <w:pPr>
               <w:pStyle w:val="aa"/>
               <w:ind w:left="0" w:firstLineChars="0" w:firstLine="0"/>
-              <w:rPr>
-                <w:rFonts w:hint="eastAsia"/>
-              </w:rPr>
             </w:pPr>
             <w:r>
               <w:rPr>
@@ -5634,9 +5670,6 @@
             <w:pPr>
               <w:pStyle w:val="aa"/>
               <w:ind w:left="0" w:firstLineChars="0" w:firstLine="0"/>
-              <w:rPr>
-                <w:rFonts w:hint="eastAsia"/>
-              </w:rPr>
             </w:pPr>
             <w:r>
               <w:t xml:space="preserve">e.g: </w:t>
@@ -5783,9 +5816,6 @@
             <w:pPr>
               <w:pStyle w:val="aa"/>
               <w:ind w:left="0" w:firstLineChars="0" w:firstLine="0"/>
-              <w:rPr>
-                <w:rFonts w:hint="eastAsia"/>
-              </w:rPr>
             </w:pPr>
             <w:r>
               <w:rPr>
@@ -5814,11 +5844,11 @@
               <w:t>删除</w:t>
             </w:r>
             <w:r>
+              <w:t>主键并添加新</w:t>
+            </w:r>
+            <w:r>
+              <w:lastRenderedPageBreak/>
               <w:t>主键</w:t>
-            </w:r>
-            <w:r>
-              <w:lastRenderedPageBreak/>
-              <w:t>并添加新主键</w:t>
             </w:r>
           </w:p>
         </w:tc>
@@ -5886,9 +5916,6 @@
             <w:pPr>
               <w:pStyle w:val="aa"/>
               <w:ind w:left="0" w:firstLineChars="0" w:firstLine="0"/>
-              <w:rPr>
-                <w:rFonts w:hint="eastAsia"/>
-              </w:rPr>
             </w:pPr>
             <w:r>
               <w:t xml:space="preserve">e.g: </w:t>
@@ -5906,14 +5933,14 @@
               <w:rPr>
                 <w:color w:val="0070C0"/>
               </w:rPr>
-              <w:t xml:space="preserve">DROP </w:t>
+              <w:t xml:space="preserve">DROP PRIMARY KEY, ADD PRIMARY </w:t>
             </w:r>
             <w:r>
               <w:rPr>
                 <w:color w:val="0070C0"/>
               </w:rPr>
               <w:lastRenderedPageBreak/>
-              <w:t>PRIMARY KEY, ADD PRIMARY KEY</w:t>
+              <w:t>KEY</w:t>
             </w:r>
             <w:r>
               <w:t>( col_name</w:t>
@@ -6021,9 +6048,6 @@
             <w:pPr>
               <w:pStyle w:val="aa"/>
               <w:ind w:left="0" w:firstLineChars="0" w:firstLine="0"/>
-              <w:rPr>
-                <w:rFonts w:hint="eastAsia"/>
-              </w:rPr>
             </w:pPr>
             <w:r>
               <w:rPr>
@@ -6072,9 +6096,6 @@
             <w:pPr>
               <w:pStyle w:val="aa"/>
               <w:ind w:left="0" w:firstLineChars="0" w:firstLine="0"/>
-              <w:rPr>
-                <w:rFonts w:hint="eastAsia"/>
-              </w:rPr>
             </w:pPr>
             <w:r>
               <w:rPr>
@@ -6303,9 +6324,6 @@
             <w:pPr>
               <w:pStyle w:val="aa"/>
               <w:ind w:left="0" w:firstLineChars="0" w:firstLine="0"/>
-              <w:rPr>
-                <w:rFonts w:hint="eastAsia"/>
-              </w:rPr>
             </w:pPr>
             <w:r>
               <w:rPr>
@@ -6541,9 +6559,6 @@
             <w:pPr>
               <w:pStyle w:val="aa"/>
               <w:ind w:left="0" w:firstLineChars="0" w:firstLine="0"/>
-              <w:rPr>
-                <w:rFonts w:hint="eastAsia"/>
-              </w:rPr>
             </w:pPr>
             <w:r>
               <w:rPr>
@@ -6639,9 +6654,6 @@
             <w:pPr>
               <w:pStyle w:val="aa"/>
               <w:ind w:left="0" w:firstLineChars="0" w:firstLine="0"/>
-              <w:rPr>
-                <w:rFonts w:hint="eastAsia"/>
-              </w:rPr>
             </w:pPr>
             <w:r>
               <w:t>e.g:</w:t>
@@ -6764,9 +6776,6 @@
             <w:pPr>
               <w:pStyle w:val="aa"/>
               <w:ind w:left="0" w:firstLineChars="0" w:firstLine="0"/>
-              <w:rPr>
-                <w:rFonts w:hint="eastAsia"/>
-              </w:rPr>
             </w:pPr>
             <w:r>
               <w:rPr>
@@ -6785,9 +6794,6 @@
             <w:pPr>
               <w:pStyle w:val="aa"/>
               <w:ind w:left="0" w:firstLineChars="0" w:firstLine="0"/>
-              <w:rPr>
-                <w:rFonts w:hint="eastAsia"/>
-              </w:rPr>
             </w:pPr>
           </w:p>
         </w:tc>
@@ -6802,9 +6808,6 @@
             <w:pPr>
               <w:pStyle w:val="aa"/>
               <w:ind w:left="0" w:firstLineChars="0" w:firstLine="0"/>
-              <w:rPr>
-                <w:rFonts w:hint="eastAsia"/>
-              </w:rPr>
             </w:pPr>
             <w:r>
               <w:rPr>
@@ -6880,9 +6883,6 @@
             <w:pPr>
               <w:pStyle w:val="aa"/>
               <w:ind w:left="0" w:firstLineChars="0" w:firstLine="0"/>
-              <w:rPr>
-                <w:rFonts w:hint="eastAsia"/>
-              </w:rPr>
             </w:pPr>
             <w:r>
               <w:rPr>
@@ -6934,9 +6934,6 @@
             <w:pPr>
               <w:pStyle w:val="aa"/>
               <w:ind w:left="0" w:firstLineChars="0" w:firstLine="0"/>
-              <w:rPr>
-                <w:rFonts w:hint="eastAsia"/>
-              </w:rPr>
             </w:pPr>
           </w:p>
         </w:tc>
@@ -6951,9 +6948,6 @@
             <w:pPr>
               <w:pStyle w:val="aa"/>
               <w:ind w:left="0" w:firstLineChars="0" w:firstLine="0"/>
-              <w:rPr>
-                <w:rFonts w:hint="eastAsia"/>
-              </w:rPr>
             </w:pPr>
           </w:p>
         </w:tc>
@@ -7002,9 +6996,6 @@
             <w:pPr>
               <w:pStyle w:val="aa"/>
               <w:ind w:left="0" w:firstLineChars="0" w:firstLine="0"/>
-              <w:rPr>
-                <w:rFonts w:hint="eastAsia"/>
-              </w:rPr>
             </w:pPr>
             <w:r>
               <w:rPr>
@@ -7023,9 +7014,6 @@
             <w:pPr>
               <w:pStyle w:val="aa"/>
               <w:ind w:left="0" w:firstLineChars="0" w:firstLine="0"/>
-              <w:rPr>
-                <w:rFonts w:hint="eastAsia"/>
-              </w:rPr>
             </w:pPr>
           </w:p>
         </w:tc>
@@ -7040,9 +7028,6 @@
             <w:pPr>
               <w:pStyle w:val="aa"/>
               <w:ind w:left="0" w:firstLineChars="0" w:firstLine="0"/>
-              <w:rPr>
-                <w:rFonts w:hint="eastAsia"/>
-              </w:rPr>
             </w:pPr>
             <w:r>
               <w:rPr>
@@ -7118,9 +7103,6 @@
             <w:pPr>
               <w:pStyle w:val="aa"/>
               <w:ind w:left="0" w:firstLineChars="0" w:firstLine="0"/>
-              <w:rPr>
-                <w:rFonts w:hint="eastAsia"/>
-              </w:rPr>
             </w:pPr>
             <w:r>
               <w:rPr>
@@ -7160,9 +7142,6 @@
             <w:pPr>
               <w:pStyle w:val="aa"/>
               <w:ind w:left="0" w:firstLineChars="0" w:firstLine="0"/>
-              <w:rPr>
-                <w:rFonts w:hint="eastAsia"/>
-              </w:rPr>
             </w:pPr>
           </w:p>
         </w:tc>
@@ -7177,9 +7156,6 @@
             <w:pPr>
               <w:pStyle w:val="aa"/>
               <w:ind w:left="0" w:firstLineChars="0" w:firstLine="0"/>
-              <w:rPr>
-                <w:rFonts w:hint="eastAsia"/>
-              </w:rPr>
             </w:pPr>
           </w:p>
         </w:tc>
@@ -7228,9 +7204,6 @@
             <w:pPr>
               <w:pStyle w:val="aa"/>
               <w:ind w:left="0" w:firstLineChars="0" w:firstLine="0"/>
-              <w:rPr>
-                <w:rFonts w:hint="eastAsia"/>
-              </w:rPr>
             </w:pPr>
             <w:r>
               <w:rPr>
@@ -7249,9 +7222,6 @@
             <w:pPr>
               <w:pStyle w:val="aa"/>
               <w:ind w:left="0" w:firstLineChars="0" w:firstLine="0"/>
-              <w:rPr>
-                <w:rFonts w:hint="eastAsia"/>
-              </w:rPr>
             </w:pPr>
           </w:p>
         </w:tc>
@@ -7266,9 +7236,6 @@
             <w:pPr>
               <w:pStyle w:val="aa"/>
               <w:ind w:left="0" w:firstLineChars="0" w:firstLine="0"/>
-              <w:rPr>
-                <w:rFonts w:hint="eastAsia"/>
-              </w:rPr>
             </w:pPr>
             <w:r>
               <w:rPr>
@@ -7404,9 +7371,6 @@
             <w:pPr>
               <w:pStyle w:val="aa"/>
               <w:ind w:left="0" w:firstLineChars="0" w:firstLine="0"/>
-              <w:rPr>
-                <w:rFonts w:hint="eastAsia"/>
-              </w:rPr>
             </w:pPr>
             <w:r>
               <w:rPr>
@@ -7415,10 +7379,7 @@
               <w:t>ADD INDEX</w:t>
             </w:r>
             <w:r>
-              <w:t xml:space="preserve"> idx_name( col_name )</w:t>
-            </w:r>
-            <w:r>
-              <w:t xml:space="preserve"> </w:t>
+              <w:t xml:space="preserve"> idx_name( col_name ) </w:t>
             </w:r>
             <w:r>
               <w:rPr>
@@ -7461,9 +7422,6 @@
             <w:pPr>
               <w:pStyle w:val="aa"/>
               <w:ind w:left="0" w:firstLineChars="0" w:firstLine="0"/>
-              <w:rPr>
-                <w:rFonts w:hint="eastAsia"/>
-              </w:rPr>
             </w:pPr>
           </w:p>
         </w:tc>
@@ -7478,9 +7436,6 @@
             <w:pPr>
               <w:pStyle w:val="aa"/>
               <w:ind w:left="0" w:firstLineChars="0" w:firstLine="0"/>
-              <w:rPr>
-                <w:rFonts w:hint="eastAsia"/>
-              </w:rPr>
             </w:pPr>
           </w:p>
         </w:tc>
@@ -7529,9 +7484,6 @@
             <w:pPr>
               <w:pStyle w:val="aa"/>
               <w:ind w:left="0" w:firstLineChars="0" w:firstLine="0"/>
-              <w:rPr>
-                <w:rFonts w:hint="eastAsia"/>
-              </w:rPr>
             </w:pPr>
             <w:r>
               <w:t>不</w:t>
@@ -7577,9 +7529,6 @@
             <w:pPr>
               <w:pStyle w:val="aa"/>
               <w:ind w:left="0" w:firstLineChars="0" w:firstLine="0"/>
-              <w:rPr>
-                <w:rFonts w:hint="eastAsia"/>
-              </w:rPr>
             </w:pPr>
           </w:p>
         </w:tc>
@@ -7813,9 +7762,6 @@
           <w:numId w:val="8"/>
         </w:numPr>
         <w:ind w:firstLineChars="0"/>
-        <w:rPr>
-          <w:rFonts w:hint="eastAsia"/>
-        </w:rPr>
       </w:pPr>
       <w:r>
         <w:rPr>
@@ -8013,9 +7959,6 @@
             <w:pPr>
               <w:pStyle w:val="aa"/>
               <w:ind w:left="0" w:firstLineChars="0" w:firstLine="0"/>
-              <w:rPr>
-                <w:rFonts w:hint="eastAsia"/>
-              </w:rPr>
             </w:pPr>
             <w:r>
               <w:rPr>
@@ -8141,16 +8084,16 @@
               <w:ind w:left="0" w:firstLineChars="0" w:firstLine="0"/>
             </w:pPr>
             <w:r>
+              <w:t xml:space="preserve">data_type </w:t>
+            </w:r>
+          </w:p>
+          <w:p>
+            <w:pPr>
+              <w:pStyle w:val="aa"/>
+              <w:ind w:left="0" w:firstLineChars="0" w:firstLine="0"/>
+            </w:pPr>
+            <w:r>
               <w:lastRenderedPageBreak/>
-              <w:t xml:space="preserve">data_type </w:t>
-            </w:r>
-          </w:p>
-          <w:p>
-            <w:pPr>
-              <w:pStyle w:val="aa"/>
-              <w:ind w:left="0" w:firstLineChars="0" w:firstLine="0"/>
-            </w:pPr>
-            <w:r>
               <w:t>[</w:t>
             </w:r>
             <w:r>
@@ -8302,9 +8245,6 @@
             <w:pPr>
               <w:pStyle w:val="aa"/>
               <w:ind w:left="0" w:firstLineChars="0" w:firstLine="0"/>
-              <w:rPr>
-                <w:rFonts w:hint="eastAsia"/>
-              </w:rPr>
             </w:pPr>
             <w:r>
               <w:t>[</w:t>
@@ -8590,9 +8530,6 @@
             <w:pPr>
               <w:pStyle w:val="aa"/>
               <w:ind w:left="0" w:firstLineChars="0" w:firstLine="0"/>
-              <w:rPr>
-                <w:rFonts w:hint="eastAsia"/>
-              </w:rPr>
             </w:pPr>
             <w:r>
               <w:rPr>
@@ -8792,9 +8729,6 @@
             <w:pPr>
               <w:pStyle w:val="aa"/>
               <w:ind w:left="0" w:firstLineChars="0" w:firstLine="0"/>
-              <w:rPr>
-                <w:rFonts w:hint="eastAsia"/>
-              </w:rPr>
             </w:pPr>
             <w:r>
               <w:rPr>
@@ -8825,9 +8759,6 @@
             <w:pPr>
               <w:pStyle w:val="aa"/>
               <w:ind w:left="0" w:firstLineChars="0" w:firstLine="0"/>
-              <w:rPr>
-                <w:rFonts w:hint="eastAsia"/>
-              </w:rPr>
             </w:pPr>
           </w:p>
         </w:tc>
@@ -8946,10 +8877,7 @@
               <w:t>[COLUMN]</w:t>
             </w:r>
             <w:r>
-              <w:t xml:space="preserve"> col_name</w:t>
-            </w:r>
-            <w:r>
-              <w:t xml:space="preserve"> new_col_name column_defini</w:t>
+              <w:t xml:space="preserve"> col_name new_col_name column_defini</w:t>
             </w:r>
             <w:r>
               <w:t>tion</w:t>
@@ -9060,9 +8988,6 @@
             <w:pPr>
               <w:pStyle w:val="aa"/>
               <w:ind w:left="0" w:firstLineChars="0" w:firstLine="0"/>
-              <w:rPr>
-                <w:rFonts w:hint="eastAsia"/>
-              </w:rPr>
             </w:pPr>
           </w:p>
         </w:tc>
@@ -9181,10 +9106,7 @@
               <w:t>[COLUMN]</w:t>
             </w:r>
             <w:r>
-              <w:t xml:space="preserve"> col_name</w:t>
-            </w:r>
-            <w:r>
-              <w:t xml:space="preserve"> col_name column_difinition [</w:t>
+              <w:t xml:space="preserve"> col_name col_name column_difinition [</w:t>
             </w:r>
             <w:r>
               <w:rPr>
@@ -9193,10 +9115,7 @@
               <w:t>FIRST|AFTER</w:t>
             </w:r>
             <w:r>
-              <w:t xml:space="preserve"> col_name2]</w:t>
-            </w:r>
-            <w:r>
-              <w:t>;</w:t>
+              <w:t xml:space="preserve"> col_name2];</w:t>
             </w:r>
           </w:p>
         </w:tc>
@@ -9310,9 +9229,6 @@
             <w:pPr>
               <w:pStyle w:val="aa"/>
               <w:ind w:left="0" w:firstLineChars="0" w:firstLine="0"/>
-              <w:rPr>
-                <w:rFonts w:hint="eastAsia"/>
-              </w:rPr>
             </w:pPr>
             <w:r>
               <w:rPr>
@@ -9408,9 +9324,6 @@
             <w:pPr>
               <w:pStyle w:val="aa"/>
               <w:ind w:left="0" w:firstLineChars="0" w:firstLine="0"/>
-              <w:rPr>
-                <w:rFonts w:hint="eastAsia"/>
-              </w:rPr>
             </w:pPr>
             <w:r>
               <w:rPr>
@@ -9569,9 +9482,6 @@
             <w:pPr>
               <w:pStyle w:val="aa"/>
               <w:ind w:left="0" w:firstLineChars="0" w:firstLine="0"/>
-              <w:rPr>
-                <w:rFonts w:hint="eastAsia"/>
-              </w:rPr>
             </w:pPr>
             <w:r>
               <w:rPr>
@@ -9884,9 +9794,6 @@
             <w:pPr>
               <w:pStyle w:val="aa"/>
               <w:ind w:left="0" w:firstLineChars="0" w:firstLine="0"/>
-              <w:rPr>
-                <w:rFonts w:hint="eastAsia"/>
-              </w:rPr>
             </w:pPr>
             <w:r>
               <w:rPr>
@@ -9947,9 +9854,6 @@
             <w:pPr>
               <w:pStyle w:val="aa"/>
               <w:ind w:left="0" w:firstLineChars="0" w:firstLine="0"/>
-              <w:rPr>
-                <w:rFonts w:hint="eastAsia"/>
-              </w:rPr>
             </w:pPr>
             <w:r>
               <w:rPr>
@@ -9987,7 +9891,6 @@
               <w:rPr>
                 <w:rFonts w:hint="eastAsia"/>
               </w:rPr>
-              <w:lastRenderedPageBreak/>
               <w:t>列</w:t>
             </w:r>
             <w:r>
@@ -10009,7 +9912,6 @@
               <w:rPr>
                 <w:rFonts w:hint="eastAsia"/>
               </w:rPr>
-              <w:lastRenderedPageBreak/>
               <w:t>Y</w:t>
             </w:r>
             <w:r>
@@ -10093,14 +9995,7 @@
               <w:rPr>
                 <w:rFonts w:hint="eastAsia"/>
               </w:rPr>
-              <w:t xml:space="preserve"> col_name </w:t>
-            </w:r>
-            <w:r>
-              <w:rPr>
-                <w:rFonts w:hint="eastAsia"/>
-              </w:rPr>
-              <w:lastRenderedPageBreak/>
-              <w:t>column_definition;</w:t>
+              <w:t xml:space="preserve"> col_name column_definition;</w:t>
             </w:r>
           </w:p>
         </w:tc>
@@ -10214,9 +10109,6 @@
             <w:pPr>
               <w:pStyle w:val="aa"/>
               <w:ind w:left="0" w:firstLineChars="0" w:firstLine="0"/>
-              <w:rPr>
-                <w:rFonts w:hint="eastAsia"/>
-              </w:rPr>
             </w:pPr>
             <w:r>
               <w:rPr>
@@ -10242,6 +10134,7 @@
               <w:rPr>
                 <w:rFonts w:hint="eastAsia"/>
               </w:rPr>
+              <w:lastRenderedPageBreak/>
               <w:t>删除</w:t>
             </w:r>
             <w:r>
@@ -10476,9 +10369,6 @@
             <w:pPr>
               <w:pStyle w:val="aa"/>
               <w:ind w:left="0" w:firstLineChars="0" w:firstLine="0"/>
-              <w:rPr>
-                <w:rFonts w:hint="eastAsia"/>
-              </w:rPr>
             </w:pPr>
             <w:r>
               <w:rPr>
@@ -10669,9 +10559,6 @@
           <w:p>
             <w:pPr>
               <w:ind w:left="0"/>
-              <w:rPr>
-                <w:rFonts w:hint="eastAsia"/>
-              </w:rPr>
             </w:pPr>
           </w:p>
         </w:tc>
@@ -10773,9 +10660,6 @@
             <w:pPr>
               <w:pStyle w:val="aa"/>
               <w:ind w:left="0" w:firstLineChars="0" w:firstLine="0"/>
-              <w:rPr>
-                <w:rFonts w:hint="eastAsia"/>
-              </w:rPr>
             </w:pPr>
             <w:r>
               <w:rPr>
@@ -10945,9 +10829,6 @@
           <w:p>
             <w:pPr>
               <w:ind w:left="0"/>
-              <w:rPr>
-                <w:rFonts w:hint="eastAsia"/>
-              </w:rPr>
             </w:pPr>
           </w:p>
           <w:p>
@@ -11149,9 +11030,6 @@
             <w:pPr>
               <w:pStyle w:val="aa"/>
               <w:ind w:left="0" w:firstLineChars="0" w:firstLine="0"/>
-              <w:rPr>
-                <w:rFonts w:hint="eastAsia"/>
-              </w:rPr>
             </w:pPr>
             <w:r>
               <w:rPr>
@@ -11332,13 +11210,7 @@
               <w:rPr>
                 <w:rFonts w:hint="eastAsia"/>
               </w:rPr>
-              <w:t>)</w:t>
-            </w:r>
-            <w:r>
-              <w:rPr>
-                <w:rFonts w:hint="eastAsia"/>
-              </w:rPr>
-              <w:t>;</w:t>
+              <w:t>);</w:t>
             </w:r>
           </w:p>
           <w:p>
@@ -11387,9 +11259,6 @@
             <w:pPr>
               <w:pStyle w:val="aa"/>
               <w:ind w:left="0" w:firstLineChars="0" w:firstLine="0"/>
-              <w:rPr>
-                <w:rFonts w:hint="eastAsia"/>
-              </w:rPr>
             </w:pPr>
           </w:p>
         </w:tc>
@@ -11484,10 +11353,7 @@
               <w:t>MySQL</w:t>
             </w:r>
             <w:r>
-              <w:t>内部</w:t>
-            </w:r>
-            <w:r>
-              <w:t>实现</w:t>
+              <w:t>内部实现</w:t>
             </w:r>
             <w:r>
               <w:rPr>
@@ -11502,13 +11368,7 @@
               <w:rPr>
                 <w:rFonts w:hint="eastAsia"/>
               </w:rPr>
-              <w:t>可以</w:t>
-            </w:r>
-            <w:r>
-              <w:rPr>
-                <w:rFonts w:hint="eastAsia"/>
-              </w:rPr>
-              <w:t>轻量</w:t>
+              <w:t>可以轻量</w:t>
             </w:r>
             <w:r>
               <w:t>地</w:t>
@@ -11533,9 +11393,6 @@
             <w:pPr>
               <w:pStyle w:val="aa"/>
               <w:ind w:left="0" w:firstLineChars="0" w:firstLine="0"/>
-              <w:rPr>
-                <w:rFonts w:hint="eastAsia"/>
-              </w:rPr>
             </w:pPr>
           </w:p>
         </w:tc>
@@ -11683,9 +11540,6 @@
             <w:pPr>
               <w:pStyle w:val="aa"/>
               <w:ind w:left="0" w:firstLineChars="0" w:firstLine="0"/>
-              <w:rPr>
-                <w:rFonts w:hint="eastAsia"/>
-              </w:rPr>
             </w:pPr>
             <w:r>
               <w:rPr>
@@ -11971,9 +11825,6 @@
             <w:pPr>
               <w:pStyle w:val="aa"/>
               <w:ind w:left="0" w:firstLineChars="0" w:firstLine="0"/>
-              <w:rPr>
-                <w:rFonts w:hint="eastAsia"/>
-              </w:rPr>
             </w:pPr>
           </w:p>
         </w:tc>
@@ -11993,121 +11844,129 @@
               <w:rPr>
                 <w:rFonts w:hint="eastAsia"/>
               </w:rPr>
+              <w:t>修改</w:t>
+            </w:r>
+            <w:r>
+              <w:rPr>
+                <w:rFonts w:hint="eastAsia"/>
+              </w:rPr>
+              <w:t>STORED</w:t>
+            </w:r>
+            <w:r>
+              <w:rPr>
+                <w:rFonts w:hint="eastAsia"/>
+              </w:rPr>
+              <w:t>列</w:t>
+            </w:r>
+            <w:r>
+              <w:rPr>
+                <w:rFonts w:hint="eastAsia"/>
+              </w:rPr>
+              <w:lastRenderedPageBreak/>
+              <w:t>的</w:t>
+            </w:r>
+            <w:r>
+              <w:t>顺序</w:t>
+            </w:r>
+          </w:p>
+        </w:tc>
+        <w:tc>
+          <w:tcPr>
+            <w:tcW w:w="986" w:type="dxa"/>
+            <w:shd w:val="clear" w:color="auto" w:fill="EAF1DD" w:themeFill="accent3" w:themeFillTint="33"/>
+          </w:tcPr>
+          <w:p>
+            <w:pPr>
+              <w:pStyle w:val="aa"/>
+              <w:ind w:left="0" w:firstLineChars="0" w:firstLine="0"/>
+            </w:pPr>
+            <w:r>
+              <w:rPr>
+                <w:rFonts w:hint="eastAsia"/>
+              </w:rPr>
+              <w:lastRenderedPageBreak/>
+              <w:t>No</w:t>
+            </w:r>
+          </w:p>
+        </w:tc>
+        <w:tc>
+          <w:tcPr>
+            <w:tcW w:w="850" w:type="dxa"/>
+            <w:shd w:val="clear" w:color="auto" w:fill="EAF1DD" w:themeFill="accent3" w:themeFillTint="33"/>
+          </w:tcPr>
+          <w:p>
+            <w:pPr>
+              <w:pStyle w:val="aa"/>
+              <w:ind w:left="0" w:firstLineChars="0" w:firstLine="0"/>
+            </w:pPr>
+            <w:r>
+              <w:rPr>
+                <w:rFonts w:hint="eastAsia"/>
+              </w:rPr>
+              <w:t>Yes</w:t>
+            </w:r>
+          </w:p>
+        </w:tc>
+        <w:tc>
+          <w:tcPr>
+            <w:tcW w:w="1010" w:type="dxa"/>
+            <w:shd w:val="clear" w:color="auto" w:fill="EAF1DD" w:themeFill="accent3" w:themeFillTint="33"/>
+          </w:tcPr>
+          <w:p>
+            <w:pPr>
+              <w:pStyle w:val="aa"/>
+              <w:ind w:left="0" w:firstLineChars="0" w:firstLine="0"/>
+            </w:pPr>
+            <w:r>
+              <w:rPr>
+                <w:rFonts w:hint="eastAsia"/>
+              </w:rPr>
+              <w:t>No</w:t>
+            </w:r>
+          </w:p>
+        </w:tc>
+        <w:tc>
+          <w:tcPr>
+            <w:tcW w:w="3055" w:type="dxa"/>
+            <w:shd w:val="clear" w:color="auto" w:fill="EAF1DD" w:themeFill="accent3" w:themeFillTint="33"/>
+          </w:tcPr>
+          <w:p>
+            <w:pPr>
+              <w:pStyle w:val="aa"/>
+              <w:ind w:left="0" w:firstLineChars="0" w:firstLine="0"/>
+            </w:pPr>
+            <w:r>
+              <w:rPr>
+                <w:rFonts w:hint="eastAsia"/>
+              </w:rPr>
+              <w:t>语法与</w:t>
+            </w:r>
+            <w:r>
+              <w:t>正常列</w:t>
+            </w:r>
+            <w:r>
+              <w:rPr>
+                <w:rFonts w:hint="eastAsia"/>
+              </w:rPr>
+              <w:t>相同</w:t>
+            </w:r>
+            <w:r>
+              <w:t>。</w:t>
+            </w:r>
+          </w:p>
+          <w:p>
+            <w:pPr>
+              <w:pStyle w:val="aa"/>
+              <w:ind w:left="0" w:firstLineChars="0" w:firstLine="0"/>
+            </w:pPr>
+            <w:r>
+              <w:rPr>
+                <w:rFonts w:hint="eastAsia"/>
+              </w:rPr>
               <w:lastRenderedPageBreak/>
               <w:t>修改</w:t>
             </w:r>
             <w:r>
-              <w:rPr>
-                <w:rFonts w:hint="eastAsia"/>
-              </w:rPr>
-              <w:t>STORED</w:t>
-            </w:r>
-            <w:r>
-              <w:rPr>
-                <w:rFonts w:hint="eastAsia"/>
-              </w:rPr>
-              <w:t>列的</w:t>
-            </w:r>
-            <w:r>
-              <w:t>顺序</w:t>
-            </w:r>
-          </w:p>
-        </w:tc>
-        <w:tc>
-          <w:tcPr>
-            <w:tcW w:w="986" w:type="dxa"/>
-            <w:shd w:val="clear" w:color="auto" w:fill="EAF1DD" w:themeFill="accent3" w:themeFillTint="33"/>
-          </w:tcPr>
-          <w:p>
-            <w:pPr>
-              <w:pStyle w:val="aa"/>
-              <w:ind w:left="0" w:firstLineChars="0" w:firstLine="0"/>
-            </w:pPr>
-            <w:r>
-              <w:rPr>
-                <w:rFonts w:hint="eastAsia"/>
-              </w:rPr>
-              <w:t>No</w:t>
-            </w:r>
-          </w:p>
-        </w:tc>
-        <w:tc>
-          <w:tcPr>
-            <w:tcW w:w="850" w:type="dxa"/>
-            <w:shd w:val="clear" w:color="auto" w:fill="EAF1DD" w:themeFill="accent3" w:themeFillTint="33"/>
-          </w:tcPr>
-          <w:p>
-            <w:pPr>
-              <w:pStyle w:val="aa"/>
-              <w:ind w:left="0" w:firstLineChars="0" w:firstLine="0"/>
-            </w:pPr>
-            <w:r>
-              <w:rPr>
-                <w:rFonts w:hint="eastAsia"/>
-              </w:rPr>
-              <w:t>Yes</w:t>
-            </w:r>
-          </w:p>
-        </w:tc>
-        <w:tc>
-          <w:tcPr>
-            <w:tcW w:w="1010" w:type="dxa"/>
-            <w:shd w:val="clear" w:color="auto" w:fill="EAF1DD" w:themeFill="accent3" w:themeFillTint="33"/>
-          </w:tcPr>
-          <w:p>
-            <w:pPr>
-              <w:pStyle w:val="aa"/>
-              <w:ind w:left="0" w:firstLineChars="0" w:firstLine="0"/>
-            </w:pPr>
-            <w:r>
-              <w:rPr>
-                <w:rFonts w:hint="eastAsia"/>
-              </w:rPr>
-              <w:t>No</w:t>
-            </w:r>
-          </w:p>
-        </w:tc>
-        <w:tc>
-          <w:tcPr>
-            <w:tcW w:w="3055" w:type="dxa"/>
-            <w:shd w:val="clear" w:color="auto" w:fill="EAF1DD" w:themeFill="accent3" w:themeFillTint="33"/>
-          </w:tcPr>
-          <w:p>
-            <w:pPr>
-              <w:pStyle w:val="aa"/>
-              <w:ind w:left="0" w:firstLineChars="0" w:firstLine="0"/>
-            </w:pPr>
-            <w:r>
-              <w:rPr>
-                <w:rFonts w:hint="eastAsia"/>
-              </w:rPr>
-              <w:t>语法与</w:t>
-            </w:r>
-            <w:r>
-              <w:t>正常列</w:t>
-            </w:r>
-            <w:r>
-              <w:rPr>
-                <w:rFonts w:hint="eastAsia"/>
-              </w:rPr>
-              <w:t>相同</w:t>
-            </w:r>
-            <w:r>
-              <w:t>。</w:t>
-            </w:r>
-          </w:p>
-          <w:p>
-            <w:pPr>
-              <w:pStyle w:val="aa"/>
-              <w:ind w:left="0" w:firstLineChars="0" w:firstLine="0"/>
-            </w:pPr>
-            <w:r>
-              <w:rPr>
-                <w:rFonts w:hint="eastAsia"/>
-              </w:rPr>
-              <w:t>修改</w:t>
-            </w:r>
-            <w:r>
               <w:t>普通列的顺序</w:t>
             </w:r>
             <w:r>
@@ -12178,9 +12037,6 @@
             <w:pPr>
               <w:pStyle w:val="aa"/>
               <w:ind w:left="0" w:firstLineChars="0" w:firstLine="0"/>
-              <w:rPr>
-                <w:rFonts w:hint="eastAsia"/>
-              </w:rPr>
             </w:pPr>
           </w:p>
         </w:tc>
@@ -12261,9 +12117,6 @@
             <w:pPr>
               <w:pStyle w:val="aa"/>
               <w:ind w:left="0" w:firstLineChars="0" w:firstLine="0"/>
-              <w:rPr>
-                <w:rFonts w:hint="eastAsia"/>
-              </w:rPr>
             </w:pPr>
             <w:r>
               <w:rPr>
@@ -12285,9 +12138,6 @@
             <w:pPr>
               <w:pStyle w:val="aa"/>
               <w:ind w:left="0" w:firstLineChars="0" w:firstLine="0"/>
-              <w:rPr>
-                <w:rFonts w:hint="eastAsia"/>
-              </w:rPr>
             </w:pPr>
             <w:r>
               <w:rPr>
@@ -12392,9 +12242,6 @@
             <w:pPr>
               <w:pStyle w:val="aa"/>
               <w:ind w:left="0" w:firstLineChars="0" w:firstLine="0"/>
-              <w:rPr>
-                <w:rFonts w:hint="eastAsia"/>
-              </w:rPr>
             </w:pPr>
             <w:r>
               <w:rPr>
@@ -12517,9 +12364,6 @@
             <w:pPr>
               <w:pStyle w:val="aa"/>
               <w:ind w:left="0" w:firstLineChars="0" w:firstLine="0"/>
-              <w:rPr>
-                <w:rFonts w:hint="eastAsia"/>
-              </w:rPr>
             </w:pPr>
           </w:p>
         </w:tc>
@@ -12618,9 +12462,6 @@
             <w:pPr>
               <w:pStyle w:val="aa"/>
               <w:ind w:left="0" w:firstLineChars="0" w:firstLine="0"/>
-              <w:rPr>
-                <w:rFonts w:hint="eastAsia"/>
-              </w:rPr>
             </w:pPr>
             <w:r>
               <w:t xml:space="preserve">e.g: </w:t>
@@ -12650,10 +12491,7 @@
               <w:t>[COLUMN]</w:t>
             </w:r>
             <w:r>
-              <w:t xml:space="preserve"> col_name</w:t>
-            </w:r>
-            <w:r>
-              <w:t xml:space="preserve"> data_type </w:t>
+              <w:t xml:space="preserve"> col_name data_type </w:t>
             </w:r>
             <w:r>
               <w:rPr>
@@ -12684,9 +12522,6 @@
             <w:pPr>
               <w:pStyle w:val="aa"/>
               <w:ind w:left="0" w:firstLineChars="0" w:firstLine="0"/>
-              <w:rPr>
-                <w:rFonts w:hint="eastAsia"/>
-              </w:rPr>
             </w:pPr>
           </w:p>
         </w:tc>
@@ -12749,9 +12584,6 @@
             <w:pPr>
               <w:pStyle w:val="aa"/>
               <w:ind w:left="0" w:firstLineChars="0" w:firstLine="0"/>
-              <w:rPr>
-                <w:rFonts w:hint="eastAsia"/>
-              </w:rPr>
             </w:pPr>
             <w:r>
               <w:rPr>
@@ -12782,9 +12614,6 @@
             <w:pPr>
               <w:pStyle w:val="aa"/>
               <w:ind w:left="0" w:firstLineChars="0" w:firstLine="0"/>
-              <w:rPr>
-                <w:rFonts w:hint="eastAsia"/>
-              </w:rPr>
             </w:pPr>
           </w:p>
         </w:tc>
@@ -12952,13 +12781,7 @@
               <w:rPr>
                 <w:color w:val="0070C0"/>
               </w:rPr>
-              <w:t xml:space="preserve"> </w:t>
-            </w:r>
-            <w:r>
-              <w:rPr>
-                <w:color w:val="0070C0"/>
-              </w:rPr>
-              <w:t>VIRTUAL</w:t>
+              <w:t xml:space="preserve"> VIRTUAL</w:t>
             </w:r>
             <w:r>
               <w:rPr>
@@ -13088,9 +12911,6 @@
             <w:pPr>
               <w:pStyle w:val="aa"/>
               <w:ind w:left="0" w:firstLineChars="0" w:firstLine="0"/>
-              <w:rPr>
-                <w:rFonts w:hint="eastAsia"/>
-              </w:rPr>
             </w:pPr>
             <w:r>
               <w:rPr>
@@ -13255,9 +13075,6 @@
             <w:pPr>
               <w:pStyle w:val="aa"/>
               <w:ind w:left="0" w:firstLineChars="0" w:firstLine="0"/>
-              <w:rPr>
-                <w:rFonts w:hint="eastAsia"/>
-              </w:rPr>
             </w:pPr>
           </w:p>
         </w:tc>
@@ -13362,9 +13179,6 @@
             <w:pPr>
               <w:pStyle w:val="aa"/>
               <w:ind w:left="0" w:firstLineChars="0" w:firstLine="0"/>
-              <w:rPr>
-                <w:rFonts w:hint="eastAsia"/>
-              </w:rPr>
             </w:pPr>
             <w:r>
               <w:rPr>
@@ -13483,13 +13297,7 @@
               <w:rPr>
                 <w:rFonts w:hint="eastAsia"/>
               </w:rPr>
-              <w:t>相同</w:t>
-            </w:r>
-            <w:r>
-              <w:rPr>
-                <w:rFonts w:hint="eastAsia"/>
-              </w:rPr>
-              <w:t>。</w:t>
+              <w:t>相同。</w:t>
             </w:r>
           </w:p>
         </w:tc>
@@ -13606,9 +13414,6 @@
             <w:pPr>
               <w:pStyle w:val="aa"/>
               <w:ind w:left="0" w:firstLineChars="0" w:firstLine="0"/>
-              <w:rPr>
-                <w:rFonts w:hint="eastAsia"/>
-              </w:rPr>
             </w:pPr>
             <w:r>
               <w:rPr>
@@ -13629,9 +13434,6 @@
             <w:pPr>
               <w:pStyle w:val="aa"/>
               <w:ind w:left="0"/>
-              <w:rPr>
-                <w:rFonts w:hint="eastAsia"/>
-              </w:rPr>
             </w:pPr>
             <w:r>
               <w:rPr>
@@ -13665,9 +13467,6 @@
             <w:pPr>
               <w:pStyle w:val="aa"/>
               <w:ind w:left="0" w:firstLineChars="0" w:firstLine="0"/>
-              <w:rPr>
-                <w:rFonts w:hint="eastAsia"/>
-              </w:rPr>
             </w:pPr>
             <w:r>
               <w:rPr>
@@ -13686,9 +13485,6 @@
             <w:pPr>
               <w:pStyle w:val="aa"/>
               <w:ind w:left="0" w:firstLineChars="0" w:firstLine="0"/>
-              <w:rPr>
-                <w:rFonts w:hint="eastAsia"/>
-              </w:rPr>
             </w:pPr>
             <w:r>
               <w:rPr>
@@ -13707,9 +13503,6 @@
             <w:pPr>
               <w:pStyle w:val="aa"/>
               <w:ind w:left="0" w:firstLineChars="0" w:firstLine="0"/>
-              <w:rPr>
-                <w:rFonts w:hint="eastAsia"/>
-              </w:rPr>
             </w:pPr>
             <w:r>
               <w:rPr>
@@ -13728,9 +13521,6 @@
             <w:pPr>
               <w:pStyle w:val="aa"/>
               <w:ind w:left="0" w:firstLineChars="0" w:firstLine="0"/>
-              <w:rPr>
-                <w:rFonts w:hint="eastAsia"/>
-              </w:rPr>
             </w:pPr>
             <w:r>
               <w:t xml:space="preserve">e.g: </w:t>
@@ -13791,9 +13581,6 @@
             <w:pPr>
               <w:pStyle w:val="aa"/>
               <w:ind w:left="0" w:firstLineChars="0" w:firstLine="0"/>
-              <w:rPr>
-                <w:rFonts w:hint="eastAsia"/>
-              </w:rPr>
             </w:pPr>
           </w:p>
         </w:tc>
@@ -13808,9 +13595,6 @@
             <w:pPr>
               <w:pStyle w:val="aa"/>
               <w:ind w:left="0" w:firstLineChars="0" w:firstLine="0"/>
-              <w:rPr>
-                <w:rFonts w:hint="eastAsia"/>
-              </w:rPr>
             </w:pPr>
           </w:p>
         </w:tc>
@@ -13823,9 +13607,6 @@
             <w:pPr>
               <w:pStyle w:val="aa"/>
               <w:ind w:left="0" w:firstLineChars="0" w:firstLine="0"/>
-              <w:rPr>
-                <w:rFonts w:hint="eastAsia"/>
-              </w:rPr>
             </w:pPr>
             <w:r>
               <w:rPr>
@@ -13844,9 +13625,6 @@
             <w:pPr>
               <w:pStyle w:val="aa"/>
               <w:ind w:left="0" w:firstLineChars="0" w:firstLine="0"/>
-              <w:rPr>
-                <w:rFonts w:hint="eastAsia"/>
-              </w:rPr>
             </w:pPr>
             <w:r>
               <w:rPr>
@@ -13865,9 +13643,6 @@
             <w:pPr>
               <w:pStyle w:val="aa"/>
               <w:ind w:left="0" w:firstLineChars="0" w:firstLine="0"/>
-              <w:rPr>
-                <w:rFonts w:hint="eastAsia"/>
-              </w:rPr>
             </w:pPr>
             <w:r>
               <w:rPr>
@@ -13886,9 +13661,6 @@
             <w:pPr>
               <w:pStyle w:val="aa"/>
               <w:ind w:left="0" w:firstLineChars="0" w:firstLine="0"/>
-              <w:rPr>
-                <w:rFonts w:hint="eastAsia"/>
-              </w:rPr>
             </w:pPr>
             <w:r>
               <w:rPr>
@@ -13910,9 +13682,6 @@
             <w:pPr>
               <w:pStyle w:val="aa"/>
               <w:ind w:left="0" w:firstLineChars="0" w:firstLine="0"/>
-              <w:rPr>
-                <w:rFonts w:hint="eastAsia"/>
-              </w:rPr>
             </w:pPr>
             <w:r>
               <w:rPr>
@@ -14399,9 +14168,6 @@
             <w:pPr>
               <w:pStyle w:val="aa"/>
               <w:ind w:left="0" w:firstLineChars="0" w:firstLine="0"/>
-              <w:rPr>
-                <w:rFonts w:hint="eastAsia"/>
-              </w:rPr>
             </w:pPr>
             <w:r>
               <w:rPr>
@@ -14422,9 +14188,6 @@
             <w:pPr>
               <w:pStyle w:val="aa"/>
               <w:ind w:left="0" w:firstLineChars="0" w:firstLine="0"/>
-              <w:rPr>
-                <w:rFonts w:hint="eastAsia"/>
-              </w:rPr>
             </w:pPr>
             <w:r>
               <w:rPr>
@@ -14461,9 +14224,6 @@
             <w:pPr>
               <w:pStyle w:val="aa"/>
               <w:ind w:left="0" w:firstLineChars="0" w:firstLine="0"/>
-              <w:rPr>
-                <w:rFonts w:hint="eastAsia"/>
-              </w:rPr>
             </w:pPr>
             <w:r>
               <w:rPr>
@@ -14482,9 +14242,6 @@
             <w:pPr>
               <w:pStyle w:val="aa"/>
               <w:ind w:left="0" w:firstLineChars="0" w:firstLine="0"/>
-              <w:rPr>
-                <w:rFonts w:hint="eastAsia"/>
-              </w:rPr>
             </w:pPr>
             <w:r>
               <w:rPr>
@@ -14503,9 +14260,6 @@
             <w:pPr>
               <w:pStyle w:val="aa"/>
               <w:ind w:left="0" w:firstLineChars="0" w:firstLine="0"/>
-              <w:rPr>
-                <w:rFonts w:hint="eastAsia"/>
-              </w:rPr>
             </w:pPr>
             <w:r>
               <w:rPr>
@@ -14524,9 +14278,6 @@
             <w:pPr>
               <w:pStyle w:val="aa"/>
               <w:ind w:left="0" w:firstLineChars="0" w:firstLine="0"/>
-              <w:rPr>
-                <w:rFonts w:hint="eastAsia"/>
-              </w:rPr>
             </w:pPr>
             <w:r>
               <w:t xml:space="preserve">e.g: </w:t>
@@ -14560,9 +14311,6 @@
             <w:pPr>
               <w:pStyle w:val="aa"/>
               <w:ind w:left="0" w:firstLineChars="0" w:firstLine="0"/>
-              <w:rPr>
-                <w:rFonts w:hint="eastAsia"/>
-              </w:rPr>
             </w:pPr>
           </w:p>
         </w:tc>
@@ -14577,9 +14325,6 @@
             <w:pPr>
               <w:pStyle w:val="aa"/>
               <w:ind w:left="0" w:firstLineChars="0" w:firstLine="0"/>
-              <w:rPr>
-                <w:rFonts w:hint="eastAsia"/>
-              </w:rPr>
             </w:pPr>
           </w:p>
         </w:tc>
@@ -14592,9 +14337,6 @@
             <w:pPr>
               <w:pStyle w:val="aa"/>
               <w:ind w:left="0" w:firstLineChars="0" w:firstLine="0"/>
-              <w:rPr>
-                <w:rFonts w:hint="eastAsia"/>
-              </w:rPr>
             </w:pPr>
             <w:r>
               <w:rPr>
@@ -14613,9 +14355,6 @@
             <w:pPr>
               <w:pStyle w:val="aa"/>
               <w:ind w:left="0" w:firstLineChars="0" w:firstLine="0"/>
-              <w:rPr>
-                <w:rFonts w:hint="eastAsia"/>
-              </w:rPr>
             </w:pPr>
             <w:r>
               <w:rPr>
@@ -14634,9 +14373,6 @@
             <w:pPr>
               <w:pStyle w:val="aa"/>
               <w:ind w:left="0" w:firstLineChars="0" w:firstLine="0"/>
-              <w:rPr>
-                <w:rFonts w:hint="eastAsia"/>
-              </w:rPr>
             </w:pPr>
             <w:r>
               <w:rPr>
@@ -14674,6 +14410,15 @@
               </w:rPr>
               <w:t>alter sequence</w:t>
             </w:r>
+            <w:r>
+              <w:rPr>
+                <w:rFonts w:hint="eastAsia"/>
+              </w:rPr>
+              <w:t>，</w:t>
+            </w:r>
+            <w:r>
+              <w:t>已实现。</w:t>
+            </w:r>
           </w:p>
         </w:tc>
         <w:tc>
@@ -14685,9 +14430,6 @@
             <w:pPr>
               <w:pStyle w:val="aa"/>
               <w:ind w:left="0" w:firstLineChars="0" w:firstLine="0"/>
-              <w:rPr>
-                <w:rFonts w:hint="eastAsia"/>
-              </w:rPr>
             </w:pPr>
             <w:r>
               <w:rPr>
@@ -14806,10 +14548,7 @@
               <w:t>COMMENT</w:t>
             </w:r>
             <w:r>
-              <w:t xml:space="preserve"> [=] ‘string’</w:t>
-            </w:r>
-            <w:r>
-              <w:t>;</w:t>
+              <w:t xml:space="preserve"> [=] ‘string’;</w:t>
             </w:r>
           </w:p>
         </w:tc>
@@ -14902,30 +14641,30 @@
             <w:pPr>
               <w:pStyle w:val="aa"/>
               <w:ind w:left="0" w:firstLineChars="0" w:firstLine="0"/>
-            </w:pPr>
-            <w:r>
-              <w:rPr>
-                <w:rFonts w:hint="eastAsia"/>
-              </w:rPr>
-              <w:t>下压</w:t>
-            </w:r>
-            <w:r>
-              <w:t>为</w:t>
-            </w:r>
-            <w:r>
-              <w:rPr>
-                <w:rFonts w:hint="eastAsia"/>
-              </w:rPr>
-              <w:t>alter</w:t>
-            </w:r>
-            <w:r>
-              <w:rPr>
-                <w:rFonts w:hint="eastAsia"/>
-              </w:rPr>
-              <w:t>备注</w:t>
-            </w:r>
-            <w:r>
-              <w:t>中的表属性</w:t>
+              <w:rPr>
+                <w:rFonts w:hint="eastAsia"/>
+              </w:rPr>
+            </w:pPr>
+            <w:r>
+              <w:rPr>
+                <w:rFonts w:hint="eastAsia"/>
+              </w:rPr>
+              <w:t>不支持</w:t>
+            </w:r>
+            <w:r>
+              <w:rPr>
+                <w:rFonts w:hint="eastAsia"/>
+              </w:rPr>
+              <w:t>，</w:t>
+            </w:r>
+            <w:r>
+              <w:rPr>
+                <w:rFonts w:hint="eastAsia"/>
+              </w:rPr>
+              <w:t>INPLACE</w:t>
+            </w:r>
+            <w:r>
+              <w:t>修改时会报错。</w:t>
             </w:r>
           </w:p>
         </w:tc>
@@ -14938,9 +14677,6 @@
             <w:pPr>
               <w:pStyle w:val="aa"/>
               <w:ind w:left="0" w:firstLineChars="0" w:firstLine="0"/>
-              <w:rPr>
-                <w:rFonts w:hint="eastAsia"/>
-              </w:rPr>
             </w:pPr>
             <w:r>
               <w:rPr>
@@ -15235,9 +14971,6 @@
             <w:pPr>
               <w:pStyle w:val="aa"/>
               <w:ind w:left="0" w:firstLineChars="0" w:firstLine="0"/>
-              <w:rPr>
-                <w:rFonts w:hint="eastAsia"/>
-              </w:rPr>
             </w:pPr>
             <w:r>
               <w:rPr>
@@ -15462,6 +15195,12 @@
             <w:r>
               <w:t>操作</w:t>
             </w:r>
+            <w:r>
+              <w:rPr>
+                <w:rFonts w:hint="eastAsia"/>
+              </w:rPr>
+              <w:t>。</w:t>
+            </w:r>
           </w:p>
         </w:tc>
         <w:tc>
@@ -15473,9 +15212,6 @@
             <w:pPr>
               <w:pStyle w:val="aa"/>
               <w:ind w:left="0" w:firstLineChars="0" w:firstLine="0"/>
-              <w:rPr>
-                <w:rFonts w:hint="eastAsia"/>
-              </w:rPr>
             </w:pPr>
             <w:r>
               <w:rPr>
@@ -15704,6 +15440,9 @@
             <w:pPr>
               <w:pStyle w:val="aa"/>
               <w:ind w:left="0" w:firstLineChars="0" w:firstLine="0"/>
+              <w:rPr>
+                <w:rFonts w:hint="eastAsia"/>
+              </w:rPr>
             </w:pPr>
             <w:r>
               <w:rPr>
@@ -15716,6 +15455,24 @@
                 <w:rFonts w:hint="eastAsia"/>
               </w:rPr>
               <w:t>rename</w:t>
+            </w:r>
+            <w:r>
+              <w:rPr>
+                <w:rFonts w:hint="eastAsia"/>
+              </w:rPr>
+              <w:t>，</w:t>
+            </w:r>
+            <w:r>
+              <w:t>已</w:t>
+            </w:r>
+            <w:r>
+              <w:rPr>
+                <w:rFonts w:hint="eastAsia"/>
+              </w:rPr>
+              <w:t>实现</w:t>
+            </w:r>
+            <w:r>
+              <w:t>。</w:t>
             </w:r>
           </w:p>
         </w:tc>
@@ -15728,9 +15485,6 @@
             <w:pPr>
               <w:pStyle w:val="aa"/>
               <w:ind w:left="0" w:firstLineChars="0" w:firstLine="0"/>
-              <w:rPr>
-                <w:rFonts w:hint="eastAsia"/>
-              </w:rPr>
             </w:pPr>
             <w:r>
               <w:rPr>
@@ -15752,9 +15506,6 @@
             <w:pPr>
               <w:pStyle w:val="aa"/>
               <w:ind w:left="0" w:firstLineChars="0" w:firstLine="0"/>
-              <w:rPr>
-                <w:rFonts w:hint="eastAsia"/>
-              </w:rPr>
             </w:pPr>
             <w:r>
               <w:rPr>
@@ -15776,9 +15527,6 @@
             <w:pPr>
               <w:pStyle w:val="aa"/>
               <w:ind w:left="0" w:firstLineChars="0" w:firstLine="0"/>
-              <w:rPr>
-                <w:rFonts w:hint="eastAsia"/>
-              </w:rPr>
             </w:pPr>
             <w:r>
               <w:rPr>
@@ -15797,9 +15545,6 @@
             <w:pPr>
               <w:pStyle w:val="aa"/>
               <w:ind w:left="0" w:firstLineChars="0" w:firstLine="0"/>
-              <w:rPr>
-                <w:rFonts w:hint="eastAsia"/>
-              </w:rPr>
             </w:pPr>
             <w:r>
               <w:rPr>
@@ -15818,9 +15563,6 @@
             <w:pPr>
               <w:pStyle w:val="aa"/>
               <w:ind w:left="0" w:firstLineChars="0" w:firstLine="0"/>
-              <w:rPr>
-                <w:rFonts w:hint="eastAsia"/>
-              </w:rPr>
             </w:pPr>
             <w:r>
               <w:rPr>
@@ -15839,9 +15581,6 @@
             <w:pPr>
               <w:pStyle w:val="aa"/>
               <w:ind w:left="0" w:firstLineChars="0" w:firstLine="0"/>
-              <w:rPr>
-                <w:rFonts w:hint="eastAsia"/>
-              </w:rPr>
             </w:pPr>
             <w:r>
               <w:rPr>
@@ -15893,9 +15632,6 @@
             <w:pPr>
               <w:pStyle w:val="aa"/>
               <w:ind w:left="0" w:firstLineChars="0" w:firstLine="0"/>
-              <w:rPr>
-                <w:rFonts w:hint="eastAsia"/>
-              </w:rPr>
             </w:pPr>
           </w:p>
         </w:tc>
@@ -15923,10 +15659,16 @@
             <w:pPr>
               <w:pStyle w:val="aa"/>
               <w:ind w:left="0" w:firstLineChars="0" w:firstLine="0"/>
-              <w:rPr>
-                <w:rFonts w:hint="eastAsia"/>
-              </w:rPr>
-            </w:pPr>
+            </w:pPr>
+            <w:r>
+              <w:rPr>
+                <w:rFonts w:hint="eastAsia"/>
+              </w:rPr>
+              <w:t>N</w:t>
+            </w:r>
+            <w:r>
+              <w:t>o</w:t>
+            </w:r>
           </w:p>
         </w:tc>
         <w:tc>
@@ -15938,10 +15680,13 @@
             <w:pPr>
               <w:pStyle w:val="aa"/>
               <w:ind w:left="0" w:firstLineChars="0" w:firstLine="0"/>
-              <w:rPr>
-                <w:rFonts w:hint="eastAsia"/>
-              </w:rPr>
-            </w:pPr>
+            </w:pPr>
+            <w:r>
+              <w:rPr>
+                <w:rFonts w:hint="eastAsia"/>
+              </w:rPr>
+              <w:t>Yes</w:t>
+            </w:r>
           </w:p>
         </w:tc>
         <w:tc>
@@ -15953,10 +15698,13 @@
             <w:pPr>
               <w:pStyle w:val="aa"/>
               <w:ind w:left="0" w:firstLineChars="0" w:firstLine="0"/>
-              <w:rPr>
-                <w:rFonts w:hint="eastAsia"/>
-              </w:rPr>
-            </w:pPr>
+            </w:pPr>
+            <w:r>
+              <w:rPr>
+                <w:rFonts w:hint="eastAsia"/>
+              </w:rPr>
+              <w:t>No</w:t>
+            </w:r>
           </w:p>
         </w:tc>
         <w:tc>
@@ -15976,7 +15724,28 @@
               <w:rPr>
                 <w:rFonts w:hint="eastAsia"/>
               </w:rPr>
-              <w:t>不支持</w:t>
+              <w:t>走</w:t>
+            </w:r>
+            <w:r>
+              <w:t>COPY</w:t>
+            </w:r>
+            <w:r>
+              <w:rPr>
+                <w:rFonts w:hint="eastAsia"/>
+              </w:rPr>
+              <w:t>流程</w:t>
+            </w:r>
+            <w:r>
+              <w:t>。</w:t>
+            </w:r>
+            <w:r>
+              <w:rPr>
+                <w:rFonts w:hint="eastAsia"/>
+              </w:rPr>
+              <w:t>存储</w:t>
+            </w:r>
+            <w:r>
+              <w:t>引擎无法干预。</w:t>
             </w:r>
           </w:p>
         </w:tc>
@@ -15989,9 +15758,6 @@
             <w:pPr>
               <w:pStyle w:val="aa"/>
               <w:ind w:left="0" w:firstLineChars="0" w:firstLine="0"/>
-              <w:rPr>
-                <w:rFonts w:hint="eastAsia"/>
-              </w:rPr>
             </w:pPr>
           </w:p>
         </w:tc>
@@ -16128,13 +15894,7 @@
               <w:rPr>
                 <w:rFonts w:hint="eastAsia"/>
               </w:rPr>
-              <w:t>_name</w:t>
-            </w:r>
-            <w:r>
-              <w:rPr>
-                <w:rFonts w:hint="eastAsia"/>
-              </w:rPr>
-              <w:t>;</w:t>
+              <w:t>_name;</w:t>
             </w:r>
           </w:p>
         </w:tc>
@@ -16209,12 +15969,18 @@
             <w:pPr>
               <w:pStyle w:val="aa"/>
               <w:ind w:left="0" w:firstLineChars="0" w:firstLine="0"/>
+              <w:rPr>
+                <w:rFonts w:hint="eastAsia"/>
+              </w:rPr>
             </w:pPr>
             <w:r>
               <w:rPr>
                 <w:rFonts w:hint="eastAsia"/>
               </w:rPr>
               <w:t>不支持</w:t>
+            </w:r>
+            <w:r>
+              <w:t>。</w:t>
             </w:r>
           </w:p>
         </w:tc>
@@ -16227,9 +15993,6 @@
             <w:pPr>
               <w:pStyle w:val="aa"/>
               <w:ind w:left="0" w:firstLineChars="0" w:firstLine="0"/>
-              <w:rPr>
-                <w:rFonts w:hint="eastAsia"/>
-              </w:rPr>
             </w:pPr>
           </w:p>
         </w:tc>
@@ -16340,9 +16103,6 @@
             <w:pPr>
               <w:pStyle w:val="aa"/>
               <w:ind w:left="0" w:firstLineChars="0" w:firstLine="0"/>
-              <w:rPr>
-                <w:rFonts w:hint="eastAsia"/>
-              </w:rPr>
             </w:pPr>
             <w:r>
               <w:rPr>
@@ -16371,8 +16131,6 @@
             <w:r>
               <w:t>碎片</w:t>
             </w:r>
-            <w:bookmarkStart w:id="0" w:name="_GoBack"/>
-            <w:bookmarkEnd w:id="0"/>
           </w:p>
         </w:tc>
         <w:tc>
@@ -16384,9 +16142,6 @@
             <w:pPr>
               <w:pStyle w:val="aa"/>
               <w:ind w:left="0" w:firstLineChars="0" w:firstLine="0"/>
-              <w:rPr>
-                <w:rFonts w:hint="eastAsia"/>
-              </w:rPr>
             </w:pPr>
           </w:p>
         </w:tc>
@@ -16401,9 +16156,6 @@
             <w:pPr>
               <w:pStyle w:val="aa"/>
               <w:ind w:left="0" w:firstLineChars="0" w:firstLine="0"/>
-              <w:rPr>
-                <w:rFonts w:hint="eastAsia"/>
-              </w:rPr>
             </w:pPr>
           </w:p>
         </w:tc>
@@ -16473,9 +16225,6 @@
             <w:pPr>
               <w:pStyle w:val="aa"/>
               <w:ind w:left="0" w:firstLineChars="0" w:firstLine="0"/>
-              <w:rPr>
-                <w:rFonts w:hint="eastAsia"/>
-              </w:rPr>
             </w:pPr>
           </w:p>
         </w:tc>
@@ -16535,46 +16284,107 @@
         <w:rPr>
           <w:rFonts w:hint="eastAsia"/>
         </w:rPr>
-        <w:t>还有</w:t>
-      </w:r>
-      <w:r>
-        <w:t>一些</w:t>
-      </w:r>
-      <w:r>
-        <w:t>InnoDB</w:t>
-      </w:r>
-      <w:r>
-        <w:rPr>
-          <w:rFonts w:hint="eastAsia"/>
-        </w:rPr>
-        <w:t>使用</w:t>
-      </w:r>
-      <w:r>
+        <w:t>如果</w:t>
+      </w:r>
+      <w:r>
+        <w:t xml:space="preserve"> ALTER TABLE </w:t>
+      </w:r>
+      <w:r>
+        <w:rPr>
+          <w:rFonts w:hint="eastAsia"/>
+        </w:rPr>
+        <w:t>加</w:t>
+      </w:r>
+      <w:r>
+        <w:t>了</w:t>
+      </w:r>
+      <w:r>
+        <w:rPr>
+          <w:rFonts w:hint="eastAsia"/>
+        </w:rPr>
+        <w:t xml:space="preserve"> FORCE </w:t>
+      </w:r>
+      <w:r>
+        <w:rPr>
+          <w:rFonts w:hint="eastAsia"/>
+        </w:rPr>
+        <w:t>关键字</w:t>
+      </w:r>
+      <w:r>
+        <w:t>，</w:t>
+      </w:r>
+      <w:r>
+        <w:rPr>
+          <w:rFonts w:hint="eastAsia"/>
+        </w:rPr>
+        <w:t>会</w:t>
+      </w:r>
+      <w:r>
+        <w:t>强制走</w:t>
+      </w:r>
+      <w:r>
+        <w:rPr>
+          <w:rFonts w:hint="eastAsia"/>
+        </w:rPr>
+        <w:t>INPLACE</w:t>
+      </w:r>
+      <w:r>
+        <w:rPr>
+          <w:rFonts w:hint="eastAsia"/>
+        </w:rPr>
+        <w:t>。</w:t>
+      </w:r>
+      <w:r>
+        <w:t>无法走</w:t>
+      </w:r>
+      <w:r>
+        <w:rPr>
+          <w:rFonts w:hint="eastAsia"/>
+        </w:rPr>
+        <w:t>INPLACE</w:t>
+      </w:r>
+      <w:r>
+        <w:rPr>
+          <w:rFonts w:hint="eastAsia"/>
+        </w:rPr>
         <w:t>的</w:t>
       </w:r>
       <w:r>
-        <w:rPr>
-          <w:rFonts w:hint="eastAsia"/>
-        </w:rPr>
-        <w:t>非</w:t>
-      </w:r>
-      <w:r>
-        <w:t>通用选项</w:t>
-      </w:r>
-      <w:r>
-        <w:rPr>
-          <w:rFonts w:hint="eastAsia"/>
-        </w:rPr>
-        <w:t>不作</w:t>
-      </w:r>
-      <w:r>
-        <w:t>支持，包括</w:t>
-      </w:r>
-      <w:r>
-        <w:rPr>
-          <w:rFonts w:hint="eastAsia"/>
-        </w:rPr>
-        <w:t xml:space="preserve"> ROW_FORMAT</w:t>
+        <w:t>操作会重建表</w:t>
+      </w:r>
+      <w:r>
+        <w:rPr>
+          <w:rFonts w:hint="eastAsia"/>
+        </w:rPr>
+        <w:t>解决</w:t>
+      </w:r>
+      <w:r>
+        <w:rPr>
+          <w:rFonts w:hint="eastAsia"/>
+        </w:rPr>
+        <w:t>。</w:t>
+      </w:r>
+    </w:p>
+    <w:p>
+      <w:pPr>
+        <w:pStyle w:val="aa"/>
+        <w:numPr>
+          <w:ilvl w:val="0"/>
+          <w:numId w:val="8"/>
+        </w:numPr>
+        <w:ind w:firstLineChars="0"/>
+        <w:rPr>
+          <w:rFonts w:hint="eastAsia"/>
+        </w:rPr>
+      </w:pPr>
+      <w:r>
+        <w:rPr>
+          <w:rFonts w:hint="eastAsia"/>
+        </w:rPr>
+        <w:t>不支持</w:t>
+      </w:r>
+      <w:r>
+        <w:t>的选项</w:t>
       </w:r>
       <w:r>
         <w:rPr>
@@ -16583,10 +16393,7 @@
         <w:t>，</w:t>
       </w:r>
       <w:r>
-        <w:rPr>
-          <w:rFonts w:hint="eastAsia"/>
-        </w:rPr>
-        <w:t>KEY_BLOCK_SIZE</w:t>
+        <w:t>使用时只做忽略</w:t>
       </w:r>
       <w:r>
         <w:rPr>
@@ -16595,7 +16402,59 @@
         <w:t>，</w:t>
       </w:r>
       <w:r>
-        <w:t>统计信息有关选项。</w:t>
+        <w:t>不</w:t>
+      </w:r>
+      <w:r>
+        <w:rPr>
+          <w:rFonts w:hint="eastAsia"/>
+        </w:rPr>
+        <w:t>报错</w:t>
+      </w:r>
+      <w:r>
+        <w:rPr>
+          <w:rFonts w:hint="eastAsia"/>
+        </w:rPr>
+        <w:t>，</w:t>
+      </w:r>
+      <w:r>
+        <w:t>与</w:t>
+      </w:r>
+      <w:r>
+        <w:rPr>
+          <w:rFonts w:hint="eastAsia"/>
+        </w:rPr>
+        <w:t>InnoDB/MyISAM</w:t>
+      </w:r>
+      <w:r>
+        <w:rPr>
+          <w:rFonts w:hint="eastAsia"/>
+        </w:rPr>
+        <w:t>表</w:t>
+      </w:r>
+      <w:r>
+        <w:t>现相同。</w:t>
+      </w:r>
+      <w:r>
+        <w:rPr>
+          <w:rFonts w:hint="eastAsia"/>
+        </w:rPr>
+        <w:t>不支持</w:t>
+      </w:r>
+      <w:r>
+        <w:t>的选项</w:t>
+      </w:r>
+      <w:r>
+        <w:lastRenderedPageBreak/>
+        <w:t>包括：</w:t>
+      </w:r>
+      <w:r>
+        <w:rPr>
+          <w:rFonts w:hint="eastAsia"/>
+        </w:rPr>
+        <w:t xml:space="preserve">MIN_ROWS, MAX_ROWS, AVG_ROW_LENGTH, PACK_KEYS, CHECKSUM, ROW_FORMAT, DELAY_KEY_WRITE, </w:t>
+      </w:r>
+      <w:r>
+        <w:t>KEY_BLOCK_SIZE, COMPRESS, INSERT_METHOD, UNION, {DATA|INDEX} DIRECTORY, PASSWORD, CONNECTION, STATS_PERSISTENT, STATS_AUTO_RECALC, STATS_SAMPLE_PAGES, TABLESAPCE.</w:t>
       </w:r>
     </w:p>
     <w:p>
@@ -16611,34 +16470,37 @@
         <w:rPr>
           <w:rFonts w:hint="eastAsia"/>
         </w:rPr>
-        <w:t>如果</w:t>
-      </w:r>
-      <w:r>
-        <w:t xml:space="preserve"> ALTER TABLE </w:t>
-      </w:r>
-      <w:r>
-        <w:rPr>
-          <w:rFonts w:hint="eastAsia"/>
-        </w:rPr>
-        <w:t>加</w:t>
-      </w:r>
-      <w:r>
-        <w:t>了</w:t>
-      </w:r>
-      <w:r>
-        <w:rPr>
-          <w:rFonts w:hint="eastAsia"/>
-        </w:rPr>
-        <w:t xml:space="preserve"> FORCE </w:t>
-      </w:r>
-      <w:r>
-        <w:rPr>
-          <w:rFonts w:hint="eastAsia"/>
-        </w:rPr>
-        <w:t>关键字</w:t>
-      </w:r>
-      <w:r>
-        <w:t>，</w:t>
+        <w:t>修改</w:t>
+      </w:r>
+      <w:r>
+        <w:t>备注</w:t>
+      </w:r>
+      <w:r>
+        <w:rPr>
+          <w:rFonts w:hint="eastAsia"/>
+        </w:rPr>
+        <w:t>只有</w:t>
+      </w:r>
+      <w:r>
+        <w:t>在</w:t>
+      </w:r>
+      <w:r>
+        <w:rPr>
+          <w:rFonts w:hint="eastAsia"/>
+        </w:rPr>
+        <w:t xml:space="preserve"> ALGORITHM</w:t>
+      </w:r>
+      <w:r>
+        <w:t xml:space="preserve"> = { DEFAULT | INPLACE } </w:t>
+      </w:r>
+      <w:r>
+        <w:rPr>
+          <w:rFonts w:hint="eastAsia"/>
+        </w:rPr>
+        <w:t>时</w:t>
+      </w:r>
+      <w:r>
+        <w:t>才</w:t>
       </w:r>
       <w:r>
         <w:rPr>
@@ -16647,50 +16509,96 @@
         <w:t>会</w:t>
       </w:r>
       <w:r>
-        <w:t>强制走</w:t>
-      </w:r>
-      <w:r>
-        <w:rPr>
-          <w:rFonts w:hint="eastAsia"/>
-        </w:rPr>
-        <w:t>INPLACE</w:t>
-      </w:r>
-      <w:r>
-        <w:rPr>
-          <w:rFonts w:hint="eastAsia"/>
-        </w:rPr>
+        <w:t>报错。在</w:t>
+      </w:r>
+      <w:r>
+        <w:rPr>
+          <w:rFonts w:hint="eastAsia"/>
+        </w:rPr>
+        <w:t xml:space="preserve"> ALGORITHM = </w:t>
+      </w:r>
+      <w:r>
+        <w:t xml:space="preserve">COPY </w:t>
+      </w:r>
+      <w:r>
+        <w:rPr>
+          <w:rFonts w:hint="eastAsia"/>
+        </w:rPr>
+        <w:t>时</w:t>
+      </w:r>
+      <w:r>
+        <w:t>，备注</w:t>
+      </w:r>
+      <w:r>
+        <w:rPr>
+          <w:rFonts w:hint="eastAsia"/>
+        </w:rPr>
+        <w:t>是会</w:t>
+      </w:r>
+      <w:r>
+        <w:t>被修改的。</w:t>
+      </w:r>
+      <w:r>
+        <w:rPr>
+          <w:rFonts w:hint="eastAsia"/>
+        </w:rPr>
+        <w:t>不允许修改</w:t>
+      </w:r>
+      <w:r>
+        <w:t>备注，</w:t>
+      </w:r>
+      <w:r>
+        <w:rPr>
+          <w:rFonts w:hint="eastAsia"/>
+        </w:rPr>
+        <w:t>是</w:t>
+      </w:r>
+      <w:r>
+        <w:t>因为备注</w:t>
+      </w:r>
+      <w:r>
+        <w:rPr>
+          <w:rFonts w:hint="eastAsia"/>
+        </w:rPr>
+        <w:t>是建表</w:t>
+      </w:r>
+      <w:r>
+        <w:t>选项，有特殊意义。未来</w:t>
+      </w:r>
+      <w:r>
+        <w:rPr>
+          <w:rFonts w:hint="eastAsia"/>
+        </w:rPr>
+        <w:t>有可能把</w:t>
+      </w:r>
+      <w:r>
+        <w:t>修改备注下压为修改对应的表属性，</w:t>
+      </w:r>
+      <w:commentRangeStart w:id="0"/>
+      <w:r>
+        <w:rPr>
+          <w:rFonts w:hint="eastAsia"/>
+        </w:rPr>
+        <w:t>现阶段</w:t>
+      </w:r>
+      <w:r>
+        <w:rPr>
+          <w:rFonts w:hint="eastAsia"/>
+        </w:rPr>
+        <w:t>不做</w:t>
+      </w:r>
+      <w:commentRangeEnd w:id="0"/>
+      <w:r>
+        <w:rPr>
+          <w:rStyle w:val="ad"/>
+        </w:rPr>
+        <w:commentReference w:id="0"/>
+      </w:r>
+      <w:r>
         <w:t>。</w:t>
       </w:r>
-      <w:r>
-        <w:t>无法走</w:t>
-      </w:r>
-      <w:r>
-        <w:rPr>
-          <w:rFonts w:hint="eastAsia"/>
-        </w:rPr>
-        <w:t>INPLACE</w:t>
-      </w:r>
-      <w:r>
-        <w:rPr>
-          <w:rFonts w:hint="eastAsia"/>
-        </w:rPr>
-        <w:t>的</w:t>
-      </w:r>
-      <w:r>
-        <w:t>操作会重建表</w:t>
-      </w:r>
-      <w:r>
-        <w:rPr>
-          <w:rFonts w:hint="eastAsia"/>
-        </w:rPr>
-        <w:t>解决</w:t>
-      </w:r>
-      <w:r>
-        <w:rPr>
-          <w:rFonts w:hint="eastAsia"/>
-        </w:rPr>
-        <w:t>。</w:t>
-      </w:r>
+      <w:bookmarkStart w:id="1" w:name="_GoBack"/>
+      <w:bookmarkEnd w:id="1"/>
     </w:p>
     <w:p>
       <w:pPr>
@@ -16700,7 +16608,6 @@
         <w:rPr>
           <w:rFonts w:hint="eastAsia"/>
         </w:rPr>
-        <w:lastRenderedPageBreak/>
         <w:t>外键</w:t>
       </w:r>
       <w:r>
@@ -17562,7 +17469,15 @@
           <w:rFonts w:hint="eastAsia"/>
           <w:color w:val="00B0F0"/>
         </w:rPr>
-        <w:t>验收用例通过</w:t>
+        <w:t>验</w:t>
+      </w:r>
+      <w:r>
+        <w:rPr>
+          <w:rFonts w:hint="eastAsia"/>
+          <w:color w:val="00B0F0"/>
+        </w:rPr>
+        <w:lastRenderedPageBreak/>
+        <w:t>收用例通过</w:t>
       </w:r>
       <w:r>
         <w:rPr>
@@ -17794,7 +17709,6 @@
         <w:rPr>
           <w:rFonts w:hint="eastAsia"/>
         </w:rPr>
-        <w:lastRenderedPageBreak/>
         <w:t>Checklist</w:t>
       </w:r>
     </w:p>
@@ -18263,6 +18177,42 @@
     </w:sectPr>
   </w:body>
 </w:document>
+</file>
+
+<file path=word/comments.xml><?xml version="1.0" encoding="utf-8"?>
+<w:comments xmlns:wpc="http://schemas.microsoft.com/office/word/2010/wordprocessingCanvas" xmlns:cx="http://schemas.microsoft.com/office/drawing/2014/chartex" xmlns:mc="http://schemas.openxmlformats.org/markup-compatibility/2006" xmlns:o="urn:schemas-microsoft-com:office:office" xmlns:r="http://schemas.openxmlformats.org/officeDocument/2006/relationships" xmlns:m="http://schemas.openxmlformats.org/officeDocument/2006/math" xmlns:v="urn:schemas-microsoft-com:vml" xmlns:wp14="http://schemas.microsoft.com/office/word/2010/wordprocessingDrawing" xmlns:wp="http://schemas.openxmlformats.org/drawingml/2006/wordprocessingDrawing" xmlns:w10="urn:schemas-microsoft-com:office:word" xmlns:w="http://schemas.openxmlformats.org/wordprocessingml/2006/main" xmlns:w14="http://schemas.microsoft.com/office/word/2010/wordml" xmlns:w15="http://schemas.microsoft.com/office/word/2012/wordml" xmlns:w16se="http://schemas.microsoft.com/office/word/2015/wordml/symex" xmlns:wpg="http://schemas.microsoft.com/office/word/2010/wordprocessingGroup" xmlns:wpi="http://schemas.microsoft.com/office/word/2010/wordprocessingInk" xmlns:wne="http://schemas.microsoft.com/office/word/2006/wordml" xmlns:wps="http://schemas.microsoft.com/office/word/2010/wordprocessingShape" mc:Ignorable="w14 w15 w16se wp14">
+  <w:comment w:id="0" w:author="linsuqiang" w:date="2019-03-01T17:10:00Z" w:initials="l">
+    <w:p>
+      <w:pPr>
+        <w:pStyle w:val="ae"/>
+        <w:rPr>
+          <w:rFonts w:hint="eastAsia"/>
+        </w:rPr>
+      </w:pPr>
+      <w:r>
+        <w:rPr>
+          <w:rStyle w:val="ad"/>
+        </w:rPr>
+        <w:annotationRef/>
+      </w:r>
+      <w:r>
+        <w:rPr>
+          <w:rFonts w:hint="eastAsia"/>
+        </w:rPr>
+        <w:t>做</w:t>
+      </w:r>
+      <w:r>
+        <w:t>任务去分析。</w:t>
+      </w:r>
+    </w:p>
+  </w:comment>
+</w:comments>
+</file>
+
+<file path=word/commentsExtended.xml><?xml version="1.0" encoding="utf-8"?>
+<w15:commentsEx xmlns:wpc="http://schemas.microsoft.com/office/word/2010/wordprocessingCanvas" xmlns:cx="http://schemas.microsoft.com/office/drawing/2014/chartex" xmlns:mc="http://schemas.openxmlformats.org/markup-compatibility/2006" xmlns:o="urn:schemas-microsoft-com:office:office" xmlns:r="http://schemas.openxmlformats.org/officeDocument/2006/relationships" xmlns:m="http://schemas.openxmlformats.org/officeDocument/2006/math" xmlns:v="urn:schemas-microsoft-com:vml" xmlns:wp14="http://schemas.microsoft.com/office/word/2010/wordprocessingDrawing" xmlns:wp="http://schemas.openxmlformats.org/drawingml/2006/wordprocessingDrawing" xmlns:w10="urn:schemas-microsoft-com:office:word" xmlns:w="http://schemas.openxmlformats.org/wordprocessingml/2006/main" xmlns:w14="http://schemas.microsoft.com/office/word/2010/wordml" xmlns:w15="http://schemas.microsoft.com/office/word/2012/wordml" xmlns:w16se="http://schemas.microsoft.com/office/word/2015/wordml/symex" xmlns:wpg="http://schemas.microsoft.com/office/word/2010/wordprocessingGroup" xmlns:wpi="http://schemas.microsoft.com/office/word/2010/wordprocessingInk" xmlns:wne="http://schemas.microsoft.com/office/word/2006/wordml" xmlns:wps="http://schemas.microsoft.com/office/word/2010/wordprocessingShape" mc:Ignorable="w14 w15 w16se wp14">
+  <w15:commentEx w15:paraId="21868179" w15:done="0"/>
+</w15:commentsEx>
 </file>
 
 <file path=word/endnotes.xml><?xml version="1.0" encoding="utf-8"?>
@@ -19370,6 +19320,14 @@
     <w:abstractNumId w:val="5"/>
   </w:num>
 </w:numbering>
+</file>
+
+<file path=word/people.xml><?xml version="1.0" encoding="utf-8"?>
+<w15:people xmlns:wpc="http://schemas.microsoft.com/office/word/2010/wordprocessingCanvas" xmlns:cx="http://schemas.microsoft.com/office/drawing/2014/chartex" xmlns:mc="http://schemas.openxmlformats.org/markup-compatibility/2006" xmlns:o="urn:schemas-microsoft-com:office:office" xmlns:r="http://schemas.openxmlformats.org/officeDocument/2006/relationships" xmlns:m="http://schemas.openxmlformats.org/officeDocument/2006/math" xmlns:v="urn:schemas-microsoft-com:vml" xmlns:wp14="http://schemas.microsoft.com/office/word/2010/wordprocessingDrawing" xmlns:wp="http://schemas.openxmlformats.org/drawingml/2006/wordprocessingDrawing" xmlns:w10="urn:schemas-microsoft-com:office:word" xmlns:w="http://schemas.openxmlformats.org/wordprocessingml/2006/main" xmlns:w14="http://schemas.microsoft.com/office/word/2010/wordml" xmlns:w15="http://schemas.microsoft.com/office/word/2012/wordml" xmlns:w16se="http://schemas.microsoft.com/office/word/2015/wordml/symex" xmlns:wpg="http://schemas.microsoft.com/office/word/2010/wordprocessingGroup" xmlns:wpi="http://schemas.microsoft.com/office/word/2010/wordprocessingInk" xmlns:wne="http://schemas.microsoft.com/office/word/2006/wordml" xmlns:wps="http://schemas.microsoft.com/office/word/2010/wordprocessingShape" mc:Ignorable="w14 w15 w16se wp14">
+  <w15:person w15:author="linsuqiang">
+    <w15:presenceInfo w15:providerId="None" w15:userId="linsuqiang"/>
+  </w15:person>
+</w15:people>
 </file>
 
 <file path=word/styles.xml><?xml version="1.0" encoding="utf-8"?>
@@ -20481,7 +20439,7 @@
 </file>
 
 <file path=customXml/itemProps1.xml><?xml version="1.0" encoding="utf-8"?>
-<ds:datastoreItem xmlns:ds="http://schemas.openxmlformats.org/officeDocument/2006/customXml" ds:itemID="{198BB01E-4F2C-491A-AA86-3B3F6BDD95B0}">
+<ds:datastoreItem xmlns:ds="http://schemas.openxmlformats.org/officeDocument/2006/customXml" ds:itemID="{64B9F81E-4F72-43EC-9C94-0C20ED897AF4}">
   <ds:schemaRefs>
     <ds:schemaRef ds:uri="http://schemas.openxmlformats.org/officeDocument/2006/bibliography"/>
   </ds:schemaRefs>

</xml_diff>

<commit_message>
更新 Story-mysql支持ALTER TABLE.docx 的索引部分
git-svn-id: http://192.168.20.11/sequoiadb/trunk@39815 6121f079-4a18-41d3-8c30-8870a322f2c2
</commit_message>
<xml_diff>
--- a/internal_doc/03.开发设计/mysql/Story-mysql支持ALTER TABLE.docx
+++ b/internal_doc/03.开发设计/mysql/Story-mysql支持ALTER TABLE.docx
@@ -5479,13 +5479,10 @@
             <w:pPr>
               <w:pStyle w:val="aa"/>
               <w:ind w:left="0" w:firstLineChars="0" w:firstLine="0"/>
-            </w:pPr>
-            <w:r>
-              <w:rPr>
-                <w:rFonts w:hint="eastAsia"/>
-              </w:rPr>
-              <w:t>部分</w:t>
-            </w:r>
+              <w:rPr>
+                <w:rFonts w:hint="eastAsia"/>
+              </w:rPr>
+            </w:pPr>
             <w:r>
               <w:rPr>
                 <w:rFonts w:hint="eastAsia"/>
@@ -5499,10 +5496,16 @@
               <w:rPr>
                 <w:rFonts w:hint="eastAsia"/>
               </w:rPr>
-              <w:t>尝试建立</w:t>
-            </w:r>
-            <w:r>
-              <w:t>索引时使用</w:t>
+              <w:t>建立</w:t>
+            </w:r>
+            <w:r>
+              <w:t>索引时</w:t>
+            </w:r>
+            <w:r>
+              <w:rPr>
+                <w:rFonts w:hint="eastAsia"/>
+              </w:rPr>
+              <w:t>加</w:t>
             </w:r>
             <w:r>
               <w:rPr>
@@ -5517,52 +5520,16 @@
               <w:t>参数</w:t>
             </w:r>
             <w:r>
-              <w:t>控制</w:t>
-            </w:r>
-            <w:r>
-              <w:rPr>
-                <w:rFonts w:hint="eastAsia"/>
-              </w:rPr>
-              <w:t>主键</w:t>
-            </w:r>
-            <w:r>
-              <w:t>非空。</w:t>
-            </w:r>
-            <w:r>
-              <w:rPr>
-                <w:rFonts w:hint="eastAsia"/>
-              </w:rPr>
-              <w:t>要</w:t>
-            </w:r>
-            <w:r>
-              <w:t>注意分区表</w:t>
-            </w:r>
-            <w:r>
-              <w:rPr>
-                <w:rFonts w:hint="eastAsia"/>
-              </w:rPr>
-              <w:t>场景，</w:t>
-            </w:r>
-            <w:r>
-              <w:t>有分区</w:t>
-            </w:r>
-            <w:r>
-              <w:rPr>
-                <w:rFonts w:hint="eastAsia"/>
-              </w:rPr>
-              <w:t>键</w:t>
-            </w:r>
-            <w:r>
-              <w:t>时要特殊处理。待</w:t>
-            </w:r>
-            <w:r>
-              <w:rPr>
-                <w:rFonts w:hint="eastAsia"/>
-              </w:rPr>
-              <w:t>子任务</w:t>
-            </w:r>
-            <w:r>
-              <w:t>中具体分析。</w:t>
+              <w:rPr>
+                <w:rFonts w:hint="eastAsia"/>
+              </w:rPr>
+              <w:t>。</w:t>
+            </w:r>
+            <w:r>
+              <w:rPr>
+                <w:rFonts w:hint="eastAsia"/>
+              </w:rPr>
+              <w:t xml:space="preserve"> </w:t>
             </w:r>
           </w:p>
         </w:tc>
@@ -5844,11 +5811,7 @@
               <w:t>删除</w:t>
             </w:r>
             <w:r>
-              <w:t>主键并添加新</w:t>
-            </w:r>
-            <w:r>
-              <w:lastRenderedPageBreak/>
-              <w:t>主键</w:t>
+              <w:t>主键并添加新主键</w:t>
             </w:r>
           </w:p>
         </w:tc>
@@ -5866,7 +5829,6 @@
               <w:rPr>
                 <w:rFonts w:hint="eastAsia"/>
               </w:rPr>
-              <w:lastRenderedPageBreak/>
               <w:t>Yes</w:t>
             </w:r>
           </w:p>
@@ -5933,14 +5895,7 @@
               <w:rPr>
                 <w:color w:val="0070C0"/>
               </w:rPr>
-              <w:t xml:space="preserve">DROP PRIMARY KEY, ADD PRIMARY </w:t>
-            </w:r>
-            <w:r>
-              <w:rPr>
-                <w:color w:val="0070C0"/>
-              </w:rPr>
-              <w:lastRenderedPageBreak/>
-              <w:t>KEY</w:t>
+              <w:t>DROP PRIMARY KEY, ADD PRIMARY KEY</w:t>
             </w:r>
             <w:r>
               <w:t>( col_name</w:t>
@@ -6053,37 +6008,7 @@
               <w:rPr>
                 <w:rFonts w:hint="eastAsia"/>
               </w:rPr>
-              <w:t>部分</w:t>
-            </w:r>
-            <w:r>
-              <w:t>支持</w:t>
-            </w:r>
-            <w:r>
-              <w:rPr>
-                <w:rFonts w:hint="eastAsia"/>
-              </w:rPr>
-              <w:t>。</w:t>
-            </w:r>
-            <w:r>
-              <w:t>普通</w:t>
-            </w:r>
-            <w:r>
-              <w:rPr>
-                <w:rFonts w:hint="eastAsia"/>
-              </w:rPr>
-              <w:t>表</w:t>
-            </w:r>
-            <w:r>
-              <w:t>支持。分区表</w:t>
-            </w:r>
-            <w:r>
-              <w:rPr>
-                <w:rFonts w:hint="eastAsia"/>
-              </w:rPr>
-              <w:t>待</w:t>
-            </w:r>
-            <w:r>
-              <w:t>分析。</w:t>
+              <w:t>支持。</w:t>
             </w:r>
           </w:p>
         </w:tc>
@@ -6209,7 +6134,14 @@
               <w:rPr>
                 <w:color w:val="0070C0"/>
               </w:rPr>
-              <w:t>ADD [UNIQUE] INDEX</w:t>
+              <w:t xml:space="preserve">ADD </w:t>
+            </w:r>
+            <w:r>
+              <w:rPr>
+                <w:color w:val="0070C0"/>
+              </w:rPr>
+              <w:lastRenderedPageBreak/>
+              <w:t>[UNIQUE] INDEX</w:t>
             </w:r>
             <w:r>
               <w:t xml:space="preserve"> idx_name( col_name );</w:t>
@@ -6776,12 +6708,24 @@
             <w:pPr>
               <w:pStyle w:val="aa"/>
               <w:ind w:left="0" w:firstLineChars="0" w:firstLine="0"/>
+              <w:rPr>
+                <w:rFonts w:hint="eastAsia"/>
+              </w:rPr>
             </w:pPr>
             <w:r>
               <w:rPr>
                 <w:rFonts w:hint="eastAsia"/>
               </w:rPr>
               <w:t>不支持</w:t>
+            </w:r>
+            <w:r>
+              <w:rPr>
+                <w:rFonts w:hint="eastAsia"/>
+              </w:rPr>
+              <w:t>，</w:t>
+            </w:r>
+            <w:r>
+              <w:t>报错</w:t>
             </w:r>
           </w:p>
         </w:tc>
@@ -6996,12 +6940,24 @@
             <w:pPr>
               <w:pStyle w:val="aa"/>
               <w:ind w:left="0" w:firstLineChars="0" w:firstLine="0"/>
+              <w:rPr>
+                <w:rFonts w:hint="eastAsia"/>
+              </w:rPr>
             </w:pPr>
             <w:r>
               <w:rPr>
                 <w:rFonts w:hint="eastAsia"/>
               </w:rPr>
               <w:t>不支持</w:t>
+            </w:r>
+            <w:r>
+              <w:rPr>
+                <w:rFonts w:hint="eastAsia"/>
+              </w:rPr>
+              <w:t>，</w:t>
+            </w:r>
+            <w:r>
+              <w:t>报错</w:t>
             </w:r>
           </w:p>
         </w:tc>
@@ -7204,12 +7160,24 @@
             <w:pPr>
               <w:pStyle w:val="aa"/>
               <w:ind w:left="0" w:firstLineChars="0" w:firstLine="0"/>
+              <w:rPr>
+                <w:rFonts w:hint="eastAsia"/>
+              </w:rPr>
             </w:pPr>
             <w:r>
               <w:rPr>
                 <w:rFonts w:hint="eastAsia"/>
               </w:rPr>
               <w:t>不支持</w:t>
+            </w:r>
+            <w:r>
+              <w:rPr>
+                <w:rFonts w:hint="eastAsia"/>
+              </w:rPr>
+              <w:t>，</w:t>
+            </w:r>
+            <w:r>
+              <w:t>报错</w:t>
             </w:r>
           </w:p>
         </w:tc>
@@ -7484,18 +7452,18 @@
             <w:pPr>
               <w:pStyle w:val="aa"/>
               <w:ind w:left="0" w:firstLineChars="0" w:firstLine="0"/>
-            </w:pPr>
-            <w:r>
-              <w:t>不</w:t>
-            </w:r>
-            <w:r>
-              <w:rPr>
-                <w:rFonts w:hint="eastAsia"/>
-              </w:rPr>
-              <w:t>支持</w:t>
-            </w:r>
-            <w:r>
-              <w:t>修改</w:t>
+              <w:rPr>
+                <w:rFonts w:hint="eastAsia"/>
+              </w:rPr>
+            </w:pPr>
+            <w:r>
+              <w:t>只支持</w:t>
+            </w:r>
+            <w:r>
+              <w:rPr>
+                <w:rFonts w:hint="eastAsia"/>
+              </w:rPr>
+              <w:t>BTREE</w:t>
             </w:r>
             <w:r>
               <w:rPr>
@@ -7504,19 +7472,31 @@
               <w:t>。</w:t>
             </w:r>
             <w:r>
-              <w:t>只支持</w:t>
-            </w:r>
-            <w:r>
-              <w:rPr>
-                <w:rFonts w:hint="eastAsia"/>
-              </w:rPr>
-              <w:t>BTREE</w:t>
-            </w:r>
-            <w:r>
-              <w:rPr>
-                <w:rFonts w:hint="eastAsia"/>
-              </w:rPr>
-              <w:t>。</w:t>
+              <w:rPr>
+                <w:rFonts w:hint="eastAsia"/>
+              </w:rPr>
+              <w:t>但是</w:t>
+            </w:r>
+            <w:r>
+              <w:t>使用时并不报错。与</w:t>
+            </w:r>
+            <w:r>
+              <w:rPr>
+                <w:rFonts w:hint="eastAsia"/>
+              </w:rPr>
+              <w:t>其它</w:t>
+            </w:r>
+            <w:r>
+              <w:t>引擎</w:t>
+            </w:r>
+            <w:r>
+              <w:rPr>
+                <w:rFonts w:hint="eastAsia"/>
+              </w:rPr>
+              <w:t>处理</w:t>
+            </w:r>
+            <w:r>
+              <w:t>一致。</w:t>
             </w:r>
           </w:p>
         </w:tc>
@@ -7701,57 +7681,148 @@
         <w:pStyle w:val="aa"/>
         <w:numPr>
           <w:ilvl w:val="0"/>
+          <w:numId w:val="12"/>
+        </w:numPr>
+        <w:ind w:firstLineChars="0"/>
+      </w:pPr>
+      <w:r>
+        <w:rPr>
+          <w:rFonts w:hint="eastAsia"/>
+        </w:rPr>
+        <w:t>如果主键</w:t>
+      </w:r>
+      <w:r>
+        <w:t>/</w:t>
+      </w:r>
+      <w:r>
+        <w:rPr>
+          <w:rFonts w:hint="eastAsia"/>
+        </w:rPr>
+        <w:t>唯一</w:t>
+      </w:r>
+      <w:r>
+        <w:t>索引没有包含分区键，直接报错</w:t>
+      </w:r>
+      <w:r>
+        <w:rPr>
+          <w:rFonts w:hint="eastAsia"/>
+        </w:rPr>
+        <w:t>，</w:t>
+      </w:r>
+      <w:r>
+        <w:t>不考虑自动添加分区键</w:t>
+      </w:r>
+      <w:r>
+        <w:rPr>
+          <w:rFonts w:hint="eastAsia"/>
+        </w:rPr>
+        <w:t>。</w:t>
+      </w:r>
+    </w:p>
+    <w:p>
+      <w:pPr>
+        <w:pStyle w:val="aa"/>
+        <w:numPr>
+          <w:ilvl w:val="0"/>
           <w:numId w:val="8"/>
         </w:numPr>
         <w:ind w:firstLineChars="0"/>
+        <w:rPr>
+          <w:rFonts w:hint="eastAsia"/>
+        </w:rPr>
       </w:pPr>
       <w:r>
         <w:rPr>
           <w:rFonts w:hint="eastAsia"/>
         </w:rPr>
-        <w:t>子任务中</w:t>
-      </w:r>
-      <w:r>
-        <w:t>需分析</w:t>
-      </w:r>
-      <w:r>
-        <w:rPr>
-          <w:rFonts w:hint="eastAsia"/>
-        </w:rPr>
-        <w:t>，</w:t>
-      </w:r>
-      <w:r>
-        <w:t>是否</w:t>
-      </w:r>
-      <w:r>
-        <w:rPr>
-          <w:rFonts w:hint="eastAsia"/>
-        </w:rPr>
-        <w:t>在</w:t>
-      </w:r>
-      <w:r>
-        <w:t>没有主键和唯一键时</w:t>
-      </w:r>
-      <w:r>
-        <w:rPr>
-          <w:rFonts w:hint="eastAsia"/>
-        </w:rPr>
-        <w:t>，</w:t>
-      </w:r>
-      <w:r>
-        <w:t>把第一个字段作</w:t>
-      </w:r>
-      <w:r>
-        <w:t>S</w:t>
-      </w:r>
-      <w:r>
-        <w:t>hardingKey</w:t>
-      </w:r>
-      <w:r>
-        <w:rPr>
-          <w:rFonts w:hint="eastAsia"/>
-        </w:rPr>
-        <w:t>。</w:t>
+        <w:t>如果</w:t>
+      </w:r>
+      <w:r>
+        <w:t>启动了自动分区</w:t>
+      </w:r>
+      <w:r>
+        <w:rPr>
+          <w:rFonts w:hint="eastAsia"/>
+        </w:rPr>
+        <w:t>，建</w:t>
+      </w:r>
+      <w:r>
+        <w:t>表时</w:t>
+      </w:r>
+      <w:r>
+        <w:rPr>
+          <w:rFonts w:hint="eastAsia"/>
+        </w:rPr>
+        <w:t>使用</w:t>
+      </w:r>
+      <w:r>
+        <w:t>了主键</w:t>
+      </w:r>
+      <w:r>
+        <w:t>/</w:t>
+      </w:r>
+      <w:r>
+        <w:rPr>
+          <w:rFonts w:hint="eastAsia"/>
+        </w:rPr>
+        <w:t>唯一</w:t>
+      </w:r>
+      <w:r>
+        <w:t>索引，</w:t>
+      </w:r>
+      <w:r>
+        <w:rPr>
+          <w:rFonts w:hint="eastAsia"/>
+        </w:rPr>
+        <w:t>则</w:t>
+      </w:r>
+      <w:r>
+        <w:t>会把主键</w:t>
+      </w:r>
+      <w:r>
+        <w:t>/</w:t>
+      </w:r>
+      <w:r>
+        <w:rPr>
+          <w:rFonts w:hint="eastAsia"/>
+        </w:rPr>
+        <w:t>唯一</w:t>
+      </w:r>
+      <w:r>
+        <w:t>索引字段作分区键。</w:t>
+      </w:r>
+      <w:r>
+        <w:t>只有建表时，才会</w:t>
+      </w:r>
+      <w:r>
+        <w:rPr>
+          <w:rFonts w:hint="eastAsia"/>
+        </w:rPr>
+        <w:t>处理</w:t>
+      </w:r>
+      <w:r>
+        <w:t>分区键，</w:t>
+      </w:r>
+      <w:r>
+        <w:t>之后</w:t>
+      </w:r>
+      <w:r>
+        <w:rPr>
+          <w:rFonts w:hint="eastAsia"/>
+        </w:rPr>
+        <w:t xml:space="preserve"> </w:t>
+      </w:r>
+      <w:r>
+        <w:t xml:space="preserve">alter </w:t>
+      </w:r>
+      <w:r>
+        <w:rPr>
+          <w:rFonts w:hint="eastAsia"/>
+        </w:rPr>
+        <w:t>操作</w:t>
+      </w:r>
+      <w:r>
+        <w:t>只修改索引，不修改分区键。</w:t>
       </w:r>
     </w:p>
     <w:p>
@@ -7770,40 +7841,293 @@
         <w:t>如果</w:t>
       </w:r>
       <w:r>
-        <w:t>唯一索引没有添加分区键，</w:t>
-      </w:r>
-      <w:r>
-        <w:rPr>
-          <w:rFonts w:hint="eastAsia"/>
-        </w:rPr>
-        <w:t>不要</w:t>
-      </w:r>
-      <w:r>
-        <w:rPr>
-          <w:rFonts w:hint="eastAsia"/>
-        </w:rPr>
-        <w:t>自动</w:t>
-      </w:r>
-      <w:r>
+        <w:t>启动了自动分区，</w:t>
+      </w:r>
+      <w:r>
+        <w:rPr>
+          <w:rFonts w:hint="eastAsia"/>
+        </w:rPr>
+        <w:t>建表</w:t>
+      </w:r>
+      <w:r>
+        <w:t>时没有</w:t>
+      </w:r>
+      <w:r>
+        <w:rPr>
+          <w:rFonts w:hint="eastAsia"/>
+        </w:rPr>
+        <w:t>主键</w:t>
+      </w:r>
+      <w:r>
+        <w:rPr>
+          <w:rFonts w:hint="eastAsia"/>
+        </w:rPr>
+        <w:t>/</w:t>
+      </w:r>
+      <w:r>
+        <w:rPr>
+          <w:rFonts w:hint="eastAsia"/>
+        </w:rPr>
+        <w:t>唯一</w:t>
+      </w:r>
+      <w:r>
+        <w:t>索引，则</w:t>
+      </w:r>
+      <w:r>
+        <w:rPr>
+          <w:rFonts w:hint="eastAsia"/>
+        </w:rPr>
+        <w:t>只</w:t>
+      </w:r>
+      <w:r>
+        <w:t>建立普通表。之后</w:t>
+      </w:r>
+      <w:r>
+        <w:rPr>
+          <w:rFonts w:hint="eastAsia"/>
+        </w:rPr>
+        <w:t>即使</w:t>
+      </w:r>
+      <w:r>
+        <w:rPr>
+          <w:rFonts w:hint="eastAsia"/>
+        </w:rPr>
+        <w:t xml:space="preserve"> </w:t>
+      </w:r>
+      <w:r>
+        <w:t xml:space="preserve">alter </w:t>
+      </w:r>
+      <w:r>
+        <w:rPr>
+          <w:rFonts w:hint="eastAsia"/>
+        </w:rPr>
         <w:t>添加</w:t>
       </w:r>
       <w:r>
+        <w:t>了主键</w:t>
+      </w:r>
+      <w:r>
+        <w:t>/</w:t>
+      </w:r>
+      <w:r>
+        <w:rPr>
+          <w:rFonts w:hint="eastAsia"/>
+        </w:rPr>
+        <w:t>唯一</w:t>
+      </w:r>
+      <w:r>
+        <w:t>索引，也不会</w:t>
+      </w:r>
+      <w:r>
+        <w:rPr>
+          <w:rFonts w:hint="eastAsia"/>
+        </w:rPr>
+        <w:t>再</w:t>
+      </w:r>
+      <w:r>
+        <w:rPr>
+          <w:rFonts w:hint="eastAsia"/>
+        </w:rPr>
+        <w:t>有</w:t>
+      </w:r>
+      <w:r>
+        <w:t>分区键。</w:t>
+      </w:r>
+      <w:r>
+        <w:rPr>
+          <w:rFonts w:hint="eastAsia"/>
+        </w:rPr>
+        <w:t>需</w:t>
+      </w:r>
+      <w:r>
+        <w:rPr>
+          <w:rFonts w:hint="eastAsia"/>
+        </w:rPr>
+        <w:t>sdb shell</w:t>
+      </w:r>
+      <w:r>
+        <w:rPr>
+          <w:rFonts w:hint="eastAsia"/>
+        </w:rPr>
+        <w:t>中进行</w:t>
+      </w:r>
+      <w:r>
+        <w:t>修改。</w:t>
+      </w:r>
+    </w:p>
+    <w:p>
+      <w:pPr>
+        <w:pStyle w:val="aa"/>
+        <w:numPr>
+          <w:ilvl w:val="0"/>
+          <w:numId w:val="8"/>
+        </w:numPr>
+        <w:ind w:firstLineChars="0"/>
+      </w:pPr>
+      <w:r>
+        <w:rPr>
+          <w:rFonts w:hint="eastAsia"/>
+        </w:rPr>
+        <w:t>重命名</w:t>
+      </w:r>
+      <w:r>
+        <w:t>索引只有在</w:t>
+      </w:r>
+      <w:r>
+        <w:rPr>
+          <w:rFonts w:hint="eastAsia"/>
+        </w:rPr>
+        <w:t>算法为</w:t>
+      </w:r>
+      <w:r>
+        <w:t xml:space="preserve"> DEFAULT </w:t>
+      </w:r>
+      <w:r>
+        <w:rPr>
+          <w:rFonts w:hint="eastAsia"/>
+        </w:rPr>
+        <w:t>或指定</w:t>
+      </w:r>
+      <w:r>
+        <w:rPr>
+          <w:rFonts w:hint="eastAsia"/>
+        </w:rPr>
+        <w:t xml:space="preserve"> INPLACE </w:t>
+      </w:r>
+      <w:r>
+        <w:rPr>
+          <w:rFonts w:hint="eastAsia"/>
+        </w:rPr>
+        <w:t>时</w:t>
+      </w:r>
+      <w:r>
+        <w:t>，能合理报错。如</w:t>
+      </w:r>
+      <w:r>
+        <w:rPr>
+          <w:rFonts w:hint="eastAsia"/>
+        </w:rPr>
+        <w:t>指定</w:t>
+      </w:r>
+      <w:r>
+        <w:rPr>
+          <w:rFonts w:hint="eastAsia"/>
+        </w:rPr>
+        <w:t xml:space="preserve"> COPY</w:t>
+      </w:r>
+      <w:r>
         <w:rPr>
           <w:rFonts w:hint="eastAsia"/>
         </w:rPr>
         <w:t>，</w:t>
       </w:r>
       <w:r>
-        <w:t>应</w:t>
-      </w:r>
-      <w:r>
-        <w:rPr>
-          <w:rFonts w:hint="eastAsia"/>
-        </w:rPr>
-        <w:t>合理</w:t>
-      </w:r>
-      <w:r>
-        <w:t>报错。</w:t>
+        <w:t>重命名会成功。</w:t>
+      </w:r>
+      <w:r>
+        <w:rPr>
+          <w:rFonts w:hint="eastAsia"/>
+        </w:rPr>
+        <w:t>存储</w:t>
+      </w:r>
+      <w:r>
+        <w:t>引擎不能限制</w:t>
+      </w:r>
+      <w:r>
+        <w:t xml:space="preserve"> SQL </w:t>
+      </w:r>
+      <w:r>
+        <w:rPr>
+          <w:rFonts w:hint="eastAsia"/>
+        </w:rPr>
+        <w:t>层使用</w:t>
+      </w:r>
+      <w:r>
+        <w:rPr>
+          <w:rFonts w:hint="eastAsia"/>
+        </w:rPr>
+        <w:t xml:space="preserve"> COPY </w:t>
+      </w:r>
+      <w:r>
+        <w:rPr>
+          <w:rFonts w:hint="eastAsia"/>
+        </w:rPr>
+        <w:t>算法</w:t>
+      </w:r>
+      <w:r>
+        <w:t>。</w:t>
+      </w:r>
+    </w:p>
+    <w:p>
+      <w:pPr>
+        <w:pStyle w:val="aa"/>
+        <w:numPr>
+          <w:ilvl w:val="0"/>
+          <w:numId w:val="8"/>
+        </w:numPr>
+        <w:ind w:firstLineChars="0"/>
+      </w:pPr>
+      <w:r>
+        <w:rPr>
+          <w:rFonts w:hint="eastAsia"/>
+        </w:rPr>
+        <w:t>新增</w:t>
+      </w:r>
+      <w:r>
+        <w:t>主键时未检查列中是否有</w:t>
+      </w:r>
+      <w:r>
+        <w:rPr>
+          <w:rFonts w:hint="eastAsia"/>
+        </w:rPr>
+        <w:t xml:space="preserve"> NULL </w:t>
+      </w:r>
+      <w:r>
+        <w:rPr>
+          <w:rFonts w:hint="eastAsia"/>
+        </w:rPr>
+        <w:t>值，具体已</w:t>
+      </w:r>
+      <w:r>
+        <w:t>在</w:t>
+      </w:r>
+      <w:r>
+        <w:rPr>
+          <w:rFonts w:hint="eastAsia"/>
+        </w:rPr>
+        <w:t xml:space="preserve"> </w:t>
+      </w:r>
+      <w:r>
+        <w:rPr>
+          <w:rFonts w:hint="eastAsia"/>
+          <w:b/>
+        </w:rPr>
+        <w:t>八</w:t>
+      </w:r>
+      <w:r>
+        <w:rPr>
+          <w:b/>
+        </w:rPr>
+        <w:t>、遗留问题</w:t>
+      </w:r>
+      <w:r>
+        <w:rPr>
+          <w:rFonts w:hint="eastAsia"/>
+          <w:b/>
+        </w:rPr>
+        <w:t xml:space="preserve"> </w:t>
+      </w:r>
+      <w:r>
+        <w:rPr>
+          <w:rFonts w:hint="eastAsia"/>
+        </w:rPr>
+        <w:t>中登记</w:t>
+      </w:r>
+      <w:r>
+        <w:rPr>
+          <w:b/>
+        </w:rPr>
+        <w:t>。</w:t>
       </w:r>
     </w:p>
     <w:p>
@@ -7815,6 +8139,9 @@
     <w:p>
       <w:pPr>
         <w:pStyle w:val="3"/>
+        <w:rPr>
+          <w:rFonts w:hint="eastAsia"/>
+        </w:rPr>
       </w:pPr>
       <w:r>
         <w:rPr>
@@ -7825,12 +8152,6 @@
       <w:r>
         <w:t>操作</w:t>
       </w:r>
-    </w:p>
-    <w:p>
-      <w:pPr>
-        <w:pStyle w:val="aa"/>
-        <w:ind w:left="360" w:firstLineChars="0" w:firstLine="0"/>
-      </w:pPr>
     </w:p>
     <w:tbl>
       <w:tblPr>
@@ -7985,6 +8306,7 @@
               <w:rPr>
                 <w:rFonts w:hint="eastAsia"/>
               </w:rPr>
+              <w:lastRenderedPageBreak/>
               <w:t>添加列</w:t>
             </w:r>
           </w:p>
@@ -8093,7 +8415,6 @@
               <w:ind w:left="0" w:firstLineChars="0" w:firstLine="0"/>
             </w:pPr>
             <w:r>
-              <w:lastRenderedPageBreak/>
               <w:t>[</w:t>
             </w:r>
             <w:r>
@@ -8353,30 +8674,33 @@
             <w:pPr>
               <w:pStyle w:val="aa"/>
               <w:ind w:left="0" w:firstLineChars="0" w:firstLine="0"/>
-            </w:pPr>
-            <w:r>
-              <w:rPr>
-                <w:rFonts w:hint="eastAsia"/>
-              </w:rPr>
-              <w:t>如果</w:t>
-            </w:r>
-            <w:r>
-              <w:t>列无默认值，</w:t>
-            </w:r>
-            <w:r>
-              <w:rPr>
-                <w:rFonts w:hint="eastAsia"/>
-              </w:rPr>
-              <w:t>且</w:t>
-            </w:r>
-            <w:r>
-              <w:t>允许空，</w:t>
-            </w:r>
-            <w:r>
-              <w:rPr>
-                <w:rFonts w:hint="eastAsia"/>
-              </w:rPr>
-              <w:t>无需</w:t>
+              <w:rPr>
+                <w:rFonts w:hint="eastAsia"/>
+              </w:rPr>
+            </w:pPr>
+            <w:r>
+              <w:rPr>
+                <w:rFonts w:hint="eastAsia"/>
+              </w:rPr>
+              <w:t>NOT NULL | NULL</w:t>
+            </w:r>
+            <w:r>
+              <w:rPr>
+                <w:rFonts w:hint="eastAsia"/>
+              </w:rPr>
+              <w:t>：</w:t>
+            </w:r>
+            <w:r>
+              <w:rPr>
+                <w:rFonts w:hint="eastAsia"/>
+              </w:rPr>
+              <w:t>NULL</w:t>
+            </w:r>
+            <w:r>
+              <w:rPr>
+                <w:rFonts w:hint="eastAsia"/>
+              </w:rPr>
+              <w:t>时无需</w:t>
             </w:r>
             <w:r>
               <w:t>操作</w:t>
@@ -8385,6 +8709,102 @@
               <w:rPr>
                 <w:rFonts w:hint="eastAsia"/>
               </w:rPr>
+              <w:t>，</w:t>
+            </w:r>
+            <w:r>
+              <w:rPr>
+                <w:rFonts w:hint="eastAsia"/>
+              </w:rPr>
+              <w:t>NOT NULL</w:t>
+            </w:r>
+            <w:r>
+              <w:rPr>
+                <w:rFonts w:hint="eastAsia"/>
+              </w:rPr>
+              <w:t>时</w:t>
+            </w:r>
+            <w:r>
+              <w:t>不存储，在查询时</w:t>
+            </w:r>
+            <w:r>
+              <w:rPr>
+                <w:rFonts w:hint="eastAsia"/>
+              </w:rPr>
+              <w:t>置</w:t>
+            </w:r>
+            <w:r>
+              <w:rPr>
+                <w:rFonts w:hint="eastAsia"/>
+              </w:rPr>
+              <w:t>0</w:t>
+            </w:r>
+            <w:r>
+              <w:rPr>
+                <w:rFonts w:hint="eastAsia"/>
+              </w:rPr>
+              <w:t>值，</w:t>
+            </w:r>
+            <w:r>
+              <w:t>字符串则置空串</w:t>
+            </w:r>
+            <w:r>
+              <w:t>…</w:t>
+            </w:r>
+          </w:p>
+          <w:p>
+            <w:pPr>
+              <w:pStyle w:val="aa"/>
+              <w:ind w:left="0" w:firstLineChars="0" w:firstLine="0"/>
+              <w:rPr>
+                <w:rFonts w:hint="eastAsia"/>
+              </w:rPr>
+            </w:pPr>
+            <w:r>
+              <w:rPr>
+                <w:rFonts w:hint="eastAsia"/>
+              </w:rPr>
+              <w:t>DEFAULT</w:t>
+            </w:r>
+            <w:r>
+              <w:rPr>
+                <w:rFonts w:hint="eastAsia"/>
+              </w:rPr>
+              <w:t>：</w:t>
+            </w:r>
+            <w:r>
+              <w:rPr>
+                <w:rFonts w:hint="eastAsia"/>
+              </w:rPr>
+              <w:t>不</w:t>
+            </w:r>
+            <w:r>
+              <w:t>存储，查询时</w:t>
+            </w:r>
+            <w:r>
+              <w:rPr>
+                <w:rFonts w:hint="eastAsia"/>
+              </w:rPr>
+              <w:t>将</w:t>
+            </w:r>
+            <w:r>
+              <w:rPr>
+                <w:rFonts w:hint="eastAsia"/>
+              </w:rPr>
+              <w:t>NULL</w:t>
+            </w:r>
+            <w:r>
+              <w:rPr>
+                <w:rFonts w:hint="eastAsia"/>
+              </w:rPr>
+              <w:t>置</w:t>
+            </w:r>
+            <w:r>
+              <w:t>默认值</w:t>
+            </w:r>
+            <w:r>
+              <w:rPr>
+                <w:rFonts w:hint="eastAsia"/>
+              </w:rPr>
               <w:t>。</w:t>
             </w:r>
           </w:p>
@@ -8394,57 +8814,167 @@
               <w:ind w:left="0" w:firstLineChars="0" w:firstLine="0"/>
             </w:pPr>
             <w:r>
-              <w:t>如果列</w:t>
-            </w:r>
-            <w:r>
-              <w:rPr>
-                <w:rFonts w:hint="eastAsia"/>
-              </w:rPr>
-              <w:t>是</w:t>
-            </w:r>
-            <w:r>
-              <w:t>带默认值的，</w:t>
-            </w:r>
-            <w:r>
-              <w:rPr>
-                <w:rFonts w:hint="eastAsia"/>
-              </w:rPr>
-              <w:t>考虑在</w:t>
-            </w:r>
-            <w:r>
-              <w:rPr>
-                <w:rFonts w:hint="eastAsia"/>
-              </w:rPr>
-              <w:t>SDB</w:t>
-            </w:r>
-            <w:r>
-              <w:rPr>
-                <w:rFonts w:hint="eastAsia"/>
-              </w:rPr>
-              <w:t>不</w:t>
-            </w:r>
-            <w:r>
-              <w:t>存储，在</w:t>
-            </w:r>
-            <w:r>
-              <w:rPr>
-                <w:rFonts w:hint="eastAsia"/>
-              </w:rPr>
-              <w:t>查询</w:t>
-            </w:r>
-            <w:r>
-              <w:t>时才</w:t>
-            </w:r>
-            <w:r>
-              <w:rPr>
-                <w:rFonts w:hint="eastAsia"/>
-              </w:rPr>
-              <w:t>置</w:t>
-            </w:r>
-            <w:r>
-              <w:t>为默认值</w:t>
-            </w:r>
-            <w:r>
+              <w:rPr>
+                <w:rFonts w:hint="eastAsia"/>
+              </w:rPr>
+              <w:t>AUTO_INC</w:t>
+            </w:r>
+            <w:bookmarkStart w:id="0" w:name="_GoBack"/>
+            <w:bookmarkEnd w:id="0"/>
+            <w:r>
+              <w:rPr>
+                <w:rFonts w:hint="eastAsia"/>
+              </w:rPr>
+              <w:t>REMENT</w:t>
+            </w:r>
+            <w:r>
+              <w:rPr>
+                <w:rFonts w:hint="eastAsia"/>
+              </w:rPr>
+              <w:t>：支持</w:t>
+            </w:r>
+            <w:r>
+              <w:t>，已实现</w:t>
+            </w:r>
+          </w:p>
+          <w:p>
+            <w:pPr>
+              <w:pStyle w:val="aa"/>
+              <w:ind w:left="0" w:firstLineChars="0" w:firstLine="0"/>
+            </w:pPr>
+            <w:r>
+              <w:rPr>
+                <w:rFonts w:hint="eastAsia"/>
+              </w:rPr>
+              <w:t>UNIQUE [KEY]</w:t>
+            </w:r>
+            <w:r>
+              <w:rPr>
+                <w:rFonts w:hint="eastAsia"/>
+              </w:rPr>
+              <w:t>，</w:t>
+            </w:r>
+            <w:r>
+              <w:rPr>
+                <w:rFonts w:hint="eastAsia"/>
+              </w:rPr>
+              <w:t xml:space="preserve">[PRIMARY] </w:t>
+            </w:r>
+            <w:r>
+              <w:t>KEY</w:t>
+            </w:r>
+            <w:r>
+              <w:rPr>
+                <w:rFonts w:hint="eastAsia"/>
+              </w:rPr>
+              <w:t>：支持，</w:t>
+            </w:r>
+            <w:r>
+              <w:t>索引部分中实现</w:t>
+            </w:r>
+          </w:p>
+          <w:p>
+            <w:pPr>
+              <w:pStyle w:val="aa"/>
+              <w:ind w:left="0" w:firstLineChars="0" w:firstLine="0"/>
+            </w:pPr>
+            <w:r>
+              <w:rPr>
+                <w:rFonts w:hint="eastAsia"/>
+              </w:rPr>
+              <w:t>COMMENT</w:t>
+            </w:r>
+            <w:r>
+              <w:rPr>
+                <w:rFonts w:hint="eastAsia"/>
+              </w:rPr>
+              <w:t>，</w:t>
+            </w:r>
+            <w:r>
+              <w:rPr>
+                <w:rFonts w:hint="eastAsia"/>
+              </w:rPr>
+              <w:t>COLLATE</w:t>
+            </w:r>
+            <w:r>
+              <w:rPr>
+                <w:rFonts w:hint="eastAsia"/>
+              </w:rPr>
+              <w:t>：支持</w:t>
+            </w:r>
+            <w:r>
+              <w:t>，无需处理</w:t>
+            </w:r>
+          </w:p>
+          <w:p>
+            <w:pPr>
+              <w:pStyle w:val="aa"/>
+              <w:ind w:left="0" w:firstLineChars="0" w:firstLine="0"/>
+              <w:rPr>
+                <w:rFonts w:hint="eastAsia"/>
+              </w:rPr>
+            </w:pPr>
+            <w:r>
+              <w:rPr>
+                <w:rFonts w:hint="eastAsia"/>
+              </w:rPr>
+              <w:t>COLUMN_FORMAT</w:t>
+            </w:r>
+            <w:r>
+              <w:rPr>
+                <w:rFonts w:hint="eastAsia"/>
+              </w:rPr>
+              <w:t>，</w:t>
+            </w:r>
+            <w:r>
+              <w:rPr>
+                <w:rFonts w:hint="eastAsia"/>
+              </w:rPr>
+              <w:t>STORAGE</w:t>
+            </w:r>
+            <w:r>
+              <w:rPr>
+                <w:rFonts w:hint="eastAsia"/>
+              </w:rPr>
+              <w:t>，</w:t>
+            </w:r>
+            <w:r>
+              <w:rPr>
+                <w:rFonts w:hint="eastAsia"/>
+              </w:rPr>
+              <w:t>[</w:t>
+            </w:r>
+            <w:r>
+              <w:t>referenece_definition]</w:t>
+            </w:r>
+            <w:r>
+              <w:rPr>
+                <w:rFonts w:hint="eastAsia"/>
+              </w:rPr>
+              <w:t>：</w:t>
+            </w:r>
+            <w:r>
+              <w:rPr>
+                <w:rFonts w:hint="eastAsia"/>
+              </w:rPr>
+              <w:t>不支持，</w:t>
+            </w:r>
+            <w:r>
+              <w:t>使用时</w:t>
+            </w:r>
+            <w:r>
+              <w:rPr>
+                <w:rFonts w:hint="eastAsia"/>
+              </w:rPr>
+              <w:t>忽略</w:t>
+            </w:r>
+            <w:r>
+              <w:t>，不报错</w:t>
+            </w:r>
+            <w:r>
+              <w:rPr>
+                <w:rFonts w:hint="eastAsia"/>
+              </w:rPr>
               <w:t>。</w:t>
             </w:r>
           </w:p>
@@ -8452,72 +8982,30 @@
             <w:pPr>
               <w:pStyle w:val="aa"/>
               <w:ind w:left="0" w:firstLineChars="0" w:firstLine="0"/>
-            </w:pPr>
-            <w:r>
-              <w:rPr>
-                <w:rFonts w:hint="eastAsia"/>
-              </w:rPr>
-              <w:t>如果</w:t>
-            </w:r>
-            <w:r>
-              <w:t>列不允许为空，</w:t>
-            </w:r>
-            <w:r>
-              <w:rPr>
-                <w:rFonts w:hint="eastAsia"/>
-              </w:rPr>
-              <w:t>考虑</w:t>
-            </w:r>
-            <w:r>
-              <w:t>在</w:t>
-            </w:r>
-            <w:r>
-              <w:rPr>
-                <w:rFonts w:hint="eastAsia"/>
-              </w:rPr>
-              <w:t>SDB</w:t>
-            </w:r>
-            <w:r>
-              <w:rPr>
-                <w:rFonts w:hint="eastAsia"/>
-              </w:rPr>
-              <w:t>不存储</w:t>
-            </w:r>
-            <w:r>
-              <w:t>，查询时</w:t>
-            </w:r>
-            <w:r>
-              <w:t>数值</w:t>
-            </w:r>
-            <w:r>
-              <w:rPr>
-                <w:rFonts w:hint="eastAsia"/>
-              </w:rPr>
-              <w:t>型</w:t>
-            </w:r>
-            <w:r>
-              <w:t>置</w:t>
-            </w:r>
-            <w:r>
-              <w:t>0</w:t>
-            </w:r>
-            <w:r>
-              <w:rPr>
-                <w:rFonts w:hint="eastAsia"/>
-              </w:rPr>
-              <w:t>，字符串置</w:t>
-            </w:r>
-            <w:r>
-              <w:t>空</w:t>
-            </w:r>
-            <w:r>
-              <w:rPr>
-                <w:rFonts w:hint="eastAsia"/>
-              </w:rPr>
-              <w:t>串</w:t>
-            </w:r>
-            <w:r>
-              <w:t>…</w:t>
+              <w:rPr>
+                <w:rFonts w:hint="eastAsia"/>
+              </w:rPr>
+            </w:pPr>
+            <w:r>
+              <w:rPr>
+                <w:rFonts w:hint="eastAsia"/>
+              </w:rPr>
+              <w:t>FIRST | AFTER</w:t>
+            </w:r>
+            <w:r>
+              <w:rPr>
+                <w:rFonts w:hint="eastAsia"/>
+              </w:rPr>
+              <w:t>：</w:t>
+            </w:r>
+            <w:r>
+              <w:rPr>
+                <w:rFonts w:hint="eastAsia"/>
+              </w:rPr>
+              <w:t>支持</w:t>
+            </w:r>
+            <w:r>
+              <w:t>，无需操作</w:t>
             </w:r>
           </w:p>
         </w:tc>
@@ -9507,6 +9995,7 @@
               <w:rPr>
                 <w:rFonts w:hint="eastAsia"/>
               </w:rPr>
+              <w:lastRenderedPageBreak/>
               <w:t>更改</w:t>
             </w:r>
             <w:r>
@@ -10134,7 +10623,6 @@
               <w:rPr>
                 <w:rFonts w:hint="eastAsia"/>
               </w:rPr>
-              <w:lastRenderedPageBreak/>
               <w:t>删除</w:t>
             </w:r>
             <w:r>
@@ -10969,10 +11457,7 @@
               <w:t>下压</w:t>
             </w:r>
             <w:r>
-              <w:t>query</w:t>
-            </w:r>
-            <w:r>
-              <w:t xml:space="preserve"> one</w:t>
+              <w:t>count</w:t>
             </w:r>
             <w:r>
               <w:t>，判断该列是否有</w:t>
@@ -11407,6 +11892,7 @@
         <w:rPr>
           <w:rFonts w:hint="eastAsia"/>
         </w:rPr>
+        <w:lastRenderedPageBreak/>
         <w:t>自动</w:t>
       </w:r>
       <w:r>
@@ -11856,14 +12342,7 @@
               <w:rPr>
                 <w:rFonts w:hint="eastAsia"/>
               </w:rPr>
-              <w:t>列</w:t>
-            </w:r>
-            <w:r>
-              <w:rPr>
-                <w:rFonts w:hint="eastAsia"/>
-              </w:rPr>
-              <w:lastRenderedPageBreak/>
-              <w:t>的</w:t>
+              <w:t>列的</w:t>
             </w:r>
             <w:r>
               <w:t>顺序</w:t>
@@ -11884,7 +12363,6 @@
               <w:rPr>
                 <w:rFonts w:hint="eastAsia"/>
               </w:rPr>
-              <w:lastRenderedPageBreak/>
               <w:t>No</w:t>
             </w:r>
           </w:p>
@@ -11963,7 +12441,6 @@
               <w:rPr>
                 <w:rFonts w:hint="eastAsia"/>
               </w:rPr>
-              <w:lastRenderedPageBreak/>
               <w:t>修改</w:t>
             </w:r>
             <w:r>
@@ -13855,6 +14332,7 @@
         <w:rPr>
           <w:rFonts w:hint="eastAsia"/>
         </w:rPr>
+        <w:lastRenderedPageBreak/>
         <w:t>当添加或修改一个</w:t>
       </w:r>
       <w:r>
@@ -14037,7 +14515,6 @@
         <w:rPr>
           <w:rFonts w:hint="eastAsia"/>
         </w:rPr>
-        <w:lastRenderedPageBreak/>
         <w:t>表操作</w:t>
       </w:r>
     </w:p>
@@ -16093,7 +16570,14 @@
               <w:rPr>
                 <w:color w:val="0070C0"/>
               </w:rPr>
-              <w:t>OPTIMIZE [NO_WRITE_TO_BINLOG | LOCAL]</w:t>
+              <w:t xml:space="preserve">OPTIMIZE [NO_WRITE_TO_BINLOG | </w:t>
+            </w:r>
+            <w:r>
+              <w:rPr>
+                <w:color w:val="0070C0"/>
+              </w:rPr>
+              <w:lastRenderedPageBreak/>
+              <w:t>LOCAL]</w:t>
             </w:r>
             <w:r>
               <w:t xml:space="preserve"> TABLE tbl_name [, tbl_name] …</w:t>
@@ -16441,11 +16925,7 @@
         <w:t>不支持</w:t>
       </w:r>
       <w:r>
-        <w:t>的选项</w:t>
-      </w:r>
-      <w:r>
-        <w:lastRenderedPageBreak/>
-        <w:t>包括：</w:t>
+        <w:t>的选项包括：</w:t>
       </w:r>
       <w:r>
         <w:rPr>
@@ -16574,7 +17054,7 @@
       <w:r>
         <w:t>修改备注下压为修改对应的表属性，</w:t>
       </w:r>
-      <w:commentRangeStart w:id="0"/>
+      <w:commentRangeStart w:id="1"/>
       <w:r>
         <w:rPr>
           <w:rFonts w:hint="eastAsia"/>
@@ -16587,18 +17067,16 @@
         </w:rPr>
         <w:t>不做</w:t>
       </w:r>
-      <w:commentRangeEnd w:id="0"/>
+      <w:commentRangeEnd w:id="1"/>
       <w:r>
         <w:rPr>
           <w:rStyle w:val="ad"/>
         </w:rPr>
-        <w:commentReference w:id="0"/>
+        <w:commentReference w:id="1"/>
       </w:r>
       <w:r>
         <w:t>。</w:t>
       </w:r>
-      <w:bookmarkStart w:id="1" w:name="_GoBack"/>
-      <w:bookmarkEnd w:id="1"/>
     </w:p>
     <w:p>
       <w:pPr>
@@ -16615,6 +17093,11 @@
       </w:r>
     </w:p>
     <w:p>
+      <w:pPr>
+        <w:rPr>
+          <w:rFonts w:hint="eastAsia"/>
+        </w:rPr>
+      </w:pPr>
       <w:r>
         <w:rPr>
           <w:rFonts w:hint="eastAsia"/>
@@ -17261,6 +17744,7 @@
         <w:rPr>
           <w:rFonts w:hint="eastAsia"/>
         </w:rPr>
+        <w:lastRenderedPageBreak/>
         <w:t>遗留问题</w:t>
       </w:r>
     </w:p>
@@ -17286,8 +17770,8 @@
         <w:tblLook w:val="04A0" w:firstRow="1" w:lastRow="0" w:firstColumn="1" w:lastColumn="0" w:noHBand="0" w:noVBand="1"/>
       </w:tblPr>
       <w:tblGrid>
-        <w:gridCol w:w="870"/>
-        <w:gridCol w:w="2482"/>
+        <w:gridCol w:w="869"/>
+        <w:gridCol w:w="2483"/>
         <w:gridCol w:w="4587"/>
       </w:tblGrid>
       <w:tr>
@@ -17370,7 +17854,25 @@
           <w:p>
             <w:pPr>
               <w:ind w:left="0"/>
-            </w:pPr>
+              <w:rPr>
+                <w:rFonts w:hint="eastAsia"/>
+              </w:rPr>
+            </w:pPr>
+            <w:r>
+              <w:rPr>
+                <w:rFonts w:hint="eastAsia"/>
+              </w:rPr>
+              <w:t>新增</w:t>
+            </w:r>
+            <w:r>
+              <w:t>的主键可能有</w:t>
+            </w:r>
+            <w:r>
+              <w:rPr>
+                <w:rFonts w:hint="eastAsia"/>
+              </w:rPr>
+              <w:t>NULL</w:t>
+            </w:r>
           </w:p>
         </w:tc>
         <w:tc>
@@ -17380,7 +17882,172 @@
           <w:p>
             <w:pPr>
               <w:ind w:left="0"/>
-            </w:pPr>
+              <w:rPr>
+                <w:rFonts w:hint="eastAsia"/>
+              </w:rPr>
+            </w:pPr>
+            <w:r>
+              <w:rPr>
+                <w:rFonts w:hint="eastAsia"/>
+              </w:rPr>
+              <w:t>虽然建</w:t>
+            </w:r>
+            <w:r>
+              <w:t>唯一索引时加了</w:t>
+            </w:r>
+            <w:r>
+              <w:rPr>
+                <w:rFonts w:hint="eastAsia"/>
+              </w:rPr>
+              <w:t>enforce</w:t>
+            </w:r>
+            <w:r>
+              <w:rPr>
+                <w:rFonts w:hint="eastAsia"/>
+              </w:rPr>
+              <w:t>参数</w:t>
+            </w:r>
+            <w:r>
+              <w:t>，</w:t>
+            </w:r>
+            <w:r>
+              <w:rPr>
+                <w:rFonts w:hint="eastAsia"/>
+              </w:rPr>
+              <w:t>但</w:t>
+            </w:r>
+            <w:r>
+              <w:t>还是有可能有一个</w:t>
+            </w:r>
+            <w:r>
+              <w:rPr>
+                <w:rFonts w:hint="eastAsia"/>
+              </w:rPr>
+              <w:t>NULL</w:t>
+            </w:r>
+            <w:r>
+              <w:rPr>
+                <w:rFonts w:hint="eastAsia"/>
+              </w:rPr>
+              <w:t>值</w:t>
+            </w:r>
+            <w:r>
+              <w:t>的记录。</w:t>
+            </w:r>
+            <w:r>
+              <w:rPr>
+                <w:rFonts w:hint="eastAsia"/>
+              </w:rPr>
+              <w:t>查询</w:t>
+            </w:r>
+            <w:r>
+              <w:t>时，</w:t>
+            </w:r>
+            <w:r>
+              <w:t>MySQL</w:t>
+            </w:r>
+            <w:r>
+              <w:t>会将</w:t>
+            </w:r>
+            <w:r>
+              <w:rPr>
+                <w:rFonts w:hint="eastAsia"/>
+              </w:rPr>
+              <w:t>NULL</w:t>
+            </w:r>
+            <w:r>
+              <w:rPr>
+                <w:rFonts w:hint="eastAsia"/>
+              </w:rPr>
+              <w:t>转化</w:t>
+            </w:r>
+            <w:r>
+              <w:t>成</w:t>
+            </w:r>
+            <w:r>
+              <w:rPr>
+                <w:rFonts w:hint="eastAsia"/>
+              </w:rPr>
+              <w:t>0</w:t>
+            </w:r>
+            <w:r>
+              <w:rPr>
+                <w:rFonts w:hint="eastAsia"/>
+              </w:rPr>
+              <w:t>显示</w:t>
+            </w:r>
+            <w:r>
+              <w:t>（</w:t>
+            </w:r>
+            <w:r>
+              <w:rPr>
+                <w:rFonts w:hint="eastAsia"/>
+              </w:rPr>
+              <w:t>因为</w:t>
+            </w:r>
+            <w:r>
+              <w:t>列时</w:t>
+            </w:r>
+            <w:r>
+              <w:rPr>
+                <w:rFonts w:hint="eastAsia"/>
+              </w:rPr>
+              <w:t>NOT NULL</w:t>
+            </w:r>
+            <w:r>
+              <w:rPr>
+                <w:rFonts w:hint="eastAsia"/>
+              </w:rPr>
+              <w:t>的</w:t>
+            </w:r>
+            <w:r>
+              <w:t>）</w:t>
+            </w:r>
+            <w:r>
+              <w:rPr>
+                <w:rFonts w:hint="eastAsia"/>
+              </w:rPr>
+              <w:t>，</w:t>
+            </w:r>
+            <w:r>
+              <w:t>如果列中有</w:t>
+            </w:r>
+            <w:r>
+              <w:rPr>
+                <w:rFonts w:hint="eastAsia"/>
+              </w:rPr>
+              <w:t>为</w:t>
+            </w:r>
+            <w:r>
+              <w:rPr>
+                <w:rFonts w:hint="eastAsia"/>
+              </w:rPr>
+              <w:t>0</w:t>
+            </w:r>
+            <w:r>
+              <w:rPr>
+                <w:rFonts w:hint="eastAsia"/>
+              </w:rPr>
+              <w:t>的</w:t>
+            </w:r>
+            <w:r>
+              <w:t>记录，则查询结果会有两个</w:t>
+            </w:r>
+            <w:r>
+              <w:rPr>
+                <w:rFonts w:hint="eastAsia"/>
+              </w:rPr>
+              <w:t>0</w:t>
+            </w:r>
+            <w:r>
+              <w:rPr>
+                <w:rFonts w:hint="eastAsia"/>
+              </w:rPr>
+              <w:t>，</w:t>
+            </w:r>
+            <w:r>
+              <w:t>不唯一。</w:t>
+            </w:r>
           </w:p>
         </w:tc>
       </w:tr>
@@ -17469,15 +18136,7 @@
           <w:rFonts w:hint="eastAsia"/>
           <w:color w:val="00B0F0"/>
         </w:rPr>
-        <w:t>验</w:t>
-      </w:r>
-      <w:r>
-        <w:rPr>
-          <w:rFonts w:hint="eastAsia"/>
-          <w:color w:val="00B0F0"/>
-        </w:rPr>
-        <w:lastRenderedPageBreak/>
-        <w:t>收用例通过</w:t>
+        <w:t>验收用例通过</w:t>
       </w:r>
       <w:r>
         <w:rPr>
@@ -18181,7 +18840,7 @@
 
 <file path=word/comments.xml><?xml version="1.0" encoding="utf-8"?>
 <w:comments xmlns:wpc="http://schemas.microsoft.com/office/word/2010/wordprocessingCanvas" xmlns:cx="http://schemas.microsoft.com/office/drawing/2014/chartex" xmlns:mc="http://schemas.openxmlformats.org/markup-compatibility/2006" xmlns:o="urn:schemas-microsoft-com:office:office" xmlns:r="http://schemas.openxmlformats.org/officeDocument/2006/relationships" xmlns:m="http://schemas.openxmlformats.org/officeDocument/2006/math" xmlns:v="urn:schemas-microsoft-com:vml" xmlns:wp14="http://schemas.microsoft.com/office/word/2010/wordprocessingDrawing" xmlns:wp="http://schemas.openxmlformats.org/drawingml/2006/wordprocessingDrawing" xmlns:w10="urn:schemas-microsoft-com:office:word" xmlns:w="http://schemas.openxmlformats.org/wordprocessingml/2006/main" xmlns:w14="http://schemas.microsoft.com/office/word/2010/wordml" xmlns:w15="http://schemas.microsoft.com/office/word/2012/wordml" xmlns:w16se="http://schemas.microsoft.com/office/word/2015/wordml/symex" xmlns:wpg="http://schemas.microsoft.com/office/word/2010/wordprocessingGroup" xmlns:wpi="http://schemas.microsoft.com/office/word/2010/wordprocessingInk" xmlns:wne="http://schemas.microsoft.com/office/word/2006/wordml" xmlns:wps="http://schemas.microsoft.com/office/word/2010/wordprocessingShape" mc:Ignorable="w14 w15 w16se wp14">
-  <w:comment w:id="0" w:author="linsuqiang" w:date="2019-03-01T17:10:00Z" w:initials="l">
+  <w:comment w:id="1" w:author="linsuqiang" w:date="2019-03-01T17:10:00Z" w:initials="l">
     <w:p>
       <w:pPr>
         <w:pStyle w:val="ae"/>
@@ -20439,7 +21098,7 @@
 </file>
 
 <file path=customXml/itemProps1.xml><?xml version="1.0" encoding="utf-8"?>
-<ds:datastoreItem xmlns:ds="http://schemas.openxmlformats.org/officeDocument/2006/customXml" ds:itemID="{64B9F81E-4F72-43EC-9C94-0C20ED897AF4}">
+<ds:datastoreItem xmlns:ds="http://schemas.openxmlformats.org/officeDocument/2006/customXml" ds:itemID="{63016004-3A91-4E15-A800-1FA3E8B579CF}">
   <ds:schemaRefs>
     <ds:schemaRef ds:uri="http://schemas.openxmlformats.org/officeDocument/2006/bibliography"/>
   </ds:schemaRefs>

</xml_diff>

<commit_message>
SEQUOIASQLMAINSTREAM-243：更新 ALTER COLUMN 方案
git-svn-id: http://192.168.20.11/sequoiadb/trunk@40778 6121f079-4a18-41d3-8c30-8870a322f2c2
</commit_message>
<xml_diff>
--- a/internal_doc/03.开发设计/mysql/Story-mysql支持ALTER TABLE.docx
+++ b/internal_doc/03.开发设计/mysql/Story-mysql支持ALTER TABLE.docx
@@ -4076,16 +4076,7 @@
         <w:t>分析</w:t>
       </w:r>
       <w:r>
-        <w:t>：</w:t>
-      </w:r>
-      <w:r>
-        <w:rPr>
-          <w:rFonts w:hint="eastAsia"/>
-        </w:rPr>
-        <w:t>部分</w:t>
-      </w:r>
-      <w:r>
-        <w:t>支持。</w:t>
+        <w:t>：支持。</w:t>
       </w:r>
     </w:p>
     <w:p>
@@ -4159,79 +4150,13 @@
         <w:rPr>
           <w:rFonts w:hint="eastAsia"/>
         </w:rPr>
-        <w:t>对</w:t>
-      </w:r>
-      <w:r>
-        <w:rPr>
-          <w:rFonts w:hint="eastAsia"/>
-        </w:rPr>
-        <w:t>MySQL</w:t>
-      </w:r>
-      <w:r>
-        <w:rPr>
-          <w:rFonts w:hint="eastAsia"/>
-        </w:rPr>
-        <w:t>来说</w:t>
-      </w:r>
-      <w:r>
-        <w:t>代</w:t>
-      </w:r>
-      <w:r>
-        <w:rPr>
-          <w:rFonts w:hint="eastAsia"/>
-        </w:rPr>
-        <w:t>价</w:t>
-      </w:r>
-      <w:r>
-        <w:t>很小，但</w:t>
-      </w:r>
-      <w:r>
-        <w:rPr>
-          <w:rFonts w:hint="eastAsia"/>
-        </w:rPr>
-        <w:t>SDB</w:t>
-      </w:r>
-      <w:r>
-        <w:rPr>
-          <w:rFonts w:hint="eastAsia"/>
-        </w:rPr>
-        <w:t>却</w:t>
-      </w:r>
-      <w:r>
-        <w:t>需要全表更新，代价</w:t>
-      </w:r>
-      <w:r>
-        <w:rPr>
-          <w:rFonts w:hint="eastAsia"/>
-        </w:rPr>
-        <w:t>相对大</w:t>
-      </w:r>
-      <w:r>
-        <w:t>很多。</w:t>
-      </w:r>
-      <w:r>
-        <w:rPr>
-          <w:rFonts w:hint="eastAsia"/>
-        </w:rPr>
-        <w:t>在</w:t>
-      </w:r>
-      <w:r>
-        <w:t>找到</w:t>
-      </w:r>
-      <w:r>
-        <w:rPr>
-          <w:rFonts w:hint="eastAsia"/>
-        </w:rPr>
-        <w:t>好</w:t>
-      </w:r>
-      <w:r>
-        <w:t>的</w:t>
-      </w:r>
-      <w:r>
-        <w:t>解决方案前不</w:t>
-      </w:r>
-      <w:r>
-        <w:t>支持。</w:t>
+        <w:t>通过</w:t>
+      </w:r>
+      <w:r>
+        <w:t>全表更新实现</w:t>
+      </w:r>
+      <w:r>
+        <w:t>。</w:t>
       </w:r>
     </w:p>
     <w:p>
@@ -4265,13 +4190,31 @@
         <w:t>部分功能</w:t>
       </w:r>
       <w:r>
-        <w:t>开销</w:t>
-      </w:r>
-      <w:r>
-        <w:rPr>
-          <w:rFonts w:hint="eastAsia"/>
-        </w:rPr>
-        <w:t>大不支持</w:t>
+        <w:rPr>
+          <w:rFonts w:hint="eastAsia"/>
+        </w:rPr>
+        <w:t>轻量</w:t>
+      </w:r>
+      <w:r>
+        <w:t>支持，</w:t>
+      </w:r>
+      <w:r>
+        <w:rPr>
+          <w:rFonts w:hint="eastAsia"/>
+        </w:rPr>
+        <w:t>部分</w:t>
+      </w:r>
+      <w:r>
+        <w:t>功能</w:t>
+      </w:r>
+      <w:r>
+        <w:rPr>
+          <w:rFonts w:hint="eastAsia"/>
+        </w:rPr>
+        <w:t>需要全表</w:t>
+      </w:r>
+      <w:r>
+        <w:t>更新</w:t>
       </w:r>
       <w:r>
         <w:rPr>
@@ -4623,7 +4566,6 @@
         <w:rPr>
           <w:rFonts w:hint="eastAsia"/>
         </w:rPr>
-        <w:lastRenderedPageBreak/>
         <w:t>分析</w:t>
       </w:r>
       <w:r>
@@ -5001,7 +4943,144 @@
         <w:t>。</w:t>
       </w:r>
       <w:r>
-        <w:br/>
+        <w:rPr>
+          <w:rFonts w:hint="eastAsia"/>
+        </w:rPr>
+        <w:t>由于</w:t>
+      </w:r>
+      <w:r>
+        <w:rPr>
+          <w:rFonts w:hint="eastAsia"/>
+        </w:rPr>
+        <w:t xml:space="preserve"> SDB </w:t>
+      </w:r>
+      <w:r>
+        <w:t>可能数据量</w:t>
+      </w:r>
+      <w:r>
+        <w:rPr>
+          <w:rFonts w:hint="eastAsia"/>
+        </w:rPr>
+        <w:t>非常</w:t>
+      </w:r>
+      <w:r>
+        <w:t>大，导致</w:t>
+      </w:r>
+      <w:r>
+        <w:rPr>
+          <w:rFonts w:hint="eastAsia"/>
+        </w:rPr>
+        <w:t xml:space="preserve"> ALTER TABLE </w:t>
+      </w:r>
+      <w:r>
+        <w:rPr>
+          <w:rFonts w:hint="eastAsia"/>
+        </w:rPr>
+        <w:t>耗时</w:t>
+      </w:r>
+      <w:r>
+        <w:t>过大，</w:t>
+      </w:r>
+      <w:r>
+        <w:rPr>
+          <w:rFonts w:hint="eastAsia"/>
+        </w:rPr>
+        <w:t>引入一个</w:t>
+      </w:r>
+      <w:r>
+        <w:t>配置项</w:t>
+      </w:r>
+      <w:r>
+        <w:rPr>
+          <w:rFonts w:hint="eastAsia"/>
+          <w:b/>
+        </w:rPr>
+        <w:t>修改</w:t>
+      </w:r>
+      <w:r>
+        <w:rPr>
+          <w:b/>
+        </w:rPr>
+        <w:t>表的</w:t>
+      </w:r>
+      <w:r>
+        <w:rPr>
+          <w:rFonts w:hint="eastAsia"/>
+          <w:b/>
+        </w:rPr>
+        <w:t>开销阈值</w:t>
+      </w:r>
+      <w:r>
+        <w:t>（</w:t>
+      </w:r>
+      <w:r>
+        <w:t>ALTER_TABLE_OVERHEAD_THRESHOLD</w:t>
+      </w:r>
+      <w:r>
+        <w:rPr>
+          <w:rFonts w:hint="eastAsia"/>
+        </w:rPr>
+        <w:t>）。如果</w:t>
+      </w:r>
+      <w:r>
+        <w:t>表的尺寸（记录数）</w:t>
+      </w:r>
+      <w:r>
+        <w:rPr>
+          <w:rFonts w:hint="eastAsia"/>
+        </w:rPr>
+        <w:t>超过</w:t>
+      </w:r>
+      <w:r>
+        <w:t>了这个</w:t>
+      </w:r>
+      <w:r>
+        <w:rPr>
+          <w:rFonts w:hint="eastAsia"/>
+        </w:rPr>
+        <w:t>限制</w:t>
+      </w:r>
+      <w:r>
+        <w:t>，将</w:t>
+      </w:r>
+      <w:r>
+        <w:rPr>
+          <w:rFonts w:hint="eastAsia"/>
+        </w:rPr>
+        <w:t>不允许</w:t>
+      </w:r>
+      <w:r>
+        <w:rPr>
+          <w:rFonts w:hint="eastAsia"/>
+        </w:rPr>
+        <w:t>做</w:t>
+      </w:r>
+      <w:r>
+        <w:rPr>
+          <w:rFonts w:hint="eastAsia"/>
+        </w:rPr>
+        <w:t>涉及</w:t>
+      </w:r>
+      <w:r>
+        <w:t>表扫描、</w:t>
+      </w:r>
+      <w:r>
+        <w:rPr>
+          <w:rFonts w:hint="eastAsia"/>
+        </w:rPr>
+        <w:t>记录</w:t>
+      </w:r>
+      <w:r>
+        <w:t>更新的</w:t>
+      </w:r>
+      <w:r>
+        <w:rPr>
+          <w:rFonts w:hint="eastAsia"/>
+        </w:rPr>
+        <w:t xml:space="preserve"> ALTER </w:t>
+      </w:r>
+      <w:r>
+        <w:t>操作。</w:t>
       </w:r>
     </w:p>
     <w:p>
@@ -5874,9 +5953,6 @@
             <w:pPr>
               <w:pStyle w:val="aa"/>
               <w:ind w:left="0" w:firstLineChars="0" w:firstLine="0"/>
-              <w:rPr>
-                <w:rFonts w:hint="eastAsia"/>
-              </w:rPr>
             </w:pPr>
             <w:r>
               <w:t xml:space="preserve">e.g: </w:t>
@@ -6046,6 +6122,7 @@
               <w:rPr>
                 <w:rFonts w:hint="eastAsia"/>
               </w:rPr>
+              <w:lastRenderedPageBreak/>
               <w:t>添加</w:t>
             </w:r>
             <w:r>
@@ -6133,14 +6210,7 @@
               <w:rPr>
                 <w:color w:val="0070C0"/>
               </w:rPr>
-              <w:t xml:space="preserve">ADD </w:t>
-            </w:r>
-            <w:r>
-              <w:rPr>
-                <w:color w:val="0070C0"/>
-              </w:rPr>
-              <w:lastRenderedPageBreak/>
-              <w:t>[UNIQUE] INDEX</w:t>
+              <w:t>ADD [UNIQUE] INDEX</w:t>
             </w:r>
             <w:r>
               <w:t xml:space="preserve"> idx_name( col_name );</w:t>
@@ -6711,6 +6781,14 @@
             <w:r>
               <w:rPr>
                 <w:rFonts w:hint="eastAsia"/>
+                <w:color w:val="FF0000"/>
+              </w:rPr>
+              <w:t>暂</w:t>
+            </w:r>
+            <w:r>
+              <w:rPr>
+                <w:rFonts w:hint="eastAsia"/>
+                <w:color w:val="FF0000"/>
               </w:rPr>
               <w:t>不支持</w:t>
             </w:r>
@@ -8041,84 +8119,6 @@
       <w:r>
         <w:t>。</w:t>
       </w:r>
-    </w:p>
-    <w:p>
-      <w:pPr>
-        <w:pStyle w:val="aa"/>
-        <w:numPr>
-          <w:ilvl w:val="0"/>
-          <w:numId w:val="8"/>
-        </w:numPr>
-        <w:ind w:firstLineChars="0"/>
-      </w:pPr>
-      <w:r>
-        <w:rPr>
-          <w:rFonts w:hint="eastAsia"/>
-        </w:rPr>
-        <w:t>新增</w:t>
-      </w:r>
-      <w:r>
-        <w:t>主键时未检查列中是否有</w:t>
-      </w:r>
-      <w:r>
-        <w:rPr>
-          <w:rFonts w:hint="eastAsia"/>
-        </w:rPr>
-        <w:t xml:space="preserve"> NULL </w:t>
-      </w:r>
-      <w:r>
-        <w:rPr>
-          <w:rFonts w:hint="eastAsia"/>
-        </w:rPr>
-        <w:t>值，具体已</w:t>
-      </w:r>
-      <w:r>
-        <w:t>在</w:t>
-      </w:r>
-      <w:r>
-        <w:rPr>
-          <w:rFonts w:hint="eastAsia"/>
-        </w:rPr>
-        <w:t xml:space="preserve"> </w:t>
-      </w:r>
-      <w:r>
-        <w:rPr>
-          <w:rFonts w:hint="eastAsia"/>
-          <w:b/>
-        </w:rPr>
-        <w:t>八</w:t>
-      </w:r>
-      <w:r>
-        <w:rPr>
-          <w:b/>
-        </w:rPr>
-        <w:t>、遗留问题</w:t>
-      </w:r>
-      <w:r>
-        <w:rPr>
-          <w:rFonts w:hint="eastAsia"/>
-          <w:b/>
-        </w:rPr>
-        <w:t xml:space="preserve"> </w:t>
-      </w:r>
-      <w:r>
-        <w:rPr>
-          <w:rFonts w:hint="eastAsia"/>
-        </w:rPr>
-        <w:t>中登记</w:t>
-      </w:r>
-      <w:r>
-        <w:rPr>
-          <w:b/>
-        </w:rPr>
-        <w:t>。</w:t>
-      </w:r>
-    </w:p>
-    <w:p>
-      <w:pPr>
-        <w:pStyle w:val="aa"/>
-        <w:ind w:left="360" w:firstLineChars="0" w:firstLine="0"/>
-      </w:pPr>
     </w:p>
     <w:p>
       <w:pPr>
@@ -8287,95 +8287,101 @@
               <w:rPr>
                 <w:rFonts w:hint="eastAsia"/>
               </w:rPr>
+              <w:t>添加列</w:t>
+            </w:r>
+          </w:p>
+        </w:tc>
+        <w:tc>
+          <w:tcPr>
+            <w:tcW w:w="980" w:type="dxa"/>
+            <w:shd w:val="clear" w:color="auto" w:fill="EAF1DD" w:themeFill="accent3" w:themeFillTint="33"/>
+          </w:tcPr>
+          <w:p>
+            <w:pPr>
+              <w:pStyle w:val="aa"/>
+              <w:ind w:left="0" w:firstLineChars="0" w:firstLine="0"/>
+            </w:pPr>
+            <w:r>
+              <w:rPr>
+                <w:rFonts w:hint="eastAsia"/>
+              </w:rPr>
+              <w:t>Yes</w:t>
+            </w:r>
+          </w:p>
+        </w:tc>
+        <w:tc>
+          <w:tcPr>
+            <w:tcW w:w="849" w:type="dxa"/>
+            <w:shd w:val="clear" w:color="auto" w:fill="EAF1DD" w:themeFill="accent3" w:themeFillTint="33"/>
+          </w:tcPr>
+          <w:p>
+            <w:pPr>
+              <w:pStyle w:val="aa"/>
+              <w:ind w:left="0" w:firstLineChars="0" w:firstLine="0"/>
+            </w:pPr>
+            <w:r>
+              <w:rPr>
+                <w:rFonts w:hint="eastAsia"/>
+              </w:rPr>
+              <w:t>Yes</w:t>
+            </w:r>
+          </w:p>
+        </w:tc>
+        <w:tc>
+          <w:tcPr>
+            <w:tcW w:w="846" w:type="dxa"/>
+            <w:shd w:val="clear" w:color="auto" w:fill="EAF1DD" w:themeFill="accent3" w:themeFillTint="33"/>
+          </w:tcPr>
+          <w:p>
+            <w:pPr>
+              <w:pStyle w:val="aa"/>
+              <w:ind w:left="0" w:firstLineChars="0" w:firstLine="0"/>
+            </w:pPr>
+            <w:r>
+              <w:rPr>
+                <w:rFonts w:hint="eastAsia"/>
+              </w:rPr>
+              <w:t>Yes</w:t>
+            </w:r>
+          </w:p>
+        </w:tc>
+        <w:tc>
+          <w:tcPr>
+            <w:tcW w:w="3499" w:type="dxa"/>
+            <w:shd w:val="clear" w:color="auto" w:fill="EAF1DD" w:themeFill="accent3" w:themeFillTint="33"/>
+          </w:tcPr>
+          <w:p>
+            <w:pPr>
+              <w:pStyle w:val="aa"/>
+              <w:ind w:left="0" w:firstLineChars="0" w:firstLine="0"/>
+            </w:pPr>
+            <w:r>
+              <w:t>e</w:t>
+            </w:r>
+            <w:r>
+              <w:t xml:space="preserve">.g: </w:t>
+            </w:r>
+            <w:r>
+              <w:rPr>
+                <w:color w:val="0070C0"/>
+              </w:rPr>
+              <w:t>ALTER TABLE</w:t>
+            </w:r>
+            <w:r>
+              <w:t xml:space="preserve"> tbl_name </w:t>
+            </w:r>
+            <w:r>
+              <w:rPr>
+                <w:color w:val="0070C0"/>
+              </w:rPr>
+              <w:t xml:space="preserve">ADD </w:t>
+            </w:r>
+            <w:r>
+              <w:rPr>
+                <w:color w:val="0070C0"/>
+              </w:rPr>
               <w:lastRenderedPageBreak/>
-              <w:t>添加列</w:t>
-            </w:r>
-          </w:p>
-        </w:tc>
-        <w:tc>
-          <w:tcPr>
-            <w:tcW w:w="980" w:type="dxa"/>
-            <w:shd w:val="clear" w:color="auto" w:fill="EAF1DD" w:themeFill="accent3" w:themeFillTint="33"/>
-          </w:tcPr>
-          <w:p>
-            <w:pPr>
-              <w:pStyle w:val="aa"/>
-              <w:ind w:left="0" w:firstLineChars="0" w:firstLine="0"/>
-            </w:pPr>
-            <w:r>
-              <w:rPr>
-                <w:rFonts w:hint="eastAsia"/>
-              </w:rPr>
-              <w:t>Yes</w:t>
-            </w:r>
-          </w:p>
-        </w:tc>
-        <w:tc>
-          <w:tcPr>
-            <w:tcW w:w="849" w:type="dxa"/>
-            <w:shd w:val="clear" w:color="auto" w:fill="EAF1DD" w:themeFill="accent3" w:themeFillTint="33"/>
-          </w:tcPr>
-          <w:p>
-            <w:pPr>
-              <w:pStyle w:val="aa"/>
-              <w:ind w:left="0" w:firstLineChars="0" w:firstLine="0"/>
-            </w:pPr>
-            <w:r>
-              <w:rPr>
-                <w:rFonts w:hint="eastAsia"/>
-              </w:rPr>
-              <w:t>Yes</w:t>
-            </w:r>
-          </w:p>
-        </w:tc>
-        <w:tc>
-          <w:tcPr>
-            <w:tcW w:w="846" w:type="dxa"/>
-            <w:shd w:val="clear" w:color="auto" w:fill="EAF1DD" w:themeFill="accent3" w:themeFillTint="33"/>
-          </w:tcPr>
-          <w:p>
-            <w:pPr>
-              <w:pStyle w:val="aa"/>
-              <w:ind w:left="0" w:firstLineChars="0" w:firstLine="0"/>
-            </w:pPr>
-            <w:r>
-              <w:rPr>
-                <w:rFonts w:hint="eastAsia"/>
-              </w:rPr>
-              <w:t>Yes</w:t>
-            </w:r>
-          </w:p>
-        </w:tc>
-        <w:tc>
-          <w:tcPr>
-            <w:tcW w:w="3499" w:type="dxa"/>
-            <w:shd w:val="clear" w:color="auto" w:fill="EAF1DD" w:themeFill="accent3" w:themeFillTint="33"/>
-          </w:tcPr>
-          <w:p>
-            <w:pPr>
-              <w:pStyle w:val="aa"/>
-              <w:ind w:left="0" w:firstLineChars="0" w:firstLine="0"/>
-            </w:pPr>
-            <w:r>
-              <w:t>e</w:t>
-            </w:r>
-            <w:r>
-              <w:t xml:space="preserve">.g: </w:t>
-            </w:r>
-            <w:r>
-              <w:rPr>
-                <w:color w:val="0070C0"/>
-              </w:rPr>
-              <w:t>ALTER TABLE</w:t>
-            </w:r>
-            <w:r>
-              <w:t xml:space="preserve"> tbl_name </w:t>
-            </w:r>
-            <w:r>
-              <w:rPr>
-                <w:color w:val="0070C0"/>
-              </w:rPr>
-              <w:t>ADD [COLUMN]</w:t>
+              <w:t>[COLUMN]</w:t>
             </w:r>
             <w:r>
               <w:t xml:space="preserve"> col_name </w:t>
@@ -8655,6 +8661,9 @@
             <w:pPr>
               <w:pStyle w:val="aa"/>
               <w:ind w:left="105" w:hangingChars="50" w:hanging="105"/>
+              <w:rPr>
+                <w:rFonts w:hint="eastAsia"/>
+              </w:rPr>
             </w:pPr>
             <w:r>
               <w:rPr>
@@ -8678,31 +8687,34 @@
               <w:rPr>
                 <w:rFonts w:hint="eastAsia"/>
               </w:rPr>
-              <w:t>NULL</w:t>
-            </w:r>
-            <w:r>
-              <w:rPr>
-                <w:rFonts w:hint="eastAsia"/>
-              </w:rPr>
-              <w:t xml:space="preserve"> </w:t>
-            </w:r>
-            <w:r>
-              <w:rPr>
-                <w:rFonts w:hint="eastAsia"/>
-              </w:rPr>
-              <w:t>不支持</w:t>
-            </w:r>
-            <w:r>
-              <w:rPr>
-                <w:rFonts w:hint="eastAsia"/>
-              </w:rPr>
-              <w:t>NOT NULL</w:t>
-            </w:r>
-          </w:p>
-          <w:p>
-            <w:pPr>
-              <w:pStyle w:val="aa"/>
-              <w:ind w:left="0" w:firstLineChars="0" w:firstLine="0"/>
+              <w:t>。</w:t>
+            </w:r>
+            <w:r>
+              <w:t>其中</w:t>
+            </w:r>
+            <w:r>
+              <w:rPr>
+                <w:rFonts w:hint="eastAsia"/>
+              </w:rPr>
+              <w:t xml:space="preserve"> NOT NULL </w:t>
+            </w:r>
+            <w:r>
+              <w:rPr>
+                <w:rFonts w:hint="eastAsia"/>
+              </w:rPr>
+              <w:t>列通过</w:t>
+            </w:r>
+            <w:r>
+              <w:t>全表更新实现。</w:t>
+            </w:r>
+          </w:p>
+          <w:p>
+            <w:pPr>
+              <w:pStyle w:val="aa"/>
+              <w:ind w:left="0" w:firstLineChars="0" w:firstLine="0"/>
+              <w:rPr>
+                <w:rFonts w:hint="eastAsia"/>
+              </w:rPr>
             </w:pPr>
             <w:r>
               <w:rPr>
@@ -8720,14 +8732,17 @@
               <w:rPr>
                 <w:rFonts w:hint="eastAsia"/>
               </w:rPr>
-              <w:t>不</w:t>
-            </w:r>
-            <w:r>
-              <w:rPr>
-                <w:rFonts w:hint="eastAsia"/>
-              </w:rPr>
               <w:t>支持</w:t>
             </w:r>
+            <w:r>
+              <w:rPr>
+                <w:rFonts w:hint="eastAsia"/>
+              </w:rPr>
+              <w:t>。</w:t>
+            </w:r>
+            <w:r>
+              <w:t>通过全表更新实现。</w:t>
+            </w:r>
           </w:p>
           <w:p>
             <w:pPr>
@@ -8745,9 +8760,6 @@
                 <w:rFonts w:hint="eastAsia"/>
               </w:rPr>
               <w:t>：支持</w:t>
-            </w:r>
-            <w:r>
-              <w:t>，已实现</w:t>
             </w:r>
           </w:p>
           <w:p>
@@ -9124,24 +9136,27 @@
             <w:pPr>
               <w:pStyle w:val="aa"/>
               <w:ind w:left="0" w:firstLineChars="0" w:firstLine="0"/>
-            </w:pPr>
-            <w:r>
-              <w:rPr>
-                <w:rFonts w:hint="eastAsia"/>
-              </w:rPr>
-              <w:t>不支持</w:t>
-            </w:r>
-            <w:r>
-              <w:t>。尚未</w:t>
-            </w:r>
-            <w:r>
-              <w:rPr>
-                <w:rFonts w:hint="eastAsia"/>
-              </w:rPr>
-              <w:t>找</w:t>
-            </w:r>
-            <w:r>
-              <w:t>到合适解决方案。</w:t>
+              <w:rPr>
+                <w:rFonts w:hint="eastAsia"/>
+              </w:rPr>
+            </w:pPr>
+            <w:r>
+              <w:rPr>
+                <w:rFonts w:hint="eastAsia"/>
+              </w:rPr>
+              <w:t>支持</w:t>
+            </w:r>
+            <w:r>
+              <w:t>。</w:t>
+            </w:r>
+            <w:r>
+              <w:rPr>
+                <w:rFonts w:hint="eastAsia"/>
+              </w:rPr>
+              <w:t>通过</w:t>
+            </w:r>
+            <w:r>
+              <w:t>全表更新实现。</w:t>
             </w:r>
           </w:p>
         </w:tc>
@@ -9353,24 +9368,27 @@
             <w:pPr>
               <w:pStyle w:val="aa"/>
               <w:ind w:left="0" w:firstLineChars="0" w:firstLine="0"/>
-            </w:pPr>
-            <w:r>
-              <w:rPr>
-                <w:rFonts w:hint="eastAsia"/>
-              </w:rPr>
-              <w:t>不支持</w:t>
-            </w:r>
-            <w:r>
-              <w:t>。尚未</w:t>
-            </w:r>
-            <w:r>
-              <w:rPr>
-                <w:rFonts w:hint="eastAsia"/>
-              </w:rPr>
-              <w:t>找</w:t>
-            </w:r>
-            <w:r>
-              <w:t>到合适解决方案。</w:t>
+              <w:rPr>
+                <w:rFonts w:hint="eastAsia"/>
+              </w:rPr>
+            </w:pPr>
+            <w:r>
+              <w:rPr>
+                <w:rFonts w:hint="eastAsia"/>
+              </w:rPr>
+              <w:t>支持</w:t>
+            </w:r>
+            <w:r>
+              <w:t>。</w:t>
+            </w:r>
+            <w:r>
+              <w:rPr>
+                <w:rFonts w:hint="eastAsia"/>
+              </w:rPr>
+              <w:t>通过</w:t>
+            </w:r>
+            <w:r>
+              <w:t>全表更新实现。</w:t>
             </w:r>
           </w:p>
         </w:tc>
@@ -10128,71 +10146,16 @@
               <w:rPr>
                 <w:rFonts w:hint="eastAsia"/>
               </w:rPr>
-              <w:t>部分</w:t>
-            </w:r>
-            <w:r>
               <w:t>支持。</w:t>
             </w:r>
             <w:r>
               <w:rPr>
                 <w:rFonts w:hint="eastAsia"/>
               </w:rPr>
-              <w:t>根据</w:t>
-            </w:r>
-            <w:r>
-              <w:t>具体类型</w:t>
-            </w:r>
-            <w:r>
-              <w:rPr>
-                <w:rFonts w:hint="eastAsia"/>
-              </w:rPr>
-              <w:t>兼容</w:t>
-            </w:r>
-            <w:r>
-              <w:t>性</w:t>
-            </w:r>
-            <w:r>
-              <w:t>判断是否能走</w:t>
-            </w:r>
-            <w:r>
-              <w:rPr>
-                <w:rFonts w:hint="eastAsia"/>
-              </w:rPr>
-              <w:t>INPLACE</w:t>
-            </w:r>
-            <w:r>
-              <w:rPr>
-                <w:rFonts w:hint="eastAsia"/>
-              </w:rPr>
-              <w:t>。</w:t>
-            </w:r>
-            <w:r>
-              <w:rPr>
-                <w:rFonts w:hint="eastAsia"/>
-              </w:rPr>
-              <w:t>参考</w:t>
-            </w:r>
-            <w:r>
-              <w:t>本表格下面的</w:t>
-            </w:r>
-            <w:r>
-              <w:rPr>
-                <w:rFonts w:hint="eastAsia"/>
-                <w:b/>
-              </w:rPr>
-              <w:t>类型</w:t>
-            </w:r>
-            <w:r>
-              <w:rPr>
-                <w:b/>
-              </w:rPr>
-              <w:t>兼容性列表</w:t>
-            </w:r>
-            <w:r>
-              <w:rPr>
-                <w:rFonts w:hint="eastAsia"/>
-              </w:rPr>
-              <w:t>。</w:t>
+              <w:t>通过</w:t>
+            </w:r>
+            <w:r>
+              <w:t>全表更新实现。</w:t>
             </w:r>
           </w:p>
           <w:p>
@@ -10216,6 +10179,7 @@
               <w:rPr>
                 <w:rFonts w:hint="eastAsia"/>
               </w:rPr>
+              <w:lastRenderedPageBreak/>
               <w:t>低</w:t>
             </w:r>
           </w:p>
@@ -10887,9 +10851,6 @@
           <w:p>
             <w:pPr>
               <w:ind w:left="0"/>
-              <w:rPr>
-                <w:rFonts w:hint="eastAsia"/>
-              </w:rPr>
             </w:pPr>
             <w:r>
               <w:rPr>
@@ -11008,9 +10969,6 @@
             <w:pPr>
               <w:pStyle w:val="aa"/>
               <w:ind w:left="0" w:firstLineChars="0" w:firstLine="0"/>
-              <w:rPr>
-                <w:rFonts w:hint="eastAsia"/>
-              </w:rPr>
             </w:pPr>
             <w:r>
               <w:rPr>
@@ -11335,12 +11293,6 @@
               <w:rPr>
                 <w:rFonts w:hint="eastAsia"/>
               </w:rPr>
-              <w:t>不</w:t>
-            </w:r>
-            <w:r>
-              <w:rPr>
-                <w:rFonts w:hint="eastAsia"/>
-              </w:rPr>
               <w:t>支持</w:t>
             </w:r>
             <w:r>
@@ -11350,31 +11302,11 @@
               <w:rPr>
                 <w:rFonts w:hint="eastAsia"/>
               </w:rPr>
-              <w:t>因为</w:t>
-            </w:r>
-            <w:r>
-              <w:t>检测成本</w:t>
-            </w:r>
-            <w:r>
-              <w:t>高</w:t>
-            </w:r>
-            <w:r>
-              <w:rPr>
-                <w:rFonts w:hint="eastAsia"/>
-              </w:rPr>
-              <w:t>。</w:t>
-            </w:r>
-            <w:r>
-              <w:rPr>
-                <w:rFonts w:hint="eastAsia"/>
-              </w:rPr>
-              <w:t>暂时没有</w:t>
-            </w:r>
-            <w:r>
-              <w:t>快速解决方法。</w:t>
-            </w:r>
-            <w:bookmarkStart w:id="0" w:name="_GoBack"/>
-            <w:bookmarkEnd w:id="0"/>
+              <w:t>通过</w:t>
+            </w:r>
+            <w:r>
+              <w:t>全表更新实现。</w:t>
+            </w:r>
           </w:p>
         </w:tc>
         <w:tc>
@@ -11563,42 +11495,6 @@
               <w:t>);</w:t>
             </w:r>
           </w:p>
-          <w:p>
-            <w:pPr>
-              <w:pStyle w:val="aa"/>
-              <w:ind w:left="0" w:firstLineChars="0" w:firstLine="0"/>
-            </w:pPr>
-          </w:p>
-          <w:p>
-            <w:pPr>
-              <w:pStyle w:val="aa"/>
-              <w:ind w:left="0" w:firstLineChars="0" w:firstLine="0"/>
-            </w:pPr>
-            <w:r>
-              <w:rPr>
-                <w:rFonts w:hint="eastAsia"/>
-              </w:rPr>
-              <w:t xml:space="preserve">ENUM </w:t>
-            </w:r>
-            <w:r>
-              <w:rPr>
-                <w:rFonts w:hint="eastAsia"/>
-              </w:rPr>
-              <w:t>或</w:t>
-            </w:r>
-            <w:r>
-              <w:rPr>
-                <w:rFonts w:hint="eastAsia"/>
-              </w:rPr>
-              <w:t xml:space="preserve"> SET </w:t>
-            </w:r>
-            <w:r>
-              <w:rPr>
-                <w:rFonts w:hint="eastAsia"/>
-              </w:rPr>
-              <w:t>的定义修改是轻量的，因为它们在存储层是以数字保存。</w:t>
-            </w:r>
-          </w:p>
         </w:tc>
         <w:tc>
           <w:tcPr>
@@ -11671,10 +11567,16 @@
             <w:pPr>
               <w:pStyle w:val="aa"/>
               <w:ind w:left="0" w:firstLineChars="0" w:firstLine="0"/>
-              <w:rPr>
-                <w:rFonts w:hint="eastAsia"/>
-              </w:rPr>
-            </w:pPr>
+            </w:pPr>
+            <w:r>
+              <w:rPr>
+                <w:rFonts w:hint="eastAsia"/>
+              </w:rPr>
+              <w:t>无需</w:t>
+            </w:r>
+            <w:r>
+              <w:t>操作即</w:t>
+            </w:r>
             <w:r>
               <w:rPr>
                 <w:rFonts w:hint="eastAsia"/>
@@ -11691,7 +11593,22 @@
               <w:t>（元素），</w:t>
             </w:r>
             <w:r>
-              <w:t>不支持修改原</w:t>
+              <w:rPr>
+                <w:rFonts w:hint="eastAsia"/>
+              </w:rPr>
+              <w:t>通过更新</w:t>
+            </w:r>
+            <w:r>
+              <w:t>操作支持</w:t>
+            </w:r>
+            <w:r>
+              <w:rPr>
+                <w:rFonts w:hint="eastAsia"/>
+              </w:rPr>
+              <w:t>删除</w:t>
+            </w:r>
+            <w:r>
+              <w:t>原</w:t>
             </w:r>
             <w:r>
               <w:rPr>
@@ -11753,10 +11670,71 @@
         <w:rPr>
           <w:rFonts w:hint="eastAsia"/>
         </w:rPr>
-        <w:t>不支持</w:t>
-      </w:r>
-      <w:r>
-        <w:t>新增列为</w:t>
+        <w:t>部分</w:t>
+      </w:r>
+      <w:r>
+        <w:t>操作</w:t>
+      </w:r>
+      <w:r>
+        <w:rPr>
+          <w:rFonts w:hint="eastAsia"/>
+        </w:rPr>
+        <w:t>涉及</w:t>
+      </w:r>
+      <w:r>
+        <w:t>更新操作，</w:t>
+      </w:r>
+      <w:r>
+        <w:rPr>
+          <w:rFonts w:hint="eastAsia"/>
+        </w:rPr>
+        <w:t>如果</w:t>
+      </w:r>
+      <w:r>
+        <w:t>大于</w:t>
+      </w:r>
+      <w:r>
+        <w:rPr>
+          <w:rFonts w:hint="eastAsia"/>
+        </w:rPr>
+        <w:t>ALTER_TABLE_OVERHEAD_THRESHOLD</w:t>
+      </w:r>
+      <w:r>
+        <w:rPr>
+          <w:rFonts w:hint="eastAsia"/>
+        </w:rPr>
+        <w:t>则会</w:t>
+      </w:r>
+      <w:r>
+        <w:t>被禁止</w:t>
+      </w:r>
+      <w:r>
+        <w:rPr>
+          <w:rFonts w:hint="eastAsia"/>
+        </w:rPr>
+        <w:t>。包括</w:t>
+      </w:r>
+      <w:r>
+        <w:t>：</w:t>
+      </w:r>
+    </w:p>
+    <w:p>
+      <w:pPr>
+        <w:pStyle w:val="aa"/>
+        <w:numPr>
+          <w:ilvl w:val="0"/>
+          <w:numId w:val="18"/>
+        </w:numPr>
+        <w:ind w:firstLineChars="0"/>
+        <w:rPr>
+          <w:rFonts w:hint="eastAsia"/>
+        </w:rPr>
+      </w:pPr>
+      <w:r>
+        <w:rPr>
+          <w:rFonts w:hint="eastAsia"/>
+        </w:rPr>
+        <w:t>新增</w:t>
       </w:r>
       <w:r>
         <w:rPr>
@@ -11768,130 +11746,224 @@
         <w:rPr>
           <w:rFonts w:hint="eastAsia"/>
         </w:rPr>
-        <w:t>或</w:t>
-      </w:r>
-      <w:r>
-        <w:t>者</w:t>
-      </w:r>
-      <w:r>
-        <w:rPr>
-          <w:rFonts w:hint="eastAsia"/>
-        </w:rPr>
-        <w:t>默认值非空</w:t>
-      </w:r>
-      <w:r>
-        <w:t>。因为</w:t>
-      </w:r>
-      <w:r>
-        <w:rPr>
-          <w:rFonts w:hint="eastAsia"/>
-        </w:rPr>
-        <w:t>新增</w:t>
-      </w:r>
-      <w:r>
-        <w:t>有值的列需要全表级</w:t>
-      </w:r>
-      <w:r>
-        <w:rPr>
-          <w:rFonts w:hint="eastAsia"/>
-        </w:rPr>
-        <w:t>更新</w:t>
-      </w:r>
-      <w:r>
-        <w:t>操作，代价太大，</w:t>
-      </w:r>
-      <w:r>
-        <w:rPr>
-          <w:rFonts w:hint="eastAsia"/>
-        </w:rPr>
-        <w:t>未</w:t>
-      </w:r>
-      <w:r>
-        <w:t>找到合适方法前暂不处理。</w:t>
-      </w:r>
-      <w:r>
-        <w:rPr>
-          <w:rFonts w:hint="eastAsia"/>
-        </w:rPr>
-        <w:t>考虑</w:t>
-      </w:r>
-      <w:r>
-        <w:t>过在存储</w:t>
-      </w:r>
-      <w:r>
-        <w:rPr>
-          <w:rFonts w:hint="eastAsia"/>
-        </w:rPr>
-        <w:t>层不</w:t>
-      </w:r>
-      <w:r>
-        <w:t>存储新列默认值，在查询时再赋值，但如果</w:t>
-      </w:r>
-      <w:r>
-        <w:rPr>
-          <w:rFonts w:hint="eastAsia"/>
-        </w:rPr>
-        <w:t>新</w:t>
+        <w:t>的列</w:t>
+      </w:r>
+    </w:p>
+    <w:p>
+      <w:pPr>
+        <w:pStyle w:val="aa"/>
+        <w:numPr>
+          <w:ilvl w:val="0"/>
+          <w:numId w:val="18"/>
+        </w:numPr>
+        <w:ind w:firstLineChars="0"/>
+      </w:pPr>
+      <w:r>
+        <w:rPr>
+          <w:rFonts w:hint="eastAsia"/>
+        </w:rPr>
+        <w:t>新增有默认值的列</w:t>
+      </w:r>
+    </w:p>
+    <w:p>
+      <w:pPr>
+        <w:pStyle w:val="aa"/>
+        <w:numPr>
+          <w:ilvl w:val="0"/>
+          <w:numId w:val="18"/>
+        </w:numPr>
+        <w:ind w:firstLineChars="0"/>
+      </w:pPr>
+      <w:r>
+        <w:rPr>
+          <w:rFonts w:hint="eastAsia"/>
+        </w:rPr>
+        <w:t>删除</w:t>
       </w:r>
       <w:r>
         <w:t>列</w:t>
       </w:r>
-      <w:r>
-        <w:rPr>
-          <w:rFonts w:hint="eastAsia"/>
-        </w:rPr>
-        <w:t>无</w:t>
-      </w:r>
-      <w:r>
-        <w:t>值时，</w:t>
-      </w:r>
-      <w:r>
-        <w:rPr>
-          <w:rFonts w:hint="eastAsia"/>
-        </w:rPr>
-        <w:t>下压条件</w:t>
-      </w:r>
-      <w:r>
-        <w:t>到</w:t>
-      </w:r>
-      <w:r>
-        <w:rPr>
-          <w:rFonts w:hint="eastAsia"/>
-        </w:rPr>
-        <w:t xml:space="preserve"> sdb </w:t>
-      </w:r>
-      <w:r>
-        <w:rPr>
-          <w:rFonts w:hint="eastAsia"/>
-        </w:rPr>
-        <w:t>是</w:t>
-      </w:r>
-      <w:r>
-        <w:t>与</w:t>
-      </w:r>
-      <w:r>
-        <w:t>null</w:t>
-      </w:r>
-      <w:r>
-        <w:rPr>
-          <w:rFonts w:hint="eastAsia"/>
-        </w:rPr>
-        <w:t>比较</w:t>
-      </w:r>
-      <w:r>
-        <w:t>，而不是与默认值比较，比较结果将有误</w:t>
-      </w:r>
-      <w:r>
+    </w:p>
+    <w:p>
+      <w:pPr>
+        <w:pStyle w:val="aa"/>
+        <w:numPr>
+          <w:ilvl w:val="0"/>
+          <w:numId w:val="18"/>
+        </w:numPr>
+        <w:ind w:firstLineChars="0"/>
+        <w:rPr>
+          <w:rFonts w:hint="eastAsia"/>
+        </w:rPr>
+      </w:pPr>
+      <w:r>
+        <w:rPr>
+          <w:rFonts w:hint="eastAsia"/>
+        </w:rPr>
+        <w:t>重命名</w:t>
+      </w:r>
+      <w:r>
+        <w:t>列</w:t>
+      </w:r>
+    </w:p>
+    <w:p>
+      <w:pPr>
+        <w:pStyle w:val="aa"/>
+        <w:numPr>
+          <w:ilvl w:val="0"/>
+          <w:numId w:val="18"/>
+        </w:numPr>
+        <w:ind w:firstLineChars="0"/>
+        <w:rPr>
+          <w:rFonts w:hint="eastAsia"/>
+        </w:rPr>
+      </w:pPr>
+      <w:r>
+        <w:rPr>
+          <w:rFonts w:hint="eastAsia"/>
+        </w:rPr>
+        <w:t>将列由允许</w:t>
+      </w:r>
+      <w:r>
+        <w:rPr>
+          <w:rFonts w:hint="eastAsia"/>
+        </w:rPr>
+        <w:t xml:space="preserve"> NULL </w:t>
+      </w:r>
+      <w:r>
+        <w:rPr>
+          <w:rFonts w:hint="eastAsia"/>
+        </w:rPr>
+        <w:t>转为</w:t>
+      </w:r>
+      <w:r>
+        <w:rPr>
+          <w:rFonts w:hint="eastAsia"/>
+        </w:rPr>
+        <w:t xml:space="preserve"> NOT NULL</w:t>
+      </w:r>
+    </w:p>
+    <w:p>
+      <w:pPr>
+        <w:pStyle w:val="aa"/>
+        <w:numPr>
+          <w:ilvl w:val="0"/>
+          <w:numId w:val="18"/>
+        </w:numPr>
+        <w:ind w:firstLineChars="0"/>
+      </w:pPr>
+      <w:r>
+        <w:rPr>
+          <w:rFonts w:hint="eastAsia"/>
+        </w:rPr>
+        <w:t>需要</w:t>
+      </w:r>
+      <w:r>
+        <w:t>更新的列类型转换</w:t>
+      </w:r>
+    </w:p>
+    <w:p>
+      <w:pPr>
+        <w:pStyle w:val="aa"/>
+        <w:numPr>
+          <w:ilvl w:val="0"/>
+          <w:numId w:val="18"/>
+        </w:numPr>
+        <w:ind w:firstLineChars="0"/>
+      </w:pPr>
+      <w:r>
+        <w:rPr>
+          <w:rFonts w:hint="eastAsia"/>
+        </w:rPr>
+        <w:t>ENUM</w:t>
+      </w:r>
+      <w:r>
+        <w:rPr>
+          <w:rFonts w:hint="eastAsia"/>
+        </w:rPr>
+        <w:t>（</w:t>
+      </w:r>
+      <w:r>
+        <w:rPr>
+          <w:rFonts w:hint="eastAsia"/>
+        </w:rPr>
+        <w:t>SET</w:t>
+      </w:r>
+      <w:r>
+        <w:rPr>
+          <w:rFonts w:hint="eastAsia"/>
+        </w:rPr>
+        <w:t>）删除原</w:t>
+      </w:r>
+      <w:r>
+        <w:t>定义的</w:t>
+      </w:r>
+      <w:r>
+        <w:rPr>
+          <w:rFonts w:hint="eastAsia"/>
+        </w:rPr>
+        <w:t>枚举值</w:t>
+      </w:r>
+      <w:r>
+        <w:t>（</w:t>
+      </w:r>
+      <w:r>
+        <w:rPr>
+          <w:rFonts w:hint="eastAsia"/>
+        </w:rPr>
+        <w:t>元素</w:t>
+      </w:r>
+      <w:r>
+        <w:t>）</w:t>
+      </w:r>
+      <w:r>
+        <w:rPr>
+          <w:rFonts w:hint="eastAsia"/>
+        </w:rPr>
         <w:t>。</w:t>
       </w:r>
-      <w:r>
-        <w:rPr>
-          <w:rFonts w:hint="eastAsia"/>
-        </w:rPr>
-        <w:t>因此</w:t>
-      </w:r>
-      <w:r>
-        <w:t>该方案不可行。</w:t>
+    </w:p>
+    <w:p>
+      <w:pPr>
+        <w:rPr>
+          <w:rFonts w:hint="eastAsia"/>
+        </w:rPr>
+      </w:pPr>
+      <w:r>
+        <w:rPr>
+          <w:rFonts w:hint="eastAsia"/>
+        </w:rPr>
+        <w:t>其中部分</w:t>
+      </w:r>
+      <w:r>
+        <w:t>操作无法通过一次</w:t>
+      </w:r>
+      <w:r>
+        <w:rPr>
+          <w:rFonts w:hint="eastAsia"/>
+        </w:rPr>
+        <w:t xml:space="preserve"> </w:t>
+      </w:r>
+      <w:r>
+        <w:t xml:space="preserve">UPDATE </w:t>
+      </w:r>
+      <w:r>
+        <w:rPr>
+          <w:rFonts w:hint="eastAsia"/>
+        </w:rPr>
+        <w:t>命令</w:t>
+      </w:r>
+      <w:r>
+        <w:t>完成</w:t>
+      </w:r>
+      <w:r>
+        <w:rPr>
+          <w:rFonts w:hint="eastAsia"/>
+        </w:rPr>
+        <w:t>，</w:t>
+      </w:r>
+      <w:r>
+        <w:t>需要逐条查询更新。</w:t>
       </w:r>
     </w:p>
     <w:p>
@@ -11907,104 +11979,64 @@
         <w:rPr>
           <w:rFonts w:hint="eastAsia"/>
         </w:rPr>
-        <w:t>如果</w:t>
-      </w:r>
-      <w:r>
-        <w:t>需要列不为空或有默认值，</w:t>
-      </w:r>
-      <w:r>
-        <w:rPr>
-          <w:rFonts w:hint="eastAsia"/>
-        </w:rPr>
-        <w:t>暂时</w:t>
-      </w:r>
-      <w:r>
-        <w:t>可使用</w:t>
-      </w:r>
-      <w:r>
-        <w:rPr>
-          <w:rFonts w:hint="eastAsia"/>
-        </w:rPr>
-        <w:t>IFNULL()</w:t>
-      </w:r>
-      <w:r>
-        <w:rPr>
-          <w:rFonts w:hint="eastAsia"/>
-        </w:rPr>
-        <w:t>函数</w:t>
-      </w:r>
-      <w:r>
-        <w:t>，如</w:t>
-      </w:r>
-    </w:p>
-    <w:p>
-      <w:pPr>
-        <w:pStyle w:val="aa"/>
-        <w:ind w:left="360" w:firstLineChars="0" w:firstLine="0"/>
-      </w:pPr>
-      <w:r>
-        <w:t>SELECT IFNULL(name, ‘unknown’) FROM t1;</w:t>
-      </w:r>
-    </w:p>
-    <w:p>
-      <w:pPr>
-        <w:pStyle w:val="aa"/>
-        <w:ind w:left="360" w:firstLineChars="0" w:firstLine="0"/>
-        <w:rPr>
-          <w:rFonts w:hint="eastAsia"/>
-        </w:rPr>
-      </w:pPr>
-      <w:r>
-        <w:rPr>
-          <w:rFonts w:hint="eastAsia"/>
-        </w:rPr>
-        <w:t>在</w:t>
-      </w:r>
-      <w:r>
-        <w:rPr>
-          <w:rFonts w:hint="eastAsia"/>
-        </w:rPr>
-        <w:t xml:space="preserve"> name </w:t>
-      </w:r>
-      <w:r>
-        <w:rPr>
-          <w:rFonts w:hint="eastAsia"/>
-        </w:rPr>
-        <w:t>字段</w:t>
-      </w:r>
-      <w:r>
-        <w:t>为</w:t>
-      </w:r>
-      <w:r>
-        <w:rPr>
-          <w:rFonts w:hint="eastAsia"/>
-        </w:rPr>
-        <w:t xml:space="preserve"> NULL </w:t>
-      </w:r>
-      <w:r>
-        <w:rPr>
-          <w:rFonts w:hint="eastAsia"/>
-        </w:rPr>
-        <w:t>时</w:t>
-      </w:r>
-      <w:r>
-        <w:t>显示为</w:t>
-      </w:r>
-      <w:r>
-        <w:rPr>
-          <w:rFonts w:hint="eastAsia"/>
-        </w:rPr>
-        <w:t xml:space="preserve"> </w:t>
-      </w:r>
-      <w:r>
-        <w:t>‘unknown’</w:t>
-      </w:r>
-      <w:r>
-        <w:rPr>
-          <w:rFonts w:hint="eastAsia"/>
-        </w:rPr>
+        <w:t>新</w:t>
+      </w:r>
+      <w:r>
+        <w:t>增自增字段列</w:t>
+      </w:r>
+      <w:r>
+        <w:rPr>
+          <w:rFonts w:hint="eastAsia"/>
+        </w:rPr>
+        <w:t>，需</w:t>
+      </w:r>
+      <w:r>
+        <w:t>要为</w:t>
+      </w:r>
+      <w:r>
+        <w:rPr>
+          <w:rFonts w:hint="eastAsia"/>
+        </w:rPr>
+        <w:t>该</w:t>
+      </w:r>
+      <w:r>
+        <w:t>列赋</w:t>
+      </w:r>
+      <w:r>
+        <w:rPr>
+          <w:rFonts w:hint="eastAsia"/>
+        </w:rPr>
+        <w:t>序列</w:t>
+      </w:r>
+      <w:r>
+        <w:t>值</w:t>
+      </w:r>
+      <w:r>
+        <w:rPr>
+          <w:rFonts w:hint="eastAsia"/>
+        </w:rPr>
+        <w:t>。需</w:t>
+      </w:r>
+      <w:r>
+        <w:rPr>
+          <w:rFonts w:hint="eastAsia"/>
+        </w:rPr>
+        <w:t>sdb</w:t>
+      </w:r>
+      <w:r>
+        <w:rPr>
+          <w:rFonts w:hint="eastAsia"/>
+        </w:rPr>
+        <w:t>提供</w:t>
+      </w:r>
+      <w:r>
+        <w:t>支持</w:t>
+      </w:r>
+      <w:r>
         <w:t>。</w:t>
       </w:r>
+      <w:bookmarkStart w:id="0" w:name="_GoBack"/>
+      <w:bookmarkEnd w:id="0"/>
     </w:p>
     <w:p>
       <w:pPr>
@@ -12016,40 +12048,25 @@
         <w:ind w:firstLineChars="0"/>
       </w:pPr>
       <w:r>
-        <w:rPr>
-          <w:rFonts w:hint="eastAsia"/>
-        </w:rPr>
-        <w:t>不支持</w:t>
-      </w:r>
-      <w:r>
-        <w:t>单独将</w:t>
-      </w:r>
-      <w:r>
-        <w:rPr>
-          <w:rFonts w:hint="eastAsia"/>
-        </w:rPr>
-        <w:t>列</w:t>
-      </w:r>
-      <w:r>
-        <w:rPr>
-          <w:rFonts w:hint="eastAsia"/>
-        </w:rPr>
-        <w:t>从</w:t>
-      </w:r>
-      <w:r>
-        <w:t>允许</w:t>
-      </w:r>
-      <w:r>
-        <w:t xml:space="preserve">NULL </w:t>
-      </w:r>
-      <w:r>
-        <w:rPr>
-          <w:rFonts w:hint="eastAsia"/>
-        </w:rPr>
-        <w:t>转</w:t>
-      </w:r>
-      <w:r>
-        <w:t>为</w:t>
+        <w:t>如果把列设为主键</w:t>
+      </w:r>
+      <w:r>
+        <w:rPr>
+          <w:rFonts w:hint="eastAsia"/>
+        </w:rPr>
+        <w:t>，</w:t>
+      </w:r>
+      <w:r>
+        <w:t>或者自增字段列，它</w:t>
+      </w:r>
+      <w:r>
+        <w:rPr>
+          <w:rFonts w:hint="eastAsia"/>
+        </w:rPr>
+        <w:t>会</w:t>
+      </w:r>
+      <w:r>
+        <w:t>自动变成</w:t>
       </w:r>
       <w:r>
         <w:rPr>
@@ -12061,37 +12078,6 @@
         <w:rPr>
           <w:rFonts w:hint="eastAsia"/>
         </w:rPr>
-        <w:t>。</w:t>
-      </w:r>
-      <w:r>
-        <w:t>但是如果把列设为主键，它</w:t>
-      </w:r>
-      <w:r>
-        <w:rPr>
-          <w:rFonts w:hint="eastAsia"/>
-        </w:rPr>
-        <w:t>会</w:t>
-      </w:r>
-      <w:r>
-        <w:t>自动变成</w:t>
-      </w:r>
-      <w:r>
-        <w:rPr>
-          <w:rFonts w:hint="eastAsia"/>
-        </w:rPr>
-        <w:t xml:space="preserve"> </w:t>
-      </w:r>
-      <w:r>
-        <w:rPr>
-          <w:rFonts w:hint="eastAsia"/>
-        </w:rPr>
-        <w:lastRenderedPageBreak/>
-        <w:t>NOT NULL</w:t>
-      </w:r>
-      <w:r>
-        <w:rPr>
-          <w:rFonts w:hint="eastAsia"/>
-        </w:rPr>
         <w:t>，</w:t>
       </w:r>
       <w:r>
@@ -12107,13 +12093,7 @@
         <w:rPr>
           <w:rFonts w:hint="eastAsia"/>
         </w:rPr>
-        <w:t>层</w:t>
-      </w:r>
-      <w:r>
-        <w:rPr>
-          <w:rFonts w:hint="eastAsia"/>
-        </w:rPr>
-        <w:t>自动</w:t>
+        <w:t>层自动</w:t>
       </w:r>
       <w:r>
         <w:t>完成。</w:t>
@@ -12127,9 +12107,6 @@
           <w:numId w:val="8"/>
         </w:numPr>
         <w:ind w:firstLineChars="0"/>
-        <w:rPr>
-          <w:rFonts w:hint="eastAsia"/>
-        </w:rPr>
       </w:pPr>
       <w:r>
         <w:rPr>
@@ -12147,10 +12124,7 @@
         <w:t>非</w:t>
       </w:r>
       <w:r>
-        <w:t>主键的</w:t>
-      </w:r>
-      <w:r>
-        <w:t>列从</w:t>
+        <w:t>主键的列从</w:t>
       </w:r>
       <w:r>
         <w:rPr>
@@ -12189,10 +12163,7 @@
         <w:t>会报错，该工作在</w:t>
       </w:r>
       <w:r>
-        <w:t xml:space="preserve"> </w:t>
-      </w:r>
-      <w:r>
-        <w:t xml:space="preserve">SQL </w:t>
+        <w:t xml:space="preserve"> SQL </w:t>
       </w:r>
       <w:r>
         <w:rPr>
@@ -12203,15 +12174,6 @@
       <w:r>
         <w:t>自动完成。</w:t>
       </w:r>
-    </w:p>
-    <w:p>
-      <w:pPr>
-        <w:pStyle w:val="aa"/>
-        <w:ind w:left="360" w:firstLineChars="0" w:firstLine="0"/>
-        <w:rPr>
-          <w:rFonts w:hint="eastAsia"/>
-        </w:rPr>
-      </w:pPr>
     </w:p>
     <w:p>
       <w:pPr>
@@ -12225,1400 +12187,326 @@
       <w:r>
         <w:rPr>
           <w:rFonts w:hint="eastAsia"/>
-          <w:b/>
-        </w:rPr>
-        <w:t>类型</w:t>
-      </w:r>
-      <w:r>
-        <w:rPr>
-          <w:b/>
-        </w:rPr>
-        <w:t>兼容性</w:t>
-      </w:r>
-      <w:r>
-        <w:rPr>
-          <w:rFonts w:hint="eastAsia"/>
-          <w:b/>
-        </w:rPr>
-        <w:t>列表</w:t>
-      </w:r>
-      <w:r>
-        <w:t>：</w:t>
+        </w:rPr>
+        <w:lastRenderedPageBreak/>
+        <w:t>如果</w:t>
+      </w:r>
+      <w:r>
+        <w:t>删除列</w:t>
+      </w:r>
+      <w:r>
+        <w:rPr>
+          <w:rFonts w:hint="eastAsia"/>
+        </w:rPr>
+        <w:t>，</w:t>
+      </w:r>
+      <w:r>
+        <w:t>但列上有索引，会索引中剔除该字段。</w:t>
+      </w:r>
+      <w:r>
+        <w:rPr>
+          <w:rFonts w:hint="eastAsia"/>
+        </w:rPr>
+        <w:t>如果</w:t>
+      </w:r>
+      <w:r>
+        <w:t>重命名列，则会重建索引。</w:t>
       </w:r>
     </w:p>
     <w:p>
       <w:pPr>
-        <w:rPr>
-          <w:rFonts w:hint="eastAsia"/>
-        </w:rPr>
-      </w:pPr>
-    </w:p>
-    <w:tbl>
-      <w:tblPr>
-        <w:tblStyle w:val="a9"/>
-        <w:tblW w:w="0" w:type="auto"/>
-        <w:tblInd w:w="357" w:type="dxa"/>
-        <w:tblLook w:val="04A0" w:firstRow="1" w:lastRow="0" w:firstColumn="1" w:lastColumn="0" w:noHBand="0" w:noVBand="1"/>
-      </w:tblPr>
-      <w:tblGrid>
-        <w:gridCol w:w="3040"/>
-        <w:gridCol w:w="4899"/>
-      </w:tblGrid>
-      <w:tr>
-        <w:tc>
-          <w:tcPr>
-            <w:tcW w:w="3040" w:type="dxa"/>
-          </w:tcPr>
-          <w:p>
-            <w:pPr>
-              <w:ind w:left="0"/>
-              <w:rPr>
-                <w:rFonts w:hint="eastAsia"/>
-              </w:rPr>
-            </w:pPr>
-            <w:r>
-              <w:rPr>
-                <w:rFonts w:hint="eastAsia"/>
-              </w:rPr>
-              <w:t>相互</w:t>
-            </w:r>
-            <w:r>
-              <w:t>兼容</w:t>
-            </w:r>
-            <w:r>
-              <w:rPr>
-                <w:rFonts w:hint="eastAsia"/>
-              </w:rPr>
-              <w:t>类型</w:t>
-            </w:r>
-          </w:p>
-        </w:tc>
-        <w:tc>
-          <w:tcPr>
-            <w:tcW w:w="4899" w:type="dxa"/>
-          </w:tcPr>
-          <w:p>
-            <w:pPr>
-              <w:ind w:left="0"/>
-              <w:rPr>
-                <w:rFonts w:hint="eastAsia"/>
-              </w:rPr>
-            </w:pPr>
-            <w:r>
-              <w:rPr>
-                <w:rFonts w:hint="eastAsia"/>
-              </w:rPr>
-              <w:t>备注</w:t>
-            </w:r>
-          </w:p>
-        </w:tc>
-      </w:tr>
-      <w:tr>
-        <w:tc>
-          <w:tcPr>
-            <w:tcW w:w="3040" w:type="dxa"/>
-          </w:tcPr>
-          <w:p>
-            <w:pPr>
-              <w:ind w:left="0"/>
-            </w:pPr>
-            <w:r>
-              <w:t>BOOL</w:t>
-            </w:r>
-          </w:p>
-          <w:p>
-            <w:pPr>
-              <w:ind w:left="0"/>
-              <w:rPr>
-                <w:rFonts w:hint="eastAsia"/>
-              </w:rPr>
-            </w:pPr>
-            <w:r>
-              <w:rPr>
-                <w:rFonts w:hint="eastAsia"/>
-              </w:rPr>
-              <w:t>TINYINT</w:t>
-            </w:r>
-          </w:p>
-          <w:p>
-            <w:pPr>
-              <w:ind w:left="0"/>
-            </w:pPr>
-            <w:r>
-              <w:t>SMALLINT</w:t>
-            </w:r>
-          </w:p>
-          <w:p>
-            <w:pPr>
-              <w:ind w:left="0"/>
-            </w:pPr>
-            <w:r>
-              <w:t>MEDIUMINT</w:t>
-            </w:r>
-          </w:p>
-          <w:p>
-            <w:pPr>
-              <w:ind w:left="0"/>
-            </w:pPr>
-            <w:r>
-              <w:t>INT</w:t>
-            </w:r>
-          </w:p>
-          <w:p>
-            <w:pPr>
-              <w:ind w:left="0"/>
-            </w:pPr>
-            <w:r>
-              <w:t>BIGINT</w:t>
-            </w:r>
-          </w:p>
-          <w:p>
-            <w:pPr>
-              <w:ind w:left="0"/>
-            </w:pPr>
-            <w:r>
-              <w:t>FLOAT</w:t>
-            </w:r>
-          </w:p>
-          <w:p>
-            <w:pPr>
-              <w:ind w:left="0"/>
-            </w:pPr>
-            <w:r>
-              <w:t>DOUBLE</w:t>
-            </w:r>
-          </w:p>
-          <w:p>
-            <w:pPr>
-              <w:ind w:left="0"/>
-              <w:rPr>
-                <w:rFonts w:hint="eastAsia"/>
-              </w:rPr>
-            </w:pPr>
-            <w:r>
-              <w:t>DECIMAL</w:t>
-            </w:r>
-          </w:p>
-        </w:tc>
-        <w:tc>
-          <w:tcPr>
-            <w:tcW w:w="4899" w:type="dxa"/>
-          </w:tcPr>
-          <w:p>
-            <w:pPr>
-              <w:ind w:left="0"/>
-            </w:pPr>
-            <w:r>
-              <w:rPr>
-                <w:rFonts w:hint="eastAsia"/>
-              </w:rPr>
-              <w:t>数值</w:t>
-            </w:r>
-            <w:r>
-              <w:t>型之间可以相互转换。</w:t>
-            </w:r>
-          </w:p>
-          <w:p>
-            <w:pPr>
-              <w:pStyle w:val="aa"/>
-              <w:numPr>
-                <w:ilvl w:val="0"/>
-                <w:numId w:val="15"/>
-              </w:numPr>
-              <w:ind w:firstLineChars="0"/>
-            </w:pPr>
-            <w:r>
-              <w:t>如果从小范围整数转为大范围</w:t>
-            </w:r>
-            <w:r>
-              <w:rPr>
-                <w:rFonts w:hint="eastAsia"/>
-              </w:rPr>
-              <w:t>数值</w:t>
-            </w:r>
-            <w:r>
-              <w:t>，</w:t>
-            </w:r>
-            <w:r>
-              <w:rPr>
-                <w:rFonts w:hint="eastAsia"/>
-              </w:rPr>
-              <w:t>没有</w:t>
-            </w:r>
-            <w:r>
-              <w:t>问题。</w:t>
-            </w:r>
-          </w:p>
-          <w:p>
-            <w:pPr>
-              <w:pStyle w:val="aa"/>
-              <w:numPr>
-                <w:ilvl w:val="0"/>
-                <w:numId w:val="15"/>
-              </w:numPr>
-              <w:ind w:firstLineChars="0"/>
-            </w:pPr>
-            <w:r>
-              <w:rPr>
-                <w:rFonts w:hint="eastAsia"/>
-              </w:rPr>
-              <w:t>如果大</w:t>
-            </w:r>
-            <w:r>
-              <w:t>范围数值转小范围数</w:t>
-            </w:r>
-            <w:r>
-              <w:rPr>
-                <w:rFonts w:hint="eastAsia"/>
-              </w:rPr>
-              <w:t>值</w:t>
-            </w:r>
-            <w:r>
-              <w:t>，</w:t>
-            </w:r>
-            <w:r>
-              <w:rPr>
-                <w:rFonts w:hint="eastAsia"/>
-              </w:rPr>
-              <w:t>超出</w:t>
-            </w:r>
-            <w:r>
-              <w:t>范围</w:t>
-            </w:r>
-            <w:r>
-              <w:rPr>
-                <w:rFonts w:hint="eastAsia"/>
-              </w:rPr>
-              <w:t>时</w:t>
-            </w:r>
-            <w:r>
-              <w:t>会显示为该类型的最大（</w:t>
-            </w:r>
-            <w:r>
-              <w:rPr>
-                <w:rFonts w:hint="eastAsia"/>
-              </w:rPr>
-              <w:t>小</w:t>
-            </w:r>
-            <w:r>
-              <w:t>）</w:t>
-            </w:r>
-            <w:r>
-              <w:rPr>
-                <w:rFonts w:hint="eastAsia"/>
-              </w:rPr>
-              <w:t>值，</w:t>
-            </w:r>
-            <w:r>
-              <w:t>如果超出精度，则会四舍五入。</w:t>
-            </w:r>
-          </w:p>
-          <w:p>
-            <w:pPr>
-              <w:pStyle w:val="aa"/>
-              <w:numPr>
-                <w:ilvl w:val="0"/>
-                <w:numId w:val="15"/>
-              </w:numPr>
-              <w:ind w:firstLineChars="0"/>
-              <w:rPr>
-                <w:rFonts w:hint="eastAsia"/>
-              </w:rPr>
-            </w:pPr>
-            <w:r>
-              <w:t>BOOL</w:t>
-            </w:r>
-            <w:r>
-              <w:rPr>
-                <w:rFonts w:hint="eastAsia"/>
-              </w:rPr>
-              <w:t>型</w:t>
-            </w:r>
-            <w:r>
-              <w:t>在</w:t>
-            </w:r>
-            <w:r>
-              <w:t>MySQL</w:t>
-            </w:r>
-            <w:r>
-              <w:t>中</w:t>
-            </w:r>
-            <w:r>
-              <w:rPr>
-                <w:rFonts w:hint="eastAsia"/>
-              </w:rPr>
-              <w:t>是</w:t>
-            </w:r>
-            <w:r>
-              <w:rPr>
-                <w:rFonts w:hint="eastAsia"/>
-              </w:rPr>
-              <w:t>TINYINT(1)</w:t>
-            </w:r>
-            <w:r>
-              <w:rPr>
-                <w:rFonts w:hint="eastAsia"/>
-              </w:rPr>
-              <w:t>，</w:t>
-            </w:r>
-            <w:r>
-              <w:t>在</w:t>
-            </w:r>
-            <w:r>
-              <w:rPr>
-                <w:rFonts w:hint="eastAsia"/>
-              </w:rPr>
-              <w:t>元数据</w:t>
-            </w:r>
-            <w:r>
-              <w:t>与数据显示上都</w:t>
-            </w:r>
-            <w:r>
-              <w:rPr>
-                <w:rFonts w:hint="eastAsia"/>
-              </w:rPr>
-              <w:t>与</w:t>
-            </w:r>
-            <w:r>
-              <w:rPr>
-                <w:rFonts w:hint="eastAsia"/>
-              </w:rPr>
-              <w:t>TINYINT(1)</w:t>
-            </w:r>
-            <w:r>
-              <w:rPr>
-                <w:rFonts w:hint="eastAsia"/>
-              </w:rPr>
-              <w:t>相同</w:t>
-            </w:r>
-            <w:r>
-              <w:t>。</w:t>
-            </w:r>
-          </w:p>
-        </w:tc>
-      </w:tr>
-      <w:tr>
-        <w:tc>
-          <w:tcPr>
-            <w:tcW w:w="3040" w:type="dxa"/>
-          </w:tcPr>
-          <w:p>
-            <w:pPr>
-              <w:ind w:left="0"/>
-              <w:rPr>
-                <w:rFonts w:hint="eastAsia"/>
-              </w:rPr>
-            </w:pPr>
-            <w:r>
-              <w:rPr>
-                <w:rFonts w:hint="eastAsia"/>
-              </w:rPr>
-              <w:t>CHAR</w:t>
-            </w:r>
-          </w:p>
-          <w:p>
-            <w:pPr>
-              <w:ind w:left="0"/>
-            </w:pPr>
-            <w:r>
-              <w:t>VARCHAR</w:t>
-            </w:r>
-          </w:p>
-          <w:p>
-            <w:pPr>
-              <w:ind w:left="0"/>
-            </w:pPr>
-            <w:r>
-              <w:t>TINYTEXT</w:t>
-            </w:r>
-          </w:p>
-          <w:p>
-            <w:pPr>
-              <w:ind w:left="0"/>
-            </w:pPr>
-            <w:r>
-              <w:t>TEXT</w:t>
-            </w:r>
-          </w:p>
-          <w:p>
-            <w:pPr>
-              <w:ind w:left="0"/>
-            </w:pPr>
-            <w:r>
-              <w:t>MEDIUMTEXT</w:t>
-            </w:r>
-          </w:p>
-          <w:p>
-            <w:pPr>
-              <w:ind w:left="0"/>
-              <w:rPr>
-                <w:rFonts w:hint="eastAsia"/>
-              </w:rPr>
-            </w:pPr>
-            <w:r>
-              <w:rPr>
-                <w:rFonts w:hint="eastAsia"/>
-              </w:rPr>
-              <w:t>LONGTEXT</w:t>
-            </w:r>
-          </w:p>
-        </w:tc>
-        <w:tc>
-          <w:tcPr>
-            <w:tcW w:w="4899" w:type="dxa"/>
-          </w:tcPr>
-          <w:p>
-            <w:pPr>
-              <w:ind w:left="0"/>
-            </w:pPr>
-            <w:r>
-              <w:rPr>
-                <w:rFonts w:hint="eastAsia"/>
-              </w:rPr>
-              <w:t>字符串</w:t>
-            </w:r>
-            <w:r>
-              <w:t>类型之间可以</w:t>
-            </w:r>
-            <w:r>
-              <w:rPr>
-                <w:rFonts w:hint="eastAsia"/>
-              </w:rPr>
-              <w:t>相互</w:t>
-            </w:r>
-            <w:r>
-              <w:t>转换</w:t>
-            </w:r>
-          </w:p>
-          <w:p>
-            <w:pPr>
-              <w:pStyle w:val="aa"/>
-              <w:numPr>
-                <w:ilvl w:val="0"/>
-                <w:numId w:val="16"/>
-              </w:numPr>
-              <w:ind w:firstLineChars="0"/>
-            </w:pPr>
-            <w:r>
-              <w:t>如果</w:t>
-            </w:r>
-            <w:r>
-              <w:rPr>
-                <w:rFonts w:hint="eastAsia"/>
-              </w:rPr>
-              <w:t>长度</w:t>
-            </w:r>
-            <w:r>
-              <w:t>从</w:t>
-            </w:r>
-            <w:r>
-              <w:rPr>
-                <w:rFonts w:hint="eastAsia"/>
-              </w:rPr>
-              <w:t>短</w:t>
-            </w:r>
-            <w:r>
-              <w:t>转为长</w:t>
-            </w:r>
-            <w:r>
-              <w:t>，</w:t>
-            </w:r>
-            <w:r>
-              <w:rPr>
-                <w:rFonts w:hint="eastAsia"/>
-              </w:rPr>
-              <w:t>没问题</w:t>
-            </w:r>
-            <w:r>
-              <w:t>。</w:t>
-            </w:r>
-          </w:p>
-          <w:p>
-            <w:pPr>
-              <w:pStyle w:val="aa"/>
-              <w:numPr>
-                <w:ilvl w:val="0"/>
-                <w:numId w:val="16"/>
-              </w:numPr>
-              <w:ind w:firstLineChars="0"/>
-              <w:rPr>
-                <w:rFonts w:hint="eastAsia"/>
-              </w:rPr>
-            </w:pPr>
-            <w:r>
-              <w:rPr>
-                <w:rFonts w:hint="eastAsia"/>
-              </w:rPr>
-              <w:t>如果</w:t>
-            </w:r>
-            <w:r>
-              <w:rPr>
-                <w:rFonts w:hint="eastAsia"/>
-              </w:rPr>
-              <w:t>长度</w:t>
-            </w:r>
-            <w:r>
-              <w:t>从</w:t>
-            </w:r>
-            <w:r>
-              <w:rPr>
-                <w:rFonts w:hint="eastAsia"/>
-              </w:rPr>
-              <w:t>长</w:t>
-            </w:r>
-            <w:r>
-              <w:t>转</w:t>
-            </w:r>
-            <w:r>
-              <w:rPr>
-                <w:rFonts w:hint="eastAsia"/>
-              </w:rPr>
-              <w:t>为</w:t>
-            </w:r>
-            <w:r>
-              <w:t>短</w:t>
-            </w:r>
-            <w:r>
-              <w:t>，会</w:t>
-            </w:r>
-            <w:r>
-              <w:rPr>
-                <w:rFonts w:hint="eastAsia"/>
-              </w:rPr>
-              <w:t>截去</w:t>
-            </w:r>
-            <w:r>
-              <w:t>超出</w:t>
-            </w:r>
-            <w:r>
-              <w:rPr>
-                <w:rFonts w:hint="eastAsia"/>
-              </w:rPr>
-              <w:t>长度</w:t>
-            </w:r>
-            <w:r>
-              <w:t>的内容。</w:t>
-            </w:r>
-          </w:p>
-        </w:tc>
-      </w:tr>
-      <w:tr>
-        <w:tc>
-          <w:tcPr>
-            <w:tcW w:w="3040" w:type="dxa"/>
-          </w:tcPr>
-          <w:p>
-            <w:pPr>
-              <w:ind w:left="0"/>
-              <w:rPr>
-                <w:rFonts w:hint="eastAsia"/>
-              </w:rPr>
-            </w:pPr>
-            <w:r>
-              <w:rPr>
-                <w:rFonts w:hint="eastAsia"/>
-              </w:rPr>
-              <w:t>BINARY</w:t>
-            </w:r>
-          </w:p>
-          <w:p>
-            <w:pPr>
-              <w:ind w:left="0"/>
-            </w:pPr>
-            <w:r>
-              <w:t>VARBINARY</w:t>
-            </w:r>
-          </w:p>
-          <w:p>
-            <w:pPr>
-              <w:ind w:left="0"/>
-            </w:pPr>
-            <w:r>
-              <w:t>TINYBLOB</w:t>
-            </w:r>
-          </w:p>
-          <w:p>
-            <w:pPr>
-              <w:ind w:left="0"/>
-            </w:pPr>
-            <w:r>
-              <w:t>BLOB</w:t>
-            </w:r>
-          </w:p>
-          <w:p>
-            <w:pPr>
-              <w:ind w:left="0"/>
-            </w:pPr>
-            <w:r>
-              <w:t>MEDIUMBLOB</w:t>
-            </w:r>
-          </w:p>
-          <w:p>
-            <w:pPr>
-              <w:ind w:left="0"/>
-              <w:rPr>
-                <w:rFonts w:hint="eastAsia"/>
-              </w:rPr>
-            </w:pPr>
-            <w:r>
-              <w:t>LONGBLOB</w:t>
-            </w:r>
-          </w:p>
-        </w:tc>
-        <w:tc>
-          <w:tcPr>
-            <w:tcW w:w="4899" w:type="dxa"/>
-          </w:tcPr>
-          <w:p>
-            <w:pPr>
-              <w:ind w:left="0"/>
-              <w:rPr>
-                <w:rFonts w:hint="eastAsia"/>
-              </w:rPr>
-            </w:pPr>
-            <w:r>
-              <w:rPr>
-                <w:rFonts w:hint="eastAsia"/>
-              </w:rPr>
-              <w:t>二进制</w:t>
-            </w:r>
-            <w:r>
-              <w:t>类型之间可以相互转换</w:t>
-            </w:r>
-            <w:r>
-              <w:rPr>
-                <w:rFonts w:hint="eastAsia"/>
-              </w:rPr>
-              <w:t>，但如果由大</w:t>
-            </w:r>
-            <w:r>
-              <w:t>的</w:t>
-            </w:r>
-            <w:r>
-              <w:rPr>
-                <w:rFonts w:hint="eastAsia"/>
-              </w:rPr>
-              <w:t>容量</w:t>
-            </w:r>
-            <w:r>
-              <w:t>改为小的</w:t>
-            </w:r>
-            <w:r>
-              <w:rPr>
-                <w:rFonts w:hint="eastAsia"/>
-              </w:rPr>
-              <w:t>容量</w:t>
-            </w:r>
-            <w:r>
-              <w:t>，会截去超出</w:t>
-            </w:r>
-            <w:r>
-              <w:rPr>
-                <w:rFonts w:hint="eastAsia"/>
-              </w:rPr>
-              <w:t>容量</w:t>
-            </w:r>
-            <w:r>
-              <w:t>的内容。</w:t>
-            </w:r>
-          </w:p>
-        </w:tc>
-      </w:tr>
-      <w:tr>
-        <w:tc>
-          <w:tcPr>
-            <w:tcW w:w="3040" w:type="dxa"/>
-          </w:tcPr>
-          <w:p>
-            <w:pPr>
-              <w:ind w:left="0"/>
-              <w:rPr>
-                <w:rFonts w:hint="eastAsia"/>
-              </w:rPr>
-            </w:pPr>
-            <w:r>
-              <w:rPr>
-                <w:rFonts w:hint="eastAsia"/>
-              </w:rPr>
-              <w:t>BIT</w:t>
-            </w:r>
-          </w:p>
-        </w:tc>
-        <w:tc>
-          <w:tcPr>
-            <w:tcW w:w="4899" w:type="dxa"/>
-          </w:tcPr>
-          <w:p>
-            <w:pPr>
-              <w:ind w:left="0"/>
-              <w:rPr>
-                <w:rFonts w:hint="eastAsia"/>
-              </w:rPr>
-            </w:pPr>
-            <w:r>
-              <w:rPr>
-                <w:rFonts w:hint="eastAsia"/>
-              </w:rPr>
-              <w:t>特殊</w:t>
-            </w:r>
-            <w:r>
-              <w:t>内容的</w:t>
-            </w:r>
-            <w:r>
-              <w:rPr>
-                <w:rFonts w:hint="eastAsia"/>
-              </w:rPr>
-              <w:t>INT32/INT64</w:t>
-            </w:r>
-            <w:r>
-              <w:rPr>
-                <w:rFonts w:hint="eastAsia"/>
-              </w:rPr>
-              <w:t>，</w:t>
-            </w:r>
-            <w:r>
-              <w:t>转化为其它类型无意义</w:t>
-            </w:r>
-          </w:p>
-        </w:tc>
-      </w:tr>
-      <w:tr>
-        <w:tc>
-          <w:tcPr>
-            <w:tcW w:w="3040" w:type="dxa"/>
-          </w:tcPr>
-          <w:p>
-            <w:pPr>
-              <w:ind w:left="0"/>
-              <w:rPr>
-                <w:rFonts w:hint="eastAsia"/>
-              </w:rPr>
-            </w:pPr>
-            <w:r>
-              <w:rPr>
-                <w:rFonts w:hint="eastAsia"/>
-              </w:rPr>
-              <w:t>YEAR</w:t>
-            </w:r>
-          </w:p>
-        </w:tc>
-        <w:tc>
-          <w:tcPr>
-            <w:tcW w:w="4899" w:type="dxa"/>
-          </w:tcPr>
-          <w:p>
-            <w:pPr>
-              <w:ind w:left="0"/>
-              <w:rPr>
-                <w:rFonts w:hint="eastAsia"/>
-              </w:rPr>
-            </w:pPr>
-            <w:r>
-              <w:rPr>
-                <w:rFonts w:hint="eastAsia"/>
-              </w:rPr>
-              <w:t>年</w:t>
-            </w:r>
-            <w:r>
-              <w:t>格式</w:t>
-            </w:r>
-            <w:r>
-              <w:t>的</w:t>
-            </w:r>
-            <w:r>
-              <w:rPr>
-                <w:rFonts w:hint="eastAsia"/>
-              </w:rPr>
-              <w:t>INT32</w:t>
-            </w:r>
-            <w:r>
-              <w:rPr>
-                <w:rFonts w:hint="eastAsia"/>
-              </w:rPr>
-              <w:t>，</w:t>
-            </w:r>
-            <w:r>
-              <w:t>转化为其它类型无意义</w:t>
-            </w:r>
-          </w:p>
-        </w:tc>
-      </w:tr>
-      <w:tr>
-        <w:tc>
-          <w:tcPr>
-            <w:tcW w:w="3040" w:type="dxa"/>
-          </w:tcPr>
-          <w:p>
-            <w:pPr>
-              <w:ind w:left="0"/>
-              <w:rPr>
-                <w:rFonts w:hint="eastAsia"/>
-              </w:rPr>
-            </w:pPr>
-            <w:r>
-              <w:rPr>
-                <w:rFonts w:hint="eastAsia"/>
-              </w:rPr>
-              <w:t>TIME</w:t>
-            </w:r>
-          </w:p>
-        </w:tc>
-        <w:tc>
-          <w:tcPr>
-            <w:tcW w:w="4899" w:type="dxa"/>
-          </w:tcPr>
-          <w:p>
-            <w:pPr>
-              <w:ind w:left="0"/>
-              <w:rPr>
-                <w:rFonts w:hint="eastAsia"/>
-              </w:rPr>
-            </w:pPr>
-            <w:r>
-              <w:rPr>
-                <w:rFonts w:hint="eastAsia"/>
-              </w:rPr>
-              <w:t>时间</w:t>
-            </w:r>
-            <w:r>
-              <w:t>格式的</w:t>
-            </w:r>
-            <w:r>
-              <w:rPr>
-                <w:rFonts w:hint="eastAsia"/>
-              </w:rPr>
-              <w:t>DOUBLE</w:t>
-            </w:r>
-            <w:r>
-              <w:rPr>
-                <w:rFonts w:hint="eastAsia"/>
-              </w:rPr>
-              <w:t>，</w:t>
-            </w:r>
-            <w:r>
-              <w:t>转化为</w:t>
-            </w:r>
-            <w:r>
-              <w:rPr>
-                <w:rFonts w:hint="eastAsia"/>
-              </w:rPr>
-              <w:t>其它</w:t>
-            </w:r>
-            <w:r>
-              <w:t>类型无意义</w:t>
-            </w:r>
-          </w:p>
-        </w:tc>
-      </w:tr>
-      <w:tr>
-        <w:tc>
-          <w:tcPr>
-            <w:tcW w:w="3040" w:type="dxa"/>
-          </w:tcPr>
-          <w:p>
-            <w:pPr>
-              <w:ind w:left="0"/>
-              <w:rPr>
-                <w:rFonts w:hint="eastAsia"/>
-              </w:rPr>
-            </w:pPr>
-            <w:r>
-              <w:rPr>
-                <w:rFonts w:hint="eastAsia"/>
-              </w:rPr>
-              <w:t>DATE</w:t>
-            </w:r>
-          </w:p>
-        </w:tc>
-        <w:tc>
-          <w:tcPr>
-            <w:tcW w:w="4899" w:type="dxa"/>
-          </w:tcPr>
-          <w:p>
-            <w:pPr>
-              <w:ind w:left="0"/>
-              <w:rPr>
-                <w:rFonts w:hint="eastAsia"/>
-              </w:rPr>
-            </w:pPr>
-            <w:r>
-              <w:rPr>
-                <w:rFonts w:hint="eastAsia"/>
-              </w:rPr>
-              <w:t>没有相似</w:t>
-            </w:r>
-            <w:r>
-              <w:t>类型</w:t>
-            </w:r>
-            <w:r>
-              <w:rPr>
-                <w:rFonts w:hint="eastAsia"/>
-              </w:rPr>
-              <w:t>（对应</w:t>
-            </w:r>
-            <w:r>
-              <w:rPr>
-                <w:rFonts w:hint="eastAsia"/>
-              </w:rPr>
-              <w:t>$date</w:t>
-            </w:r>
-            <w:r>
-              <w:rPr>
-                <w:rFonts w:hint="eastAsia"/>
-              </w:rPr>
-              <w:t>）</w:t>
-            </w:r>
-          </w:p>
-        </w:tc>
-      </w:tr>
-      <w:tr>
-        <w:tc>
-          <w:tcPr>
-            <w:tcW w:w="3040" w:type="dxa"/>
-          </w:tcPr>
-          <w:p>
-            <w:pPr>
-              <w:ind w:left="0"/>
-              <w:rPr>
-                <w:rFonts w:hint="eastAsia"/>
-              </w:rPr>
-            </w:pPr>
-            <w:r>
-              <w:rPr>
-                <w:rFonts w:hint="eastAsia"/>
-              </w:rPr>
-              <w:t>DATETIME</w:t>
-            </w:r>
-          </w:p>
-        </w:tc>
-        <w:tc>
-          <w:tcPr>
-            <w:tcW w:w="4899" w:type="dxa"/>
-          </w:tcPr>
-          <w:p>
-            <w:pPr>
-              <w:ind w:left="0"/>
-              <w:rPr>
-                <w:rFonts w:hint="eastAsia"/>
-              </w:rPr>
-            </w:pPr>
-            <w:r>
-              <w:rPr>
-                <w:rFonts w:hint="eastAsia"/>
-              </w:rPr>
-              <w:t>时间</w:t>
-            </w:r>
-            <w:r>
-              <w:t>格式的字符串</w:t>
-            </w:r>
-            <w:r>
-              <w:rPr>
-                <w:rFonts w:hint="eastAsia"/>
-              </w:rPr>
-              <w:t>。转为</w:t>
-            </w:r>
-            <w:r>
-              <w:t>其它字符串</w:t>
-            </w:r>
-            <w:r>
-              <w:rPr>
-                <w:rFonts w:hint="eastAsia"/>
-              </w:rPr>
-              <w:t>类型容易破坏</w:t>
-            </w:r>
-            <w:r>
-              <w:t>其格式。</w:t>
-            </w:r>
-            <w:r>
-              <w:rPr>
-                <w:rFonts w:hint="eastAsia"/>
-              </w:rPr>
-              <w:t>不与</w:t>
-            </w:r>
-            <w:r>
-              <w:t>其它字符串</w:t>
-            </w:r>
-            <w:r>
-              <w:rPr>
-                <w:rFonts w:hint="eastAsia"/>
-              </w:rPr>
-              <w:t>类型</w:t>
-            </w:r>
-            <w:r>
-              <w:t>转换。</w:t>
-            </w:r>
-          </w:p>
-        </w:tc>
-      </w:tr>
-      <w:tr>
-        <w:tc>
-          <w:tcPr>
-            <w:tcW w:w="3040" w:type="dxa"/>
-          </w:tcPr>
-          <w:p>
-            <w:pPr>
-              <w:ind w:left="0"/>
-              <w:rPr>
-                <w:rFonts w:hint="eastAsia"/>
-              </w:rPr>
-            </w:pPr>
-            <w:r>
-              <w:rPr>
-                <w:rFonts w:hint="eastAsia"/>
-              </w:rPr>
-              <w:t>TIMESTAMP</w:t>
-            </w:r>
-          </w:p>
-        </w:tc>
-        <w:tc>
-          <w:tcPr>
-            <w:tcW w:w="4899" w:type="dxa"/>
-          </w:tcPr>
-          <w:p>
-            <w:pPr>
-              <w:ind w:left="0"/>
-              <w:rPr>
-                <w:rFonts w:hint="eastAsia"/>
-              </w:rPr>
-            </w:pPr>
-            <w:r>
-              <w:rPr>
-                <w:rFonts w:hint="eastAsia"/>
-              </w:rPr>
-              <w:t>没有</w:t>
-            </w:r>
-            <w:r>
-              <w:t>相似类型（</w:t>
-            </w:r>
-            <w:r>
-              <w:rPr>
-                <w:rFonts w:hint="eastAsia"/>
-              </w:rPr>
-              <w:t>对应</w:t>
-            </w:r>
-            <w:r>
-              <w:rPr>
-                <w:rFonts w:hint="eastAsia"/>
-              </w:rPr>
-              <w:t>$timestamp</w:t>
-            </w:r>
-            <w:r>
-              <w:t>）</w:t>
-            </w:r>
-          </w:p>
-        </w:tc>
-      </w:tr>
-      <w:tr>
-        <w:tc>
-          <w:tcPr>
-            <w:tcW w:w="3040" w:type="dxa"/>
-          </w:tcPr>
-          <w:p>
-            <w:pPr>
-              <w:ind w:left="0"/>
-              <w:rPr>
-                <w:rFonts w:hint="eastAsia"/>
-              </w:rPr>
-            </w:pPr>
-            <w:r>
-              <w:rPr>
-                <w:rFonts w:hint="eastAsia"/>
-              </w:rPr>
-              <w:t>ENUM</w:t>
-            </w:r>
-          </w:p>
-        </w:tc>
-        <w:tc>
-          <w:tcPr>
-            <w:tcW w:w="4899" w:type="dxa"/>
-          </w:tcPr>
-          <w:p>
-            <w:pPr>
-              <w:ind w:left="0"/>
-              <w:rPr>
-                <w:rFonts w:hint="eastAsia"/>
-              </w:rPr>
-            </w:pPr>
-            <w:r>
-              <w:rPr>
-                <w:rFonts w:hint="eastAsia"/>
-              </w:rPr>
-              <w:t>固定</w:t>
-            </w:r>
-            <w:r>
-              <w:t>内容</w:t>
-            </w:r>
-            <w:r>
-              <w:rPr>
-                <w:rFonts w:hint="eastAsia"/>
-              </w:rPr>
-              <w:t>的</w:t>
-            </w:r>
-            <w:r>
-              <w:t>字符串。</w:t>
-            </w:r>
-            <w:r>
-              <w:rPr>
-                <w:rFonts w:hint="eastAsia"/>
-              </w:rPr>
-              <w:t>转为</w:t>
-            </w:r>
-            <w:r>
-              <w:t>其它字符串</w:t>
-            </w:r>
-            <w:r>
-              <w:rPr>
-                <w:rFonts w:hint="eastAsia"/>
-              </w:rPr>
-              <w:t>类型容易破坏</w:t>
-            </w:r>
-            <w:r>
-              <w:t>其格式。</w:t>
-            </w:r>
-            <w:r>
-              <w:rPr>
-                <w:rFonts w:hint="eastAsia"/>
-              </w:rPr>
-              <w:t>不与</w:t>
-            </w:r>
-            <w:r>
-              <w:t>其它字符串</w:t>
-            </w:r>
-            <w:r>
-              <w:rPr>
-                <w:rFonts w:hint="eastAsia"/>
-              </w:rPr>
-              <w:t>类型</w:t>
-            </w:r>
-            <w:r>
-              <w:t>转换。</w:t>
-            </w:r>
-            <w:r>
-              <w:rPr>
-                <w:rFonts w:hint="eastAsia"/>
-              </w:rPr>
-              <w:t>可以添加</w:t>
-            </w:r>
-            <w:r>
-              <w:t>新的</w:t>
-            </w:r>
-            <w:r>
-              <w:rPr>
-                <w:rFonts w:hint="eastAsia"/>
-              </w:rPr>
-              <w:t>枚举</w:t>
-            </w:r>
-            <w:r>
-              <w:t>值</w:t>
-            </w:r>
-            <w:r>
-              <w:rPr>
-                <w:rFonts w:hint="eastAsia"/>
-              </w:rPr>
-              <w:t>，</w:t>
-            </w:r>
-            <w:r>
-              <w:t>但不能修改原有的枚举值。</w:t>
-            </w:r>
-          </w:p>
-        </w:tc>
-      </w:tr>
-      <w:tr>
-        <w:tc>
-          <w:tcPr>
-            <w:tcW w:w="3040" w:type="dxa"/>
-          </w:tcPr>
-          <w:p>
-            <w:pPr>
-              <w:ind w:left="0"/>
-              <w:rPr>
-                <w:rFonts w:hint="eastAsia"/>
-              </w:rPr>
-            </w:pPr>
-            <w:r>
-              <w:rPr>
-                <w:rFonts w:hint="eastAsia"/>
-              </w:rPr>
-              <w:t>SET</w:t>
-            </w:r>
-          </w:p>
-        </w:tc>
-        <w:tc>
-          <w:tcPr>
-            <w:tcW w:w="4899" w:type="dxa"/>
-          </w:tcPr>
-          <w:p>
-            <w:pPr>
-              <w:ind w:left="0"/>
-              <w:rPr>
-                <w:rFonts w:hint="eastAsia"/>
-              </w:rPr>
-            </w:pPr>
-            <w:r>
-              <w:rPr>
-                <w:rFonts w:hint="eastAsia"/>
-              </w:rPr>
-              <w:t>固定</w:t>
-            </w:r>
-            <w:r>
-              <w:t>内容</w:t>
-            </w:r>
-            <w:r>
-              <w:rPr>
-                <w:rFonts w:hint="eastAsia"/>
-              </w:rPr>
-              <w:t>的</w:t>
-            </w:r>
-            <w:r>
-              <w:t>字符串。</w:t>
-            </w:r>
-            <w:r>
-              <w:rPr>
-                <w:rFonts w:hint="eastAsia"/>
-              </w:rPr>
-              <w:t>转为</w:t>
-            </w:r>
-            <w:r>
-              <w:t>其它字符串</w:t>
-            </w:r>
-            <w:r>
-              <w:rPr>
-                <w:rFonts w:hint="eastAsia"/>
-              </w:rPr>
-              <w:t>类型容易破坏</w:t>
-            </w:r>
-            <w:r>
-              <w:t>其格式。</w:t>
-            </w:r>
-            <w:r>
-              <w:rPr>
-                <w:rFonts w:hint="eastAsia"/>
-              </w:rPr>
-              <w:t>不与</w:t>
-            </w:r>
-            <w:r>
-              <w:t>其它字符串</w:t>
-            </w:r>
-            <w:r>
-              <w:rPr>
-                <w:rFonts w:hint="eastAsia"/>
-              </w:rPr>
-              <w:t>类型</w:t>
-            </w:r>
-            <w:r>
-              <w:t>转换。</w:t>
-            </w:r>
-            <w:r>
-              <w:rPr>
-                <w:rFonts w:hint="eastAsia"/>
-              </w:rPr>
-              <w:t>可以添加</w:t>
-            </w:r>
-            <w:r>
-              <w:t>新的</w:t>
-            </w:r>
-            <w:r>
-              <w:rPr>
-                <w:rFonts w:hint="eastAsia"/>
-              </w:rPr>
-              <w:t>元素</w:t>
-            </w:r>
-            <w:r>
-              <w:rPr>
-                <w:rFonts w:hint="eastAsia"/>
-              </w:rPr>
-              <w:t>，</w:t>
-            </w:r>
-            <w:r>
-              <w:t>但不能修改原有的</w:t>
-            </w:r>
-            <w:r>
-              <w:rPr>
-                <w:rFonts w:hint="eastAsia"/>
-              </w:rPr>
-              <w:t>元素</w:t>
-            </w:r>
-            <w:r>
-              <w:t>。</w:t>
-            </w:r>
-          </w:p>
-        </w:tc>
-      </w:tr>
-      <w:tr>
-        <w:tc>
-          <w:tcPr>
-            <w:tcW w:w="3040" w:type="dxa"/>
-          </w:tcPr>
-          <w:p>
-            <w:pPr>
-              <w:ind w:left="0"/>
-              <w:rPr>
-                <w:rFonts w:hint="eastAsia"/>
-              </w:rPr>
-            </w:pPr>
-            <w:r>
-              <w:rPr>
-                <w:rFonts w:hint="eastAsia"/>
-              </w:rPr>
-              <w:t>JSON</w:t>
-            </w:r>
-          </w:p>
-        </w:tc>
-        <w:tc>
-          <w:tcPr>
-            <w:tcW w:w="4899" w:type="dxa"/>
-          </w:tcPr>
-          <w:p>
-            <w:pPr>
-              <w:ind w:left="0"/>
-              <w:rPr>
-                <w:rFonts w:hint="eastAsia"/>
-              </w:rPr>
-            </w:pPr>
-            <w:r>
-              <w:rPr>
-                <w:rFonts w:hint="eastAsia"/>
-              </w:rPr>
-              <w:t>特殊</w:t>
-            </w:r>
-            <w:r>
-              <w:t>内容的</w:t>
-            </w:r>
-            <w:r>
-              <w:rPr>
-                <w:rFonts w:hint="eastAsia"/>
-              </w:rPr>
-              <w:t>$binary</w:t>
-            </w:r>
-            <w:r>
-              <w:rPr>
-                <w:rFonts w:hint="eastAsia"/>
-              </w:rPr>
-              <w:t>，</w:t>
-            </w:r>
-            <w:r>
-              <w:t>转化为其它类型无意义。</w:t>
-            </w:r>
-          </w:p>
-        </w:tc>
-      </w:tr>
-    </w:tbl>
-    <w:p>
-      <w:pPr>
-        <w:rPr>
-          <w:rFonts w:hint="eastAsia"/>
-        </w:rPr>
-      </w:pPr>
+        <w:pStyle w:val="aa"/>
+        <w:numPr>
+          <w:ilvl w:val="0"/>
+          <w:numId w:val="8"/>
+        </w:numPr>
+        <w:ind w:firstLineChars="0"/>
+      </w:pPr>
+      <w:r>
+        <w:rPr>
+          <w:rFonts w:hint="eastAsia"/>
+        </w:rPr>
+        <w:t>类型</w:t>
+      </w:r>
+      <w:r>
+        <w:t>转换</w:t>
+      </w:r>
+      <w:r>
+        <w:rPr>
+          <w:rFonts w:hint="eastAsia"/>
+        </w:rPr>
+        <w:t>根据</w:t>
+      </w:r>
+      <w:r>
+        <w:t>兼容性决定是否需要</w:t>
+      </w:r>
+      <w:r>
+        <w:rPr>
+          <w:rFonts w:hint="eastAsia"/>
+        </w:rPr>
+        <w:t>全表</w:t>
+      </w:r>
+      <w:r>
+        <w:t>更新。</w:t>
+      </w:r>
+      <w:r>
+        <w:rPr>
+          <w:rFonts w:hint="eastAsia"/>
+        </w:rPr>
+        <w:t>兼容性</w:t>
+      </w:r>
+      <w:r>
+        <w:t>和转换规则参考</w:t>
+      </w:r>
+      <w:r>
+        <w:rPr>
+          <w:rFonts w:hint="eastAsia"/>
+        </w:rPr>
+        <w:t xml:space="preserve"> </w:t>
+      </w:r>
+      <w:hyperlink r:id="rId8" w:history="1">
+        <w:r>
+          <w:rPr>
+            <w:rStyle w:val="af4"/>
+            <w:rFonts w:hint="eastAsia"/>
+          </w:rPr>
+          <w:t>/trunk/</w:t>
+        </w:r>
+        <w:r>
+          <w:rPr>
+            <w:rStyle w:val="af4"/>
+          </w:rPr>
+          <w:t>internal_doc/03.</w:t>
+        </w:r>
+        <w:r>
+          <w:rPr>
+            <w:rStyle w:val="af4"/>
+            <w:rFonts w:hint="eastAsia"/>
+          </w:rPr>
+          <w:t>开发</w:t>
+        </w:r>
+        <w:r>
+          <w:rPr>
+            <w:rStyle w:val="af4"/>
+          </w:rPr>
+          <w:t>设计</w:t>
+        </w:r>
+        <w:r>
+          <w:rPr>
+            <w:rStyle w:val="af4"/>
+            <w:rFonts w:hint="eastAsia"/>
+          </w:rPr>
+          <w:t>/</w:t>
+        </w:r>
+        <w:r>
+          <w:rPr>
+            <w:rStyle w:val="af4"/>
+          </w:rPr>
+          <w:t xml:space="preserve">MySQL </w:t>
+        </w:r>
+        <w:r>
+          <w:rPr>
+            <w:rStyle w:val="af4"/>
+            <w:rFonts w:hint="eastAsia"/>
+          </w:rPr>
+          <w:t>类型</w:t>
+        </w:r>
+        <w:r>
+          <w:rPr>
+            <w:rStyle w:val="af4"/>
+          </w:rPr>
+          <w:t>转换兼容</w:t>
+        </w:r>
+        <w:r>
+          <w:rPr>
+            <w:rStyle w:val="af4"/>
+          </w:rPr>
+          <w:t>性</w:t>
+        </w:r>
+        <w:r>
+          <w:rPr>
+            <w:rStyle w:val="af4"/>
+            <w:rFonts w:hint="eastAsia"/>
+          </w:rPr>
+          <w:t>与</w:t>
+        </w:r>
+        <w:r>
+          <w:rPr>
+            <w:rStyle w:val="af4"/>
+          </w:rPr>
+          <w:t>转换规则</w:t>
+        </w:r>
+        <w:r>
+          <w:rPr>
+            <w:rStyle w:val="af4"/>
+            <w:rFonts w:hint="eastAsia"/>
+          </w:rPr>
+          <w:t>.xlsx</w:t>
+        </w:r>
+      </w:hyperlink>
+      <w:r>
+        <w:rPr>
+          <w:rFonts w:hint="eastAsia"/>
+        </w:rPr>
+        <w:t xml:space="preserve"> </w:t>
+      </w:r>
+      <w:r>
+        <w:rPr>
+          <w:rFonts w:hint="eastAsia"/>
+        </w:rPr>
+        <w:t>。</w:t>
+      </w:r>
     </w:p>
     <w:p>
       <w:pPr>
+        <w:pStyle w:val="aa"/>
+        <w:ind w:left="360" w:firstLineChars="0" w:firstLine="0"/>
+      </w:pPr>
+      <w:r>
+        <w:rPr>
+          <w:rFonts w:hint="eastAsia"/>
+        </w:rPr>
+        <w:t>步骤</w:t>
+      </w:r>
+      <w:r>
+        <w:t>：</w:t>
+      </w:r>
+    </w:p>
+    <w:p>
+      <w:pPr>
+        <w:pStyle w:val="aa"/>
+        <w:ind w:left="360" w:firstLineChars="0" w:firstLine="0"/>
+        <w:jc w:val="center"/>
+      </w:pPr>
+      <w:r>
+        <w:rPr>
+          <w:rFonts w:hint="eastAsia"/>
+          <w:noProof/>
+        </w:rPr>
+        <w:drawing>
+          <wp:inline distT="0" distB="0" distL="0" distR="0" wp14:anchorId="77447687" wp14:editId="33D38AC4">
+            <wp:extent cx="2245766" cy="2577653"/>
+            <wp:effectExtent l="0" t="0" r="2540" b="0"/>
+            <wp:docPr id="1" name="图片 1"/>
+            <wp:cNvGraphicFramePr>
+              <a:graphicFrameLocks xmlns:a="http://schemas.openxmlformats.org/drawingml/2006/main" noChangeAspect="1"/>
+            </wp:cNvGraphicFramePr>
+            <a:graphic xmlns:a="http://schemas.openxmlformats.org/drawingml/2006/main">
+              <a:graphicData uri="http://schemas.openxmlformats.org/drawingml/2006/picture">
+                <pic:pic xmlns:pic="http://schemas.openxmlformats.org/drawingml/2006/picture">
+                  <pic:nvPicPr>
+                    <pic:cNvPr id="1" name="pic.PNG"/>
+                    <pic:cNvPicPr/>
+                  </pic:nvPicPr>
+                  <pic:blipFill>
+                    <a:blip r:embed="rId9">
+                      <a:extLst>
+                        <a:ext uri="{28A0092B-C50C-407E-A947-70E740481C1C}">
+                          <a14:useLocalDpi xmlns:a14="http://schemas.microsoft.com/office/drawing/2010/main" val="0"/>
+                        </a:ext>
+                      </a:extLst>
+                    </a:blip>
+                    <a:stretch>
+                      <a:fillRect/>
+                    </a:stretch>
+                  </pic:blipFill>
+                  <pic:spPr>
+                    <a:xfrm>
+                      <a:off x="0" y="0"/>
+                      <a:ext cx="2260175" cy="2594191"/>
+                    </a:xfrm>
+                    <a:prstGeom prst="rect">
+                      <a:avLst/>
+                    </a:prstGeom>
+                  </pic:spPr>
+                </pic:pic>
+              </a:graphicData>
+            </a:graphic>
+          </wp:inline>
+        </w:drawing>
+      </w:r>
+    </w:p>
+    <w:p>
+      <w:pPr>
+        <w:pStyle w:val="aa"/>
+        <w:ind w:left="360" w:firstLineChars="0" w:firstLine="0"/>
+        <w:jc w:val="left"/>
+        <w:rPr>
+          <w:rFonts w:hint="eastAsia"/>
+        </w:rPr>
+      </w:pPr>
+      <w:r>
+        <w:rPr>
+          <w:rFonts w:hint="eastAsia"/>
+        </w:rPr>
+        <w:t>其中</w:t>
+      </w:r>
+      <w:r>
+        <w:t>判断是否有不兼容</w:t>
+      </w:r>
+      <w:r>
+        <w:rPr>
+          <w:rFonts w:hint="eastAsia"/>
+        </w:rPr>
+        <w:t>的</w:t>
+      </w:r>
+      <w:r>
+        <w:t>记录要通过</w:t>
+      </w:r>
+      <w:r>
+        <w:rPr>
+          <w:rFonts w:hint="eastAsia"/>
+        </w:rPr>
+        <w:t>一次</w:t>
+      </w:r>
+      <w:r>
+        <w:t>查询</w:t>
+      </w:r>
+      <w:r>
+        <w:rPr>
+          <w:rFonts w:hint="eastAsia"/>
+        </w:rPr>
+        <w:t>实现</w:t>
+      </w:r>
+      <w:r>
+        <w:t>。根据</w:t>
+      </w:r>
+      <w:r>
+        <w:rPr>
+          <w:rFonts w:hint="eastAsia"/>
+        </w:rPr>
+        <w:t>转换</w:t>
+      </w:r>
+      <w:r>
+        <w:t>规则更新时，</w:t>
+      </w:r>
+      <w:r>
+        <w:rPr>
+          <w:rFonts w:hint="eastAsia"/>
+        </w:rPr>
+        <w:t>有的可以</w:t>
+      </w:r>
+      <w:r>
+        <w:t>通过一次更新请求完成，有的则需要查询后逐条更新。</w:t>
+      </w:r>
+    </w:p>
+    <w:p>
+      <w:pPr>
+        <w:pStyle w:val="aa"/>
+        <w:ind w:left="360" w:firstLineChars="0" w:firstLine="0"/>
+        <w:rPr>
+          <w:rFonts w:hint="eastAsia"/>
+        </w:rPr>
+      </w:pPr>
+    </w:p>
+    <w:p>
+      <w:pPr>
         <w:pStyle w:val="3"/>
       </w:pPr>
       <w:r>
         <w:rPr>
           <w:rFonts w:hint="eastAsia"/>
         </w:rPr>
-        <w:lastRenderedPageBreak/>
         <w:t>自动</w:t>
       </w:r>
       <w:r>
@@ -14837,6 +13725,7 @@
               <w:rPr>
                 <w:rFonts w:hint="eastAsia"/>
               </w:rPr>
+              <w:lastRenderedPageBreak/>
               <w:t>添加</w:t>
             </w:r>
             <w:r>
@@ -16058,7 +14947,6 @@
         <w:rPr>
           <w:rFonts w:hint="eastAsia"/>
         </w:rPr>
-        <w:lastRenderedPageBreak/>
         <w:t>当添加或修改一个</w:t>
       </w:r>
       <w:r>
@@ -16899,6 +15787,7 @@
               <w:rPr>
                 <w:rFonts w:hint="eastAsia"/>
               </w:rPr>
+              <w:lastRenderedPageBreak/>
               <w:t>指定</w:t>
             </w:r>
             <w:r>
@@ -18281,14 +17170,7 @@
               <w:rPr>
                 <w:color w:val="0070C0"/>
               </w:rPr>
-              <w:t xml:space="preserve">OPTIMIZE [NO_WRITE_TO_BINLOG | </w:t>
-            </w:r>
-            <w:r>
-              <w:rPr>
-                <w:color w:val="0070C0"/>
-              </w:rPr>
-              <w:lastRenderedPageBreak/>
-              <w:t>LOCAL]</w:t>
+              <w:t>OPTIMIZE [NO_WRITE_TO_BINLOG | LOCAL]</w:t>
             </w:r>
             <w:r>
               <w:t xml:space="preserve"> TABLE tbl_name [, tbl_name] …</w:t>
@@ -18819,6 +17701,7 @@
         <w:rPr>
           <w:rFonts w:hint="eastAsia"/>
         </w:rPr>
+        <w:lastRenderedPageBreak/>
         <w:t>分区</w:t>
       </w:r>
       <w:r>
@@ -19441,7 +18324,6 @@
         <w:rPr>
           <w:rFonts w:hint="eastAsia"/>
         </w:rPr>
-        <w:lastRenderedPageBreak/>
         <w:t>遗留问题</w:t>
       </w:r>
     </w:p>
@@ -19467,9 +18349,9 @@
         <w:tblLook w:val="04A0" w:firstRow="1" w:lastRow="0" w:firstColumn="1" w:lastColumn="0" w:noHBand="0" w:noVBand="1"/>
       </w:tblPr>
       <w:tblGrid>
-        <w:gridCol w:w="869"/>
-        <w:gridCol w:w="2483"/>
-        <w:gridCol w:w="4587"/>
+        <w:gridCol w:w="862"/>
+        <w:gridCol w:w="2460"/>
+        <w:gridCol w:w="4617"/>
       </w:tblGrid>
       <w:tr>
         <w:tc>
@@ -19744,6 +18626,233 @@
             </w:r>
             <w:r>
               <w:t>不唯一。</w:t>
+            </w:r>
+          </w:p>
+          <w:p>
+            <w:pPr>
+              <w:ind w:left="0"/>
+            </w:pPr>
+            <w:r>
+              <w:rPr>
+                <w:rFonts w:hint="eastAsia"/>
+              </w:rPr>
+              <w:t>待</w:t>
+            </w:r>
+            <w:r>
+              <w:rPr>
+                <w:rFonts w:hint="eastAsia"/>
+              </w:rPr>
+              <w:t xml:space="preserve"> SEQUOIADBMAINSTREAM-4269 </w:t>
+            </w:r>
+            <w:r>
+              <w:rPr>
+                <w:rFonts w:hint="eastAsia"/>
+              </w:rPr>
+              <w:t>完成</w:t>
+            </w:r>
+            <w:r>
+              <w:t>后对接</w:t>
+            </w:r>
+          </w:p>
+        </w:tc>
+      </w:tr>
+      <w:tr>
+        <w:tc>
+          <w:tcPr>
+            <w:tcW w:w="885" w:type="dxa"/>
+          </w:tcPr>
+          <w:p>
+            <w:pPr>
+              <w:ind w:left="0"/>
+            </w:pPr>
+            <w:r>
+              <w:rPr>
+                <w:rFonts w:hint="eastAsia"/>
+              </w:rPr>
+              <w:t>2</w:t>
+            </w:r>
+          </w:p>
+        </w:tc>
+        <w:tc>
+          <w:tcPr>
+            <w:tcW w:w="2552" w:type="dxa"/>
+          </w:tcPr>
+          <w:p>
+            <w:pPr>
+              <w:ind w:left="0"/>
+            </w:pPr>
+            <w:r>
+              <w:rPr>
+                <w:rFonts w:hint="eastAsia"/>
+              </w:rPr>
+              <w:t>未</w:t>
+            </w:r>
+            <w:r>
+              <w:t>支持索引重命名</w:t>
+            </w:r>
+          </w:p>
+        </w:tc>
+        <w:tc>
+          <w:tcPr>
+            <w:tcW w:w="4728" w:type="dxa"/>
+          </w:tcPr>
+          <w:p>
+            <w:pPr>
+              <w:ind w:left="0"/>
+            </w:pPr>
+            <w:r>
+              <w:rPr>
+                <w:rFonts w:hint="eastAsia"/>
+              </w:rPr>
+              <w:t>需</w:t>
+            </w:r>
+            <w:r>
+              <w:rPr>
+                <w:rFonts w:hint="eastAsia"/>
+              </w:rPr>
+              <w:t xml:space="preserve"> SDB </w:t>
+            </w:r>
+            <w:r>
+              <w:rPr>
+                <w:rFonts w:hint="eastAsia"/>
+              </w:rPr>
+              <w:t>功能支持</w:t>
+            </w:r>
+            <w:r>
+              <w:t>。待</w:t>
+            </w:r>
+            <w:r>
+              <w:rPr>
+                <w:rFonts w:hint="eastAsia"/>
+              </w:rPr>
+              <w:t xml:space="preserve">SEQUOIADBMAINSTREAM-4270 </w:t>
+            </w:r>
+            <w:r>
+              <w:rPr>
+                <w:rFonts w:hint="eastAsia"/>
+              </w:rPr>
+              <w:t>完成</w:t>
+            </w:r>
+            <w:r>
+              <w:t>后</w:t>
+            </w:r>
+            <w:r>
+              <w:rPr>
+                <w:rFonts w:hint="eastAsia"/>
+              </w:rPr>
+              <w:t>对接</w:t>
+            </w:r>
+            <w:r>
+              <w:t>。</w:t>
+            </w:r>
+          </w:p>
+        </w:tc>
+      </w:tr>
+      <w:tr>
+        <w:tc>
+          <w:tcPr>
+            <w:tcW w:w="885" w:type="dxa"/>
+          </w:tcPr>
+          <w:p>
+            <w:pPr>
+              <w:ind w:left="0"/>
+              <w:rPr>
+                <w:rFonts w:hint="eastAsia"/>
+              </w:rPr>
+            </w:pPr>
+            <w:r>
+              <w:rPr>
+                <w:rFonts w:hint="eastAsia"/>
+              </w:rPr>
+              <w:t>3</w:t>
+            </w:r>
+          </w:p>
+        </w:tc>
+        <w:tc>
+          <w:tcPr>
+            <w:tcW w:w="2552" w:type="dxa"/>
+          </w:tcPr>
+          <w:p>
+            <w:pPr>
+              <w:ind w:left="0"/>
+              <w:rPr>
+                <w:rFonts w:hint="eastAsia"/>
+              </w:rPr>
+            </w:pPr>
+            <w:r>
+              <w:t xml:space="preserve">ALTER TABLE </w:t>
+            </w:r>
+            <w:r>
+              <w:t>操作</w:t>
+            </w:r>
+            <w:r>
+              <w:t>需要</w:t>
+            </w:r>
+            <w:r>
+              <w:t xml:space="preserve"> SDB </w:t>
+            </w:r>
+            <w:r>
+              <w:t>提供显式加表锁的能力</w:t>
+            </w:r>
+            <w:r>
+              <w:rPr>
+                <w:rFonts w:hint="eastAsia"/>
+              </w:rPr>
+              <w:t>。</w:t>
+            </w:r>
+          </w:p>
+        </w:tc>
+        <w:tc>
+          <w:tcPr>
+            <w:tcW w:w="4728" w:type="dxa"/>
+          </w:tcPr>
+          <w:p>
+            <w:pPr>
+              <w:ind w:left="0"/>
+              <w:rPr>
+                <w:rFonts w:ascii="Arial" w:eastAsia="宋体" w:hAnsi="Arial" w:cs="Arial" w:hint="eastAsia"/>
+                <w:color w:val="333333"/>
+                <w:kern w:val="0"/>
+                <w:szCs w:val="21"/>
+              </w:rPr>
+            </w:pPr>
+            <w:r>
+              <w:rPr>
+                <w:rFonts w:hint="eastAsia"/>
+              </w:rPr>
+              <w:t>需</w:t>
+            </w:r>
+            <w:r>
+              <w:rPr>
+                <w:rFonts w:hint="eastAsia"/>
+              </w:rPr>
+              <w:t xml:space="preserve">SDB </w:t>
+            </w:r>
+            <w:r>
+              <w:rPr>
+                <w:rFonts w:hint="eastAsia"/>
+              </w:rPr>
+              <w:t>功能</w:t>
+            </w:r>
+            <w:r>
+              <w:t>对接。待</w:t>
+            </w:r>
+            <w:hyperlink r:id="rId12" w:history="1">
+              <w:r>
+                <w:t>SEQUOIADBMAINSTREAM-4301</w:t>
+              </w:r>
+            </w:hyperlink>
+            <w:r>
+              <w:t xml:space="preserve"> </w:t>
+            </w:r>
+            <w:r>
+              <w:rPr>
+                <w:rFonts w:hint="eastAsia"/>
+              </w:rPr>
+              <w:t>完成</w:t>
+            </w:r>
+            <w:r>
+              <w:t>后对接。</w:t>
             </w:r>
           </w:p>
         </w:tc>
@@ -19903,6 +19012,7 @@
                 <w:rFonts w:hint="eastAsia"/>
                 <w:b/>
               </w:rPr>
+              <w:lastRenderedPageBreak/>
               <w:t>用例编号</w:t>
             </w:r>
           </w:p>
@@ -21366,6 +20476,118 @@
     </w:lvl>
   </w:abstractNum>
   <w:abstractNum w:abstractNumId="8" w15:restartNumberingAfterBreak="0">
+    <w:nsid w:val="4E4D2786"/>
+    <w:multiLevelType w:val="hybridMultilevel"/>
+    <w:tmpl w:val="0174FEE2"/>
+    <w:lvl w:ilvl="0" w:tplc="BB78846E">
+      <w:numFmt w:val="bullet"/>
+      <w:lvlText w:val=""/>
+      <w:lvlJc w:val="left"/>
+      <w:pPr>
+        <w:ind w:left="717" w:hanging="360"/>
+      </w:pPr>
+      <w:rPr>
+        <w:rFonts w:ascii="Wingdings" w:eastAsiaTheme="minorEastAsia" w:hAnsi="Wingdings" w:cstheme="minorBidi" w:hint="default"/>
+      </w:rPr>
+    </w:lvl>
+    <w:lvl w:ilvl="1" w:tplc="04090003" w:tentative="1">
+      <w:start w:val="1"/>
+      <w:numFmt w:val="bullet"/>
+      <w:lvlText w:val=""/>
+      <w:lvlJc w:val="left"/>
+      <w:pPr>
+        <w:ind w:left="1197" w:hanging="420"/>
+      </w:pPr>
+      <w:rPr>
+        <w:rFonts w:ascii="Wingdings" w:hAnsi="Wingdings" w:hint="default"/>
+      </w:rPr>
+    </w:lvl>
+    <w:lvl w:ilvl="2" w:tplc="04090005" w:tentative="1">
+      <w:start w:val="1"/>
+      <w:numFmt w:val="bullet"/>
+      <w:lvlText w:val=""/>
+      <w:lvlJc w:val="left"/>
+      <w:pPr>
+        <w:ind w:left="1617" w:hanging="420"/>
+      </w:pPr>
+      <w:rPr>
+        <w:rFonts w:ascii="Wingdings" w:hAnsi="Wingdings" w:hint="default"/>
+      </w:rPr>
+    </w:lvl>
+    <w:lvl w:ilvl="3" w:tplc="04090001" w:tentative="1">
+      <w:start w:val="1"/>
+      <w:numFmt w:val="bullet"/>
+      <w:lvlText w:val=""/>
+      <w:lvlJc w:val="left"/>
+      <w:pPr>
+        <w:ind w:left="2037" w:hanging="420"/>
+      </w:pPr>
+      <w:rPr>
+        <w:rFonts w:ascii="Wingdings" w:hAnsi="Wingdings" w:hint="default"/>
+      </w:rPr>
+    </w:lvl>
+    <w:lvl w:ilvl="4" w:tplc="04090003" w:tentative="1">
+      <w:start w:val="1"/>
+      <w:numFmt w:val="bullet"/>
+      <w:lvlText w:val=""/>
+      <w:lvlJc w:val="left"/>
+      <w:pPr>
+        <w:ind w:left="2457" w:hanging="420"/>
+      </w:pPr>
+      <w:rPr>
+        <w:rFonts w:ascii="Wingdings" w:hAnsi="Wingdings" w:hint="default"/>
+      </w:rPr>
+    </w:lvl>
+    <w:lvl w:ilvl="5" w:tplc="04090005" w:tentative="1">
+      <w:start w:val="1"/>
+      <w:numFmt w:val="bullet"/>
+      <w:lvlText w:val=""/>
+      <w:lvlJc w:val="left"/>
+      <w:pPr>
+        <w:ind w:left="2877" w:hanging="420"/>
+      </w:pPr>
+      <w:rPr>
+        <w:rFonts w:ascii="Wingdings" w:hAnsi="Wingdings" w:hint="default"/>
+      </w:rPr>
+    </w:lvl>
+    <w:lvl w:ilvl="6" w:tplc="04090001" w:tentative="1">
+      <w:start w:val="1"/>
+      <w:numFmt w:val="bullet"/>
+      <w:lvlText w:val=""/>
+      <w:lvlJc w:val="left"/>
+      <w:pPr>
+        <w:ind w:left="3297" w:hanging="420"/>
+      </w:pPr>
+      <w:rPr>
+        <w:rFonts w:ascii="Wingdings" w:hAnsi="Wingdings" w:hint="default"/>
+      </w:rPr>
+    </w:lvl>
+    <w:lvl w:ilvl="7" w:tplc="04090003" w:tentative="1">
+      <w:start w:val="1"/>
+      <w:numFmt w:val="bullet"/>
+      <w:lvlText w:val=""/>
+      <w:lvlJc w:val="left"/>
+      <w:pPr>
+        <w:ind w:left="3717" w:hanging="420"/>
+      </w:pPr>
+      <w:rPr>
+        <w:rFonts w:ascii="Wingdings" w:hAnsi="Wingdings" w:hint="default"/>
+      </w:rPr>
+    </w:lvl>
+    <w:lvl w:ilvl="8" w:tplc="04090005" w:tentative="1">
+      <w:start w:val="1"/>
+      <w:numFmt w:val="bullet"/>
+      <w:lvlText w:val=""/>
+      <w:lvlJc w:val="left"/>
+      <w:pPr>
+        <w:ind w:left="4137" w:hanging="420"/>
+      </w:pPr>
+      <w:rPr>
+        <w:rFonts w:ascii="Wingdings" w:hAnsi="Wingdings" w:hint="default"/>
+      </w:rPr>
+    </w:lvl>
+  </w:abstractNum>
+  <w:abstractNum w:abstractNumId="9" w15:restartNumberingAfterBreak="0">
     <w:nsid w:val="4F3023A2"/>
     <w:multiLevelType w:val="hybridMultilevel"/>
     <w:tmpl w:val="184ED2AC"/>
@@ -21454,7 +20676,7 @@
       </w:pPr>
     </w:lvl>
   </w:abstractNum>
-  <w:abstractNum w:abstractNumId="9" w15:restartNumberingAfterBreak="0">
+  <w:abstractNum w:abstractNumId="10" w15:restartNumberingAfterBreak="0">
     <w:nsid w:val="589E00D2"/>
     <w:multiLevelType w:val="hybridMultilevel"/>
     <w:tmpl w:val="712282AA"/>
@@ -21541,7 +20763,7 @@
       </w:pPr>
     </w:lvl>
   </w:abstractNum>
-  <w:abstractNum w:abstractNumId="10" w15:restartNumberingAfterBreak="0">
+  <w:abstractNum w:abstractNumId="11" w15:restartNumberingAfterBreak="0">
     <w:nsid w:val="69A6529E"/>
     <w:multiLevelType w:val="hybridMultilevel"/>
     <w:tmpl w:val="3AF07E74"/>
@@ -21630,7 +20852,232 @@
       </w:pPr>
     </w:lvl>
   </w:abstractNum>
-  <w:abstractNum w:abstractNumId="11" w15:restartNumberingAfterBreak="0">
+  <w:abstractNum w:abstractNumId="12" w15:restartNumberingAfterBreak="0">
+    <w:nsid w:val="6D257949"/>
+    <w:multiLevelType w:val="hybridMultilevel"/>
+    <w:tmpl w:val="9E92D104"/>
+    <w:lvl w:ilvl="0" w:tplc="C974173C">
+      <w:numFmt w:val="bullet"/>
+      <w:lvlText w:val=""/>
+      <w:lvlJc w:val="left"/>
+      <w:pPr>
+        <w:ind w:left="720" w:hanging="360"/>
+      </w:pPr>
+      <w:rPr>
+        <w:rFonts w:ascii="Wingdings" w:eastAsiaTheme="minorEastAsia" w:hAnsi="Wingdings" w:cstheme="minorBidi" w:hint="default"/>
+      </w:rPr>
+    </w:lvl>
+    <w:lvl w:ilvl="1" w:tplc="04090003" w:tentative="1">
+      <w:start w:val="1"/>
+      <w:numFmt w:val="bullet"/>
+      <w:lvlText w:val=""/>
+      <w:lvlJc w:val="left"/>
+      <w:pPr>
+        <w:ind w:left="1200" w:hanging="420"/>
+      </w:pPr>
+      <w:rPr>
+        <w:rFonts w:ascii="Wingdings" w:hAnsi="Wingdings" w:hint="default"/>
+      </w:rPr>
+    </w:lvl>
+    <w:lvl w:ilvl="2" w:tplc="04090005" w:tentative="1">
+      <w:start w:val="1"/>
+      <w:numFmt w:val="bullet"/>
+      <w:lvlText w:val=""/>
+      <w:lvlJc w:val="left"/>
+      <w:pPr>
+        <w:ind w:left="1620" w:hanging="420"/>
+      </w:pPr>
+      <w:rPr>
+        <w:rFonts w:ascii="Wingdings" w:hAnsi="Wingdings" w:hint="default"/>
+      </w:rPr>
+    </w:lvl>
+    <w:lvl w:ilvl="3" w:tplc="04090001" w:tentative="1">
+      <w:start w:val="1"/>
+      <w:numFmt w:val="bullet"/>
+      <w:lvlText w:val=""/>
+      <w:lvlJc w:val="left"/>
+      <w:pPr>
+        <w:ind w:left="2040" w:hanging="420"/>
+      </w:pPr>
+      <w:rPr>
+        <w:rFonts w:ascii="Wingdings" w:hAnsi="Wingdings" w:hint="default"/>
+      </w:rPr>
+    </w:lvl>
+    <w:lvl w:ilvl="4" w:tplc="04090003" w:tentative="1">
+      <w:start w:val="1"/>
+      <w:numFmt w:val="bullet"/>
+      <w:lvlText w:val=""/>
+      <w:lvlJc w:val="left"/>
+      <w:pPr>
+        <w:ind w:left="2460" w:hanging="420"/>
+      </w:pPr>
+      <w:rPr>
+        <w:rFonts w:ascii="Wingdings" w:hAnsi="Wingdings" w:hint="default"/>
+      </w:rPr>
+    </w:lvl>
+    <w:lvl w:ilvl="5" w:tplc="04090005" w:tentative="1">
+      <w:start w:val="1"/>
+      <w:numFmt w:val="bullet"/>
+      <w:lvlText w:val=""/>
+      <w:lvlJc w:val="left"/>
+      <w:pPr>
+        <w:ind w:left="2880" w:hanging="420"/>
+      </w:pPr>
+      <w:rPr>
+        <w:rFonts w:ascii="Wingdings" w:hAnsi="Wingdings" w:hint="default"/>
+      </w:rPr>
+    </w:lvl>
+    <w:lvl w:ilvl="6" w:tplc="04090001" w:tentative="1">
+      <w:start w:val="1"/>
+      <w:numFmt w:val="bullet"/>
+      <w:lvlText w:val=""/>
+      <w:lvlJc w:val="left"/>
+      <w:pPr>
+        <w:ind w:left="3300" w:hanging="420"/>
+      </w:pPr>
+      <w:rPr>
+        <w:rFonts w:ascii="Wingdings" w:hAnsi="Wingdings" w:hint="default"/>
+      </w:rPr>
+    </w:lvl>
+    <w:lvl w:ilvl="7" w:tplc="04090003" w:tentative="1">
+      <w:start w:val="1"/>
+      <w:numFmt w:val="bullet"/>
+      <w:lvlText w:val=""/>
+      <w:lvlJc w:val="left"/>
+      <w:pPr>
+        <w:ind w:left="3720" w:hanging="420"/>
+      </w:pPr>
+      <w:rPr>
+        <w:rFonts w:ascii="Wingdings" w:hAnsi="Wingdings" w:hint="default"/>
+      </w:rPr>
+    </w:lvl>
+    <w:lvl w:ilvl="8" w:tplc="04090005" w:tentative="1">
+      <w:start w:val="1"/>
+      <w:numFmt w:val="bullet"/>
+      <w:lvlText w:val=""/>
+      <w:lvlJc w:val="left"/>
+      <w:pPr>
+        <w:ind w:left="4140" w:hanging="420"/>
+      </w:pPr>
+      <w:rPr>
+        <w:rFonts w:ascii="Wingdings" w:hAnsi="Wingdings" w:hint="default"/>
+      </w:rPr>
+    </w:lvl>
+  </w:abstractNum>
+  <w:abstractNum w:abstractNumId="13" w15:restartNumberingAfterBreak="0">
+    <w:nsid w:val="6E737CDC"/>
+    <w:multiLevelType w:val="multilevel"/>
+    <w:tmpl w:val="93F217DA"/>
+    <w:lvl w:ilvl="0">
+      <w:start w:val="1"/>
+      <w:numFmt w:val="decimal"/>
+      <w:lvlText w:val="%1."/>
+      <w:lvlJc w:val="left"/>
+      <w:pPr>
+        <w:tabs>
+          <w:tab w:val="num" w:pos="720"/>
+        </w:tabs>
+        <w:ind w:left="720" w:hanging="360"/>
+      </w:pPr>
+    </w:lvl>
+    <w:lvl w:ilvl="1" w:tentative="1">
+      <w:start w:val="1"/>
+      <w:numFmt w:val="decimal"/>
+      <w:lvlText w:val="%2."/>
+      <w:lvlJc w:val="left"/>
+      <w:pPr>
+        <w:tabs>
+          <w:tab w:val="num" w:pos="1440"/>
+        </w:tabs>
+        <w:ind w:left="1440" w:hanging="360"/>
+      </w:pPr>
+    </w:lvl>
+    <w:lvl w:ilvl="2" w:tentative="1">
+      <w:start w:val="1"/>
+      <w:numFmt w:val="decimal"/>
+      <w:lvlText w:val="%3."/>
+      <w:lvlJc w:val="left"/>
+      <w:pPr>
+        <w:tabs>
+          <w:tab w:val="num" w:pos="2160"/>
+        </w:tabs>
+        <w:ind w:left="2160" w:hanging="360"/>
+      </w:pPr>
+    </w:lvl>
+    <w:lvl w:ilvl="3" w:tentative="1">
+      <w:start w:val="1"/>
+      <w:numFmt w:val="decimal"/>
+      <w:lvlText w:val="%4."/>
+      <w:lvlJc w:val="left"/>
+      <w:pPr>
+        <w:tabs>
+          <w:tab w:val="num" w:pos="2880"/>
+        </w:tabs>
+        <w:ind w:left="2880" w:hanging="360"/>
+      </w:pPr>
+    </w:lvl>
+    <w:lvl w:ilvl="4" w:tentative="1">
+      <w:start w:val="1"/>
+      <w:numFmt w:val="decimal"/>
+      <w:lvlText w:val="%5."/>
+      <w:lvlJc w:val="left"/>
+      <w:pPr>
+        <w:tabs>
+          <w:tab w:val="num" w:pos="3600"/>
+        </w:tabs>
+        <w:ind w:left="3600" w:hanging="360"/>
+      </w:pPr>
+    </w:lvl>
+    <w:lvl w:ilvl="5" w:tentative="1">
+      <w:start w:val="1"/>
+      <w:numFmt w:val="decimal"/>
+      <w:lvlText w:val="%6."/>
+      <w:lvlJc w:val="left"/>
+      <w:pPr>
+        <w:tabs>
+          <w:tab w:val="num" w:pos="4320"/>
+        </w:tabs>
+        <w:ind w:left="4320" w:hanging="360"/>
+      </w:pPr>
+    </w:lvl>
+    <w:lvl w:ilvl="6" w:tentative="1">
+      <w:start w:val="1"/>
+      <w:numFmt w:val="decimal"/>
+      <w:lvlText w:val="%7."/>
+      <w:lvlJc w:val="left"/>
+      <w:pPr>
+        <w:tabs>
+          <w:tab w:val="num" w:pos="5040"/>
+        </w:tabs>
+        <w:ind w:left="5040" w:hanging="360"/>
+      </w:pPr>
+    </w:lvl>
+    <w:lvl w:ilvl="7" w:tentative="1">
+      <w:start w:val="1"/>
+      <w:numFmt w:val="decimal"/>
+      <w:lvlText w:val="%8."/>
+      <w:lvlJc w:val="left"/>
+      <w:pPr>
+        <w:tabs>
+          <w:tab w:val="num" w:pos="5760"/>
+        </w:tabs>
+        <w:ind w:left="5760" w:hanging="360"/>
+      </w:pPr>
+    </w:lvl>
+    <w:lvl w:ilvl="8" w:tentative="1">
+      <w:start w:val="1"/>
+      <w:numFmt w:val="decimal"/>
+      <w:lvlText w:val="%9."/>
+      <w:lvlJc w:val="left"/>
+      <w:pPr>
+        <w:tabs>
+          <w:tab w:val="num" w:pos="6480"/>
+        </w:tabs>
+        <w:ind w:left="6480" w:hanging="360"/>
+      </w:pPr>
+    </w:lvl>
+  </w:abstractNum>
+  <w:abstractNum w:abstractNumId="14" w15:restartNumberingAfterBreak="0">
     <w:nsid w:val="7ABD0A28"/>
     <w:multiLevelType w:val="hybridMultilevel"/>
     <w:tmpl w:val="AAFE3BF2"/>
@@ -21719,7 +21166,7 @@
       </w:pPr>
     </w:lvl>
   </w:abstractNum>
-  <w:abstractNum w:abstractNumId="12" w15:restartNumberingAfterBreak="0">
+  <w:abstractNum w:abstractNumId="15" w15:restartNumberingAfterBreak="0">
     <w:nsid w:val="7CC73259"/>
     <w:multiLevelType w:val="hybridMultilevel"/>
     <w:tmpl w:val="4D22A75E"/>
@@ -21812,7 +21259,7 @@
     <w:abstractNumId w:val="2"/>
   </w:num>
   <w:num w:numId="2">
-    <w:abstractNumId w:val="9"/>
+    <w:abstractNumId w:val="10"/>
   </w:num>
   <w:num w:numId="3">
     <w:abstractNumId w:val="3"/>
@@ -21839,22 +21286,31 @@
     <w:abstractNumId w:val="0"/>
   </w:num>
   <w:num w:numId="11">
-    <w:abstractNumId w:val="11"/>
+    <w:abstractNumId w:val="14"/>
   </w:num>
   <w:num w:numId="12">
     <w:abstractNumId w:val="4"/>
   </w:num>
   <w:num w:numId="13">
-    <w:abstractNumId w:val="12"/>
+    <w:abstractNumId w:val="15"/>
   </w:num>
   <w:num w:numId="14">
     <w:abstractNumId w:val="5"/>
   </w:num>
   <w:num w:numId="15">
+    <w:abstractNumId w:val="9"/>
+  </w:num>
+  <w:num w:numId="16">
+    <w:abstractNumId w:val="11"/>
+  </w:num>
+  <w:num w:numId="17">
+    <w:abstractNumId w:val="12"/>
+  </w:num>
+  <w:num w:numId="18">
     <w:abstractNumId w:val="8"/>
   </w:num>
-  <w:num w:numId="16">
-    <w:abstractNumId w:val="10"/>
+  <w:num w:numId="19">
+    <w:abstractNumId w:val="13"/>
   </w:num>
 </w:numbering>
 </file>
@@ -22681,6 +22137,29 @@
       <w:szCs w:val="18"/>
     </w:rPr>
   </w:style>
+  <w:style w:type="character" w:styleId="af4">
+    <w:name w:val="Hyperlink"/>
+    <w:basedOn w:val="a0"/>
+    <w:uiPriority w:val="99"/>
+    <w:unhideWhenUsed/>
+    <w:rsid w:val="00F440CA"/>
+    <w:rPr>
+      <w:color w:val="0000FF"/>
+      <w:u w:val="single"/>
+    </w:rPr>
+  </w:style>
+  <w:style w:type="character" w:styleId="af5">
+    <w:name w:val="FollowedHyperlink"/>
+    <w:basedOn w:val="a0"/>
+    <w:uiPriority w:val="99"/>
+    <w:semiHidden/>
+    <w:unhideWhenUsed/>
+    <w:rsid w:val="003F6223"/>
+    <w:rPr>
+      <w:color w:val="800080" w:themeColor="followedHyperlink"/>
+      <w:u w:val="single"/>
+    </w:rPr>
+  </w:style>
 </w:styles>
 </file>
 
@@ -22972,7 +22451,7 @@
 </file>
 
 <file path=customXml/itemProps1.xml><?xml version="1.0" encoding="utf-8"?>
-<ds:datastoreItem xmlns:ds="http://schemas.openxmlformats.org/officeDocument/2006/customXml" ds:itemID="{E9ACDDDB-DE61-473C-A852-E8627F22935F}">
+<ds:datastoreItem xmlns:ds="http://schemas.openxmlformats.org/officeDocument/2006/customXml" ds:itemID="{6CA7EA10-B901-412B-B0ED-6A6298B27C6E}">
   <ds:schemaRefs>
     <ds:schemaRef ds:uri="http://schemas.openxmlformats.org/officeDocument/2006/bibliography"/>
   </ds:schemaRefs>

</xml_diff>

<commit_message>
SEQUOIASQLMAINSTREAM-243：根据评审意见更新 ALTER COLUMN 方案
git-svn-id: http://192.168.20.11/sequoiadb/trunk@40815 6121f079-4a18-41d3-8c30-8870a322f2c2
</commit_message>
<xml_diff>
--- a/internal_doc/03.开发设计/mysql/Story-mysql支持ALTER TABLE.docx
+++ b/internal_doc/03.开发设计/mysql/Story-mysql支持ALTER TABLE.docx
@@ -8661,9 +8661,6 @@
             <w:pPr>
               <w:pStyle w:val="aa"/>
               <w:ind w:left="105" w:hangingChars="50" w:hanging="105"/>
-              <w:rPr>
-                <w:rFonts w:hint="eastAsia"/>
-              </w:rPr>
             </w:pPr>
             <w:r>
               <w:rPr>
@@ -8712,9 +8709,6 @@
             <w:pPr>
               <w:pStyle w:val="aa"/>
               <w:ind w:left="0" w:firstLineChars="0" w:firstLine="0"/>
-              <w:rPr>
-                <w:rFonts w:hint="eastAsia"/>
-              </w:rPr>
             </w:pPr>
             <w:r>
               <w:rPr>
@@ -9136,9 +9130,6 @@
             <w:pPr>
               <w:pStyle w:val="aa"/>
               <w:ind w:left="0" w:firstLineChars="0" w:firstLine="0"/>
-              <w:rPr>
-                <w:rFonts w:hint="eastAsia"/>
-              </w:rPr>
             </w:pPr>
             <w:r>
               <w:rPr>
@@ -9368,9 +9359,6 @@
             <w:pPr>
               <w:pStyle w:val="aa"/>
               <w:ind w:left="0" w:firstLineChars="0" w:firstLine="0"/>
-              <w:rPr>
-                <w:rFonts w:hint="eastAsia"/>
-              </w:rPr>
             </w:pPr>
             <w:r>
               <w:rPr>
@@ -10138,9 +10126,6 @@
             <w:pPr>
               <w:pStyle w:val="aa"/>
               <w:ind w:left="0" w:firstLineChars="0" w:firstLine="0"/>
-              <w:rPr>
-                <w:rFonts w:hint="eastAsia"/>
-              </w:rPr>
             </w:pPr>
             <w:r>
               <w:rPr>
@@ -11285,9 +11270,6 @@
             <w:pPr>
               <w:pStyle w:val="aa"/>
               <w:ind w:left="0" w:firstLineChars="0" w:firstLine="0"/>
-              <w:rPr>
-                <w:rFonts w:hint="eastAsia"/>
-              </w:rPr>
             </w:pPr>
             <w:r>
               <w:rPr>
@@ -11726,9 +11708,6 @@
           <w:numId w:val="18"/>
         </w:numPr>
         <w:ind w:firstLineChars="0"/>
-        <w:rPr>
-          <w:rFonts w:hint="eastAsia"/>
-        </w:rPr>
       </w:pPr>
       <w:r>
         <w:rPr>
@@ -11792,9 +11771,6 @@
           <w:numId w:val="18"/>
         </w:numPr>
         <w:ind w:firstLineChars="0"/>
-        <w:rPr>
-          <w:rFonts w:hint="eastAsia"/>
-        </w:rPr>
       </w:pPr>
       <w:r>
         <w:rPr>
@@ -11814,9 +11790,6 @@
           <w:numId w:val="18"/>
         </w:numPr>
         <w:ind w:firstLineChars="0"/>
-        <w:rPr>
-          <w:rFonts w:hint="eastAsia"/>
-        </w:rPr>
       </w:pPr>
       <w:r>
         <w:rPr>
@@ -11870,6 +11843,9 @@
           <w:numId w:val="18"/>
         </w:numPr>
         <w:ind w:firstLineChars="0"/>
+        <w:rPr>
+          <w:rFonts w:hint="eastAsia"/>
+        </w:rPr>
       </w:pPr>
       <w:r>
         <w:rPr>
@@ -11922,49 +11898,8 @@
         </w:rPr>
         <w:t>。</w:t>
       </w:r>
-    </w:p>
-    <w:p>
-      <w:pPr>
-        <w:rPr>
-          <w:rFonts w:hint="eastAsia"/>
-        </w:rPr>
-      </w:pPr>
-      <w:r>
-        <w:rPr>
-          <w:rFonts w:hint="eastAsia"/>
-        </w:rPr>
-        <w:t>其中部分</w:t>
-      </w:r>
-      <w:r>
-        <w:t>操作无法通过一次</w:t>
-      </w:r>
-      <w:r>
-        <w:rPr>
-          <w:rFonts w:hint="eastAsia"/>
-        </w:rPr>
-        <w:t xml:space="preserve"> </w:t>
-      </w:r>
-      <w:r>
-        <w:t xml:space="preserve">UPDATE </w:t>
-      </w:r>
-      <w:r>
-        <w:rPr>
-          <w:rFonts w:hint="eastAsia"/>
-        </w:rPr>
-        <w:t>命令</w:t>
-      </w:r>
-      <w:r>
-        <w:t>完成</w:t>
-      </w:r>
-      <w:r>
-        <w:rPr>
-          <w:rFonts w:hint="eastAsia"/>
-        </w:rPr>
-        <w:t>，</w:t>
-      </w:r>
-      <w:r>
-        <w:t>需要逐条查询更新。</w:t>
-      </w:r>
+      <w:bookmarkStart w:id="0" w:name="_GoBack"/>
+      <w:bookmarkEnd w:id="0"/>
     </w:p>
     <w:p>
       <w:pPr>
@@ -11988,7 +11923,41 @@
         <w:rPr>
           <w:rFonts w:hint="eastAsia"/>
         </w:rPr>
-        <w:t>，需</w:t>
+        <w:t>，</w:t>
+      </w:r>
+      <w:r>
+        <w:rPr>
+          <w:rFonts w:hint="eastAsia"/>
+        </w:rPr>
+        <w:t>或</w:t>
+      </w:r>
+      <w:r>
+        <w:t>把</w:t>
+      </w:r>
+      <w:r>
+        <w:rPr>
+          <w:rFonts w:hint="eastAsia"/>
+        </w:rPr>
+        <w:t>某</w:t>
+      </w:r>
+      <w:r>
+        <w:t>列</w:t>
+      </w:r>
+      <w:r>
+        <w:rPr>
+          <w:rFonts w:hint="eastAsia"/>
+        </w:rPr>
+        <w:t>改</w:t>
+      </w:r>
+      <w:r>
+        <w:t>成自增字段列，</w:t>
+      </w:r>
+      <w:commentRangeStart w:id="1"/>
+      <w:r>
+        <w:rPr>
+          <w:rFonts w:hint="eastAsia"/>
+        </w:rPr>
+        <w:t>需</w:t>
       </w:r>
       <w:r>
         <w:t>要为</w:t>
@@ -12011,6 +11980,13 @@
       <w:r>
         <w:t>值</w:t>
       </w:r>
+      <w:commentRangeEnd w:id="1"/>
+      <w:r>
+        <w:rPr>
+          <w:rStyle w:val="ad"/>
+        </w:rPr>
+        <w:commentReference w:id="1"/>
+      </w:r>
       <w:r>
         <w:rPr>
           <w:rFonts w:hint="eastAsia"/>
@@ -12035,8 +12011,87 @@
       <w:r>
         <w:t>。</w:t>
       </w:r>
-      <w:bookmarkStart w:id="0" w:name="_GoBack"/>
-      <w:bookmarkEnd w:id="0"/>
+      <w:r>
+        <w:rPr>
+          <w:rFonts w:hint="eastAsia"/>
+        </w:rPr>
+        <w:t>在</w:t>
+      </w:r>
+      <w:r>
+        <w:rPr>
+          <w:rFonts w:hint="eastAsia"/>
+        </w:rPr>
+        <w:t xml:space="preserve"> innodb </w:t>
+      </w:r>
+      <w:r>
+        <w:rPr>
+          <w:rFonts w:hint="eastAsia"/>
+        </w:rPr>
+        <w:t>中，该</w:t>
+      </w:r>
+      <w:r>
+        <w:t>行为走</w:t>
+      </w:r>
+      <w:r>
+        <w:rPr>
+          <w:rFonts w:hint="eastAsia"/>
+        </w:rPr>
+        <w:t xml:space="preserve"> COPY</w:t>
+      </w:r>
+      <w:r>
+        <w:t xml:space="preserve"> </w:t>
+      </w:r>
+      <w:r>
+        <w:rPr>
+          <w:rFonts w:hint="eastAsia"/>
+        </w:rPr>
+        <w:t>算法</w:t>
+      </w:r>
+      <w:r>
+        <w:t>，因此</w:t>
+      </w:r>
+      <w:r>
+        <w:rPr>
+          <w:rFonts w:hint="eastAsia"/>
+        </w:rPr>
+        <w:t>当</w:t>
+      </w:r>
+      <w:r>
+        <w:t>列上有值，</w:t>
+      </w:r>
+      <w:r>
+        <w:rPr>
+          <w:rFonts w:hint="eastAsia"/>
+        </w:rPr>
+        <w:t>与</w:t>
+      </w:r>
+      <w:r>
+        <w:t>指定</w:t>
+      </w:r>
+      <w:r>
+        <w:rPr>
+          <w:rFonts w:hint="eastAsia"/>
+        </w:rPr>
+        <w:t>自增</w:t>
+      </w:r>
+      <w:r>
+        <w:t>字段值值插入</w:t>
+      </w:r>
+      <w:r>
+        <w:rPr>
+          <w:rFonts w:hint="eastAsia"/>
+        </w:rPr>
+        <w:t>的</w:t>
+      </w:r>
+      <w:r>
+        <w:t>处理原则一致</w:t>
+      </w:r>
+      <w:r>
+        <w:rPr>
+          <w:rFonts w:hint="eastAsia"/>
+        </w:rPr>
+        <w:t>。</w:t>
+      </w:r>
     </w:p>
     <w:p>
       <w:pPr>
@@ -12160,7 +12215,11 @@
         <w:t>则</w:t>
       </w:r>
       <w:r>
-        <w:t>会报错，该工作在</w:t>
+        <w:t>会报错，该工作</w:t>
+      </w:r>
+      <w:r>
+        <w:lastRenderedPageBreak/>
+        <w:t>在</w:t>
       </w:r>
       <w:r>
         <w:t xml:space="preserve"> SQL </w:t>
@@ -12188,7 +12247,6 @@
         <w:rPr>
           <w:rFonts w:hint="eastAsia"/>
         </w:rPr>
-        <w:lastRenderedPageBreak/>
         <w:t>如果</w:t>
       </w:r>
       <w:r>
@@ -12209,8 +12267,19 @@
         </w:rPr>
         <w:t>如果</w:t>
       </w:r>
-      <w:r>
-        <w:t>重命名列，则会重建索引。</w:t>
+      <w:commentRangeStart w:id="2"/>
+      <w:r>
+        <w:t>重命名列</w:t>
+      </w:r>
+      <w:commentRangeEnd w:id="2"/>
+      <w:r>
+        <w:rPr>
+          <w:rStyle w:val="ad"/>
+        </w:rPr>
+        <w:commentReference w:id="2"/>
+      </w:r>
+      <w:r>
+        <w:t>，则会重建索引。</w:t>
       </w:r>
     </w:p>
     <w:p>
@@ -12264,7 +12333,7 @@
         </w:rPr>
         <w:t xml:space="preserve"> </w:t>
       </w:r>
-      <w:hyperlink r:id="rId8" w:history="1">
+      <w:hyperlink r:id="rId10" w:history="1">
         <w:r>
           <w:rPr>
             <w:rStyle w:val="af4"/>
@@ -12315,13 +12384,7 @@
           <w:rPr>
             <w:rStyle w:val="af4"/>
           </w:rPr>
-          <w:t>转换兼容</w:t>
-        </w:r>
-        <w:r>
-          <w:rPr>
-            <w:rStyle w:val="af4"/>
-          </w:rPr>
-          <w:t>性</w:t>
+          <w:t>转换兼容性</w:t>
         </w:r>
         <w:r>
           <w:rPr>
@@ -12361,6 +12424,9 @@
       <w:pPr>
         <w:pStyle w:val="aa"/>
         <w:ind w:left="360" w:firstLineChars="0" w:firstLine="0"/>
+        <w:rPr>
+          <w:rFonts w:hint="eastAsia"/>
+        </w:rPr>
       </w:pPr>
       <w:r>
         <w:rPr>
@@ -12377,6 +12443,9 @@
         <w:pStyle w:val="aa"/>
         <w:ind w:left="360" w:firstLineChars="0" w:firstLine="0"/>
         <w:jc w:val="center"/>
+        <w:rPr>
+          <w:rFonts w:hint="eastAsia"/>
+        </w:rPr>
       </w:pPr>
       <w:r>
         <w:rPr>
@@ -12384,10 +12453,10 @@
           <w:noProof/>
         </w:rPr>
         <w:drawing>
-          <wp:inline distT="0" distB="0" distL="0" distR="0" wp14:anchorId="77447687" wp14:editId="33D38AC4">
-            <wp:extent cx="2245766" cy="2577653"/>
-            <wp:effectExtent l="0" t="0" r="2540" b="0"/>
-            <wp:docPr id="1" name="图片 1"/>
+          <wp:inline distT="0" distB="0" distL="0" distR="0" wp14:anchorId="065BEC2D" wp14:editId="044B7161">
+            <wp:extent cx="2684678" cy="2741934"/>
+            <wp:effectExtent l="0" t="0" r="1905" b="1270"/>
+            <wp:docPr id="2" name="图片 2"/>
             <wp:cNvGraphicFramePr>
               <a:graphicFrameLocks xmlns:a="http://schemas.openxmlformats.org/drawingml/2006/main" noChangeAspect="1"/>
             </wp:cNvGraphicFramePr>
@@ -12395,11 +12464,11 @@
               <a:graphicData uri="http://schemas.openxmlformats.org/drawingml/2006/picture">
                 <pic:pic xmlns:pic="http://schemas.openxmlformats.org/drawingml/2006/picture">
                   <pic:nvPicPr>
-                    <pic:cNvPr id="1" name="pic.PNG"/>
+                    <pic:cNvPr id="2" name="pic.PNG"/>
                     <pic:cNvPicPr/>
                   </pic:nvPicPr>
                   <pic:blipFill>
-                    <a:blip r:embed="rId9">
+                    <a:blip r:embed="rId11">
                       <a:extLst>
                         <a:ext uri="{28A0092B-C50C-407E-A947-70E740481C1C}">
                           <a14:useLocalDpi xmlns:a14="http://schemas.microsoft.com/office/drawing/2010/main" val="0"/>
@@ -12413,7 +12482,7 @@
                   <pic:spPr>
                     <a:xfrm>
                       <a:off x="0" y="0"/>
-                      <a:ext cx="2260175" cy="2594191"/>
+                      <a:ext cx="2696926" cy="2754444"/>
                     </a:xfrm>
                     <a:prstGeom prst="rect">
                       <a:avLst/>
@@ -12469,34 +12538,79 @@
         <w:t>实现</w:t>
       </w:r>
       <w:r>
-        <w:t>。根据</w:t>
-      </w:r>
-      <w:r>
-        <w:rPr>
-          <w:rFonts w:hint="eastAsia"/>
-        </w:rPr>
-        <w:t>转换</w:t>
-      </w:r>
-      <w:r>
-        <w:t>规则更新时，</w:t>
-      </w:r>
-      <w:r>
-        <w:rPr>
-          <w:rFonts w:hint="eastAsia"/>
-        </w:rPr>
-        <w:t>有的可以</w:t>
-      </w:r>
-      <w:r>
-        <w:t>通过一次更新请求完成，有的则需要查询后逐条更新。</w:t>
+        <w:t>。</w:t>
+      </w:r>
+      <w:r>
+        <w:rPr>
+          <w:rFonts w:hint="eastAsia"/>
+        </w:rPr>
+        <w:t>部分</w:t>
+      </w:r>
+      <w:r>
+        <w:t>类型转换不能通过</w:t>
+      </w:r>
+      <w:r>
+        <w:rPr>
+          <w:rFonts w:hint="eastAsia"/>
+        </w:rPr>
+        <w:t xml:space="preserve"> sdb </w:t>
+      </w:r>
+      <w:r>
+        <w:t>更新完成，</w:t>
+      </w:r>
+      <w:r>
+        <w:rPr>
+          <w:rFonts w:hint="eastAsia"/>
+        </w:rPr>
+        <w:t>暂时</w:t>
+      </w:r>
+      <w:r>
+        <w:t>禁止。详</w:t>
+      </w:r>
+      <w:r>
+        <w:rPr>
+          <w:rFonts w:hint="eastAsia"/>
+        </w:rPr>
+        <w:t>见</w:t>
+      </w:r>
+      <w:r>
+        <w:t xml:space="preserve">MySQL </w:t>
+      </w:r>
+      <w:r>
+        <w:rPr>
+          <w:rFonts w:hint="eastAsia"/>
+        </w:rPr>
+        <w:t>类型</w:t>
+      </w:r>
+      <w:r>
+        <w:t>转换兼容性</w:t>
+      </w:r>
+      <w:r>
+        <w:rPr>
+          <w:rFonts w:hint="eastAsia"/>
+        </w:rPr>
+        <w:t>与</w:t>
+      </w:r>
+      <w:r>
+        <w:t>转换规则</w:t>
+      </w:r>
+      <w:r>
+        <w:rPr>
+          <w:rFonts w:hint="eastAsia"/>
+        </w:rPr>
+        <w:t>.xlsx</w:t>
+      </w:r>
+      <w:r>
+        <w:rPr>
+          <w:rFonts w:hint="eastAsia"/>
+        </w:rPr>
+        <w:t>。</w:t>
       </w:r>
     </w:p>
     <w:p>
       <w:pPr>
         <w:pStyle w:val="aa"/>
         <w:ind w:left="360" w:firstLineChars="0" w:firstLine="0"/>
-        <w:rPr>
-          <w:rFonts w:hint="eastAsia"/>
-        </w:rPr>
       </w:pPr>
     </w:p>
     <w:p>
@@ -13588,7 +13702,14 @@
               <w:rPr>
                 <w:color w:val="0070C0"/>
               </w:rPr>
-              <w:t xml:space="preserve">GENERATED ALWAYS AS </w:t>
+              <w:t xml:space="preserve">GENERATED ALWAYS </w:t>
+            </w:r>
+            <w:r>
+              <w:rPr>
+                <w:color w:val="0070C0"/>
+              </w:rPr>
+              <w:lastRenderedPageBreak/>
+              <w:t xml:space="preserve">AS </w:t>
             </w:r>
             <w:r>
               <w:t xml:space="preserve">(expression) </w:t>
@@ -13725,7 +13846,6 @@
               <w:rPr>
                 <w:rFonts w:hint="eastAsia"/>
               </w:rPr>
-              <w:lastRenderedPageBreak/>
               <w:t>添加</w:t>
             </w:r>
             <w:r>
@@ -15749,7 +15869,11 @@
               <w:t>INPLACE</w:t>
             </w:r>
             <w:r>
-              <w:t>修改时会报错。</w:t>
+              <w:t>修改时会报</w:t>
+            </w:r>
+            <w:r>
+              <w:lastRenderedPageBreak/>
+              <w:t>错。</w:t>
             </w:r>
           </w:p>
         </w:tc>
@@ -15767,6 +15891,7 @@
               <w:rPr>
                 <w:rFonts w:hint="eastAsia"/>
               </w:rPr>
+              <w:lastRenderedPageBreak/>
               <w:t>中</w:t>
             </w:r>
           </w:p>
@@ -17638,7 +17763,7 @@
       <w:r>
         <w:t>修改备注下压为修改对应的表属性，</w:t>
       </w:r>
-      <w:commentRangeStart w:id="1"/>
+      <w:commentRangeStart w:id="3"/>
       <w:r>
         <w:rPr>
           <w:rFonts w:hint="eastAsia"/>
@@ -17651,12 +17776,12 @@
         </w:rPr>
         <w:t>不做</w:t>
       </w:r>
-      <w:commentRangeEnd w:id="1"/>
+      <w:commentRangeEnd w:id="3"/>
       <w:r>
         <w:rPr>
           <w:rStyle w:val="ad"/>
         </w:rPr>
-        <w:commentReference w:id="1"/>
+        <w:commentReference w:id="3"/>
       </w:r>
       <w:r>
         <w:t>。</w:t>
@@ -18756,9 +18881,6 @@
           <w:p>
             <w:pPr>
               <w:ind w:left="0"/>
-              <w:rPr>
-                <w:rFonts w:hint="eastAsia"/>
-              </w:rPr>
             </w:pPr>
             <w:r>
               <w:rPr>
@@ -18775,9 +18897,6 @@
           <w:p>
             <w:pPr>
               <w:ind w:left="0"/>
-              <w:rPr>
-                <w:rFonts w:hint="eastAsia"/>
-              </w:rPr>
             </w:pPr>
             <w:r>
               <w:t xml:space="preserve">ALTER TABLE </w:t>
@@ -18810,7 +18929,7 @@
             <w:pPr>
               <w:ind w:left="0"/>
               <w:rPr>
-                <w:rFonts w:ascii="Arial" w:eastAsia="宋体" w:hAnsi="Arial" w:cs="Arial" w:hint="eastAsia"/>
+                <w:rFonts w:ascii="Arial" w:eastAsia="宋体" w:hAnsi="Arial" w:cs="Arial"/>
                 <w:color w:val="333333"/>
                 <w:kern w:val="0"/>
                 <w:szCs w:val="21"/>
@@ -19647,7 +19766,63 @@
 
 <file path=word/comments.xml><?xml version="1.0" encoding="utf-8"?>
 <w:comments xmlns:wpc="http://schemas.microsoft.com/office/word/2010/wordprocessingCanvas" xmlns:cx="http://schemas.microsoft.com/office/drawing/2014/chartex" xmlns:mc="http://schemas.openxmlformats.org/markup-compatibility/2006" xmlns:o="urn:schemas-microsoft-com:office:office" xmlns:r="http://schemas.openxmlformats.org/officeDocument/2006/relationships" xmlns:m="http://schemas.openxmlformats.org/officeDocument/2006/math" xmlns:v="urn:schemas-microsoft-com:vml" xmlns:wp14="http://schemas.microsoft.com/office/word/2010/wordprocessingDrawing" xmlns:wp="http://schemas.openxmlformats.org/drawingml/2006/wordprocessingDrawing" xmlns:w10="urn:schemas-microsoft-com:office:word" xmlns:w="http://schemas.openxmlformats.org/wordprocessingml/2006/main" xmlns:w14="http://schemas.microsoft.com/office/word/2010/wordml" xmlns:w15="http://schemas.microsoft.com/office/word/2012/wordml" xmlns:w16se="http://schemas.microsoft.com/office/word/2015/wordml/symex" xmlns:wpg="http://schemas.microsoft.com/office/word/2010/wordprocessingGroup" xmlns:wpi="http://schemas.microsoft.com/office/word/2010/wordprocessingInk" xmlns:wne="http://schemas.microsoft.com/office/word/2006/wordml" xmlns:wps="http://schemas.microsoft.com/office/word/2010/wordprocessingShape" mc:Ignorable="w14 w15 w16se wp14">
-  <w:comment w:id="1" w:author="linsuqiang" w:date="2019-03-01T17:10:00Z" w:initials="l">
+  <w:comment w:id="1" w:author="linsuqiang" w:date="2019-04-29T14:28:00Z" w:initials="l">
+    <w:p>
+      <w:pPr>
+        <w:pStyle w:val="ae"/>
+        <w:rPr>
+          <w:rFonts w:hint="eastAsia"/>
+        </w:rPr>
+      </w:pPr>
+      <w:r>
+        <w:rPr>
+          <w:rStyle w:val="ad"/>
+        </w:rPr>
+        <w:annotationRef/>
+      </w:r>
+      <w:r>
+        <w:rPr>
+          <w:rFonts w:hint="eastAsia"/>
+        </w:rPr>
+        <w:t>具体表现</w:t>
+      </w:r>
+      <w:r>
+        <w:t>是怎样的</w:t>
+      </w:r>
+      <w:r>
+        <w:rPr>
+          <w:rFonts w:hint="eastAsia"/>
+        </w:rPr>
+        <w:t>？</w:t>
+      </w:r>
+    </w:p>
+  </w:comment>
+  <w:comment w:id="2" w:author="linsuqiang" w:date="2019-04-29T14:30:00Z" w:initials="l">
+    <w:p>
+      <w:pPr>
+        <w:pStyle w:val="ae"/>
+        <w:rPr>
+          <w:rFonts w:hint="eastAsia"/>
+        </w:rPr>
+      </w:pPr>
+      <w:r>
+        <w:rPr>
+          <w:rStyle w:val="ad"/>
+        </w:rPr>
+        <w:annotationRef/>
+      </w:r>
+      <w:r>
+        <w:rPr>
+          <w:rFonts w:hint="eastAsia"/>
+        </w:rPr>
+        <w:t>基于</w:t>
+      </w:r>
+      <w:r>
+        <w:t>映射去做，不用考虑重建索引。</w:t>
+      </w:r>
+    </w:p>
+  </w:comment>
+  <w:comment w:id="3" w:author="linsuqiang" w:date="2019-03-01T17:10:00Z" w:initials="l">
     <w:p>
       <w:pPr>
         <w:pStyle w:val="ae"/>
@@ -19674,6 +19849,8 @@
 
 <file path=word/commentsExtended.xml><?xml version="1.0" encoding="utf-8"?>
 <w15:commentsEx xmlns:wpc="http://schemas.microsoft.com/office/word/2010/wordprocessingCanvas" xmlns:cx="http://schemas.microsoft.com/office/drawing/2014/chartex" xmlns:mc="http://schemas.openxmlformats.org/markup-compatibility/2006" xmlns:o="urn:schemas-microsoft-com:office:office" xmlns:r="http://schemas.openxmlformats.org/officeDocument/2006/relationships" xmlns:m="http://schemas.openxmlformats.org/officeDocument/2006/math" xmlns:v="urn:schemas-microsoft-com:vml" xmlns:wp14="http://schemas.microsoft.com/office/word/2010/wordprocessingDrawing" xmlns:wp="http://schemas.openxmlformats.org/drawingml/2006/wordprocessingDrawing" xmlns:w10="urn:schemas-microsoft-com:office:word" xmlns:w="http://schemas.openxmlformats.org/wordprocessingml/2006/main" xmlns:w14="http://schemas.microsoft.com/office/word/2010/wordml" xmlns:w15="http://schemas.microsoft.com/office/word/2012/wordml" xmlns:w16se="http://schemas.microsoft.com/office/word/2015/wordml/symex" xmlns:wpg="http://schemas.microsoft.com/office/word/2010/wordprocessingGroup" xmlns:wpi="http://schemas.microsoft.com/office/word/2010/wordprocessingInk" xmlns:wne="http://schemas.microsoft.com/office/word/2006/wordml" xmlns:wps="http://schemas.microsoft.com/office/word/2010/wordprocessingShape" mc:Ignorable="w14 w15 w16se wp14">
+  <w15:commentEx w15:paraId="7B8E84CD" w15:done="0"/>
+  <w15:commentEx w15:paraId="21018715" w15:done="0"/>
   <w15:commentEx w15:paraId="21868179" w15:done="0"/>
 </w15:commentsEx>
 </file>
@@ -21822,7 +21999,6 @@
   <w:style w:type="character" w:default="1" w:styleId="a0">
     <w:name w:val="Default Paragraph Font"/>
     <w:uiPriority w:val="1"/>
-    <w:semiHidden/>
     <w:unhideWhenUsed/>
   </w:style>
   <w:style w:type="table" w:default="1" w:styleId="a1">
@@ -22451,7 +22627,7 @@
 </file>
 
 <file path=customXml/itemProps1.xml><?xml version="1.0" encoding="utf-8"?>
-<ds:datastoreItem xmlns:ds="http://schemas.openxmlformats.org/officeDocument/2006/customXml" ds:itemID="{6CA7EA10-B901-412B-B0ED-6A6298B27C6E}">
+<ds:datastoreItem xmlns:ds="http://schemas.openxmlformats.org/officeDocument/2006/customXml" ds:itemID="{CEC67C65-CBEA-4966-A777-0CAA0B020C01}">
   <ds:schemaRefs>
     <ds:schemaRef ds:uri="http://schemas.openxmlformats.org/officeDocument/2006/bibliography"/>
   </ds:schemaRefs>

</xml_diff>